<commit_message>
Filled Cloud comparison table
</commit_message>
<xml_diff>
--- a/Evaluations/InferenceEvaluations/CloudEvaluation/Inference_Comparison.docx
+++ b/Evaluations/InferenceEvaluations/CloudEvaluation/Inference_Comparison.docx
@@ -871,7 +871,7 @@
         </w:tc>
         <w:tc>
           <w:tcPr>
-            <w:tcW w:w="190" w:type="pct"/>
+            <w:tcW w:w="191" w:type="pct"/>
             <w:shd w:val="clear" w:color="auto" w:fill="FFFFFF" w:themeFill="background1"/>
             <w:vAlign w:val="center"/>
           </w:tcPr>
@@ -1118,7 +1118,7 @@
         </w:tc>
         <w:tc>
           <w:tcPr>
-            <w:tcW w:w="190" w:type="pct"/>
+            <w:tcW w:w="191" w:type="pct"/>
             <w:shd w:val="clear" w:color="auto" w:fill="000000" w:themeFill="text1"/>
           </w:tcPr>
           <w:p>
@@ -1217,7 +1217,7 @@
                 <w:sz w:val="14"/>
                 <w:szCs w:val="14"/>
               </w:rPr>
-              <w:t>N/A</w:t>
+              <w:t>0.03 ± 0.00</w:t>
             </w:r>
           </w:p>
         </w:tc>
@@ -1247,7 +1247,7 @@
                 <w:sz w:val="14"/>
                 <w:szCs w:val="14"/>
               </w:rPr>
-              <w:t>N/A</w:t>
+              <w:t>60.96 ± 7.50</w:t>
             </w:r>
           </w:p>
         </w:tc>
@@ -1277,7 +1277,7 @@
                 <w:sz w:val="14"/>
                 <w:szCs w:val="14"/>
               </w:rPr>
-              <w:t>N/A</w:t>
+              <w:t>2.52 ± 0.38</w:t>
             </w:r>
           </w:p>
         </w:tc>
@@ -1308,7 +1308,7 @@
                 <w:sz w:val="14"/>
                 <w:szCs w:val="14"/>
               </w:rPr>
-              <w:t>N/A</w:t>
+              <w:t>2.52 ± 0.38</w:t>
             </w:r>
           </w:p>
         </w:tc>
@@ -1338,7 +1338,7 @@
                 <w:sz w:val="14"/>
                 <w:szCs w:val="14"/>
               </w:rPr>
-              <w:t>N/A</w:t>
+              <w:t>60.59 ± 7.41</w:t>
             </w:r>
           </w:p>
         </w:tc>
@@ -1358,17 +1358,18 @@
             <w:pPr>
               <w:jc w:val="center"/>
               <w:rPr>
-                <w:sz w:val="14"/>
-                <w:szCs w:val="14"/>
-              </w:rPr>
-            </w:pPr>
-            <w:r>
-              <w:rPr>
-                <w:rFonts w:eastAsia="Arial"/>
-                <w:sz w:val="14"/>
-                <w:szCs w:val="14"/>
-              </w:rPr>
-              <w:t>N/A</w:t>
+                <w:rFonts w:asciiTheme="majorBidi" w:hAnsiTheme="majorBidi" w:cstheme="majorBidi"/>
+                <w:sz w:val="14"/>
+                <w:szCs w:val="14"/>
+              </w:rPr>
+            </w:pPr>
+            <w:r>
+              <w:rPr>
+                <w:rFonts w:asciiTheme="majorBidi" w:eastAsia="Arial" w:hAnsiTheme="majorBidi" w:cstheme="majorBidi"/>
+                <w:sz w:val="14"/>
+                <w:szCs w:val="14"/>
+              </w:rPr>
+              <w:t>0.03 ± 0.00</w:t>
             </w:r>
           </w:p>
         </w:tc>
@@ -1388,17 +1389,18 @@
             <w:pPr>
               <w:jc w:val="center"/>
               <w:rPr>
-                <w:sz w:val="14"/>
-                <w:szCs w:val="14"/>
-              </w:rPr>
-            </w:pPr>
-            <w:r>
-              <w:rPr>
-                <w:rFonts w:eastAsia="Arial"/>
-                <w:sz w:val="14"/>
-                <w:szCs w:val="14"/>
-              </w:rPr>
-              <w:t>N/A</w:t>
+                <w:rFonts w:asciiTheme="majorBidi" w:hAnsiTheme="majorBidi" w:cstheme="majorBidi"/>
+                <w:sz w:val="14"/>
+                <w:szCs w:val="14"/>
+              </w:rPr>
+            </w:pPr>
+            <w:r>
+              <w:rPr>
+                <w:rFonts w:asciiTheme="majorBidi" w:eastAsia="Arial" w:hAnsiTheme="majorBidi" w:cstheme="majorBidi"/>
+                <w:sz w:val="14"/>
+                <w:szCs w:val="14"/>
+              </w:rPr>
+              <w:t>43.31 ± 7.12</w:t>
             </w:r>
           </w:p>
         </w:tc>
@@ -1418,17 +1420,18 @@
             <w:pPr>
               <w:jc w:val="center"/>
               <w:rPr>
-                <w:sz w:val="14"/>
-                <w:szCs w:val="14"/>
-              </w:rPr>
-            </w:pPr>
-            <w:r>
-              <w:rPr>
-                <w:rFonts w:eastAsia="Arial"/>
-                <w:sz w:val="14"/>
-                <w:szCs w:val="14"/>
-              </w:rPr>
-              <w:t>N/A</w:t>
+                <w:rFonts w:asciiTheme="majorBidi" w:hAnsiTheme="majorBidi" w:cstheme="majorBidi"/>
+                <w:sz w:val="14"/>
+                <w:szCs w:val="14"/>
+              </w:rPr>
+            </w:pPr>
+            <w:r>
+              <w:rPr>
+                <w:rFonts w:asciiTheme="majorBidi" w:eastAsia="Arial" w:hAnsiTheme="majorBidi" w:cstheme="majorBidi"/>
+                <w:sz w:val="14"/>
+                <w:szCs w:val="14"/>
+              </w:rPr>
+              <w:t>3.58 ± 0.63</w:t>
             </w:r>
           </w:p>
         </w:tc>
@@ -1448,17 +1451,18 @@
             <w:pPr>
               <w:jc w:val="center"/>
               <w:rPr>
-                <w:sz w:val="14"/>
-                <w:szCs w:val="14"/>
-              </w:rPr>
-            </w:pPr>
-            <w:r>
-              <w:rPr>
-                <w:rFonts w:eastAsia="Arial"/>
-                <w:sz w:val="14"/>
-                <w:szCs w:val="14"/>
-              </w:rPr>
-              <w:t>N/A</w:t>
+                <w:rFonts w:asciiTheme="majorBidi" w:hAnsiTheme="majorBidi" w:cstheme="majorBidi"/>
+                <w:sz w:val="14"/>
+                <w:szCs w:val="14"/>
+              </w:rPr>
+            </w:pPr>
+            <w:r>
+              <w:rPr>
+                <w:rFonts w:asciiTheme="majorBidi" w:eastAsia="Arial" w:hAnsiTheme="majorBidi" w:cstheme="majorBidi"/>
+                <w:sz w:val="14"/>
+                <w:szCs w:val="14"/>
+              </w:rPr>
+              <w:t>3.58 ± 0.63</w:t>
             </w:r>
           </w:p>
         </w:tc>
@@ -1472,17 +1476,18 @@
             <w:pPr>
               <w:jc w:val="center"/>
               <w:rPr>
-                <w:sz w:val="14"/>
-                <w:szCs w:val="14"/>
-              </w:rPr>
-            </w:pPr>
-            <w:r>
-              <w:rPr>
-                <w:rFonts w:eastAsia="Arial"/>
-                <w:sz w:val="14"/>
-                <w:szCs w:val="14"/>
-              </w:rPr>
-              <w:t>N/A</w:t>
+                <w:rFonts w:asciiTheme="majorBidi" w:hAnsiTheme="majorBidi" w:cstheme="majorBidi"/>
+                <w:sz w:val="14"/>
+                <w:szCs w:val="14"/>
+              </w:rPr>
+            </w:pPr>
+            <w:r>
+              <w:rPr>
+                <w:rFonts w:asciiTheme="majorBidi" w:eastAsia="Arial" w:hAnsiTheme="majorBidi" w:cstheme="majorBidi"/>
+                <w:sz w:val="14"/>
+                <w:szCs w:val="14"/>
+              </w:rPr>
+              <w:t>43.16 ± 7.04</w:t>
             </w:r>
           </w:p>
         </w:tc>
@@ -1711,7 +1716,7 @@
         </w:tc>
         <w:tc>
           <w:tcPr>
-            <w:tcW w:w="190" w:type="pct"/>
+            <w:tcW w:w="191" w:type="pct"/>
             <w:shd w:val="clear" w:color="auto" w:fill="FFFFFF" w:themeFill="background1"/>
             <w:vAlign w:val="center"/>
           </w:tcPr>
@@ -1779,7 +1784,7 @@
           <w:p>
             <w:pPr>
               <w:rPr>
-                <w:rFonts w:eastAsia="Arial"/>
+                <w:rFonts w:asciiTheme="majorBidi" w:eastAsia="Arial" w:hAnsiTheme="majorBidi" w:cstheme="majorBidi"/>
                 <w:color w:val="FFFFFF" w:themeColor="background1"/>
                 <w:sz w:val="14"/>
                 <w:szCs w:val="14"/>
@@ -1933,7 +1938,7 @@
         </w:tc>
         <w:tc>
           <w:tcPr>
-            <w:tcW w:w="190" w:type="pct"/>
+            <w:tcW w:w="191" w:type="pct"/>
             <w:shd w:val="clear" w:color="auto" w:fill="000000" w:themeFill="text1"/>
           </w:tcPr>
           <w:p>
@@ -2039,7 +2044,7 @@
                 <w:sz w:val="14"/>
                 <w:szCs w:val="14"/>
               </w:rPr>
-              <w:t>N/A</w:t>
+              <w:t>0.03 ± 0.00</w:t>
             </w:r>
           </w:p>
         </w:tc>
@@ -2069,7 +2074,7 @@
                 <w:sz w:val="14"/>
                 <w:szCs w:val="14"/>
               </w:rPr>
-              <w:t>N/A</w:t>
+              <w:t>67.81 ± 0.58</w:t>
             </w:r>
           </w:p>
         </w:tc>
@@ -2099,7 +2104,7 @@
                 <w:sz w:val="14"/>
                 <w:szCs w:val="14"/>
               </w:rPr>
-              <w:t>N/A</w:t>
+              <w:t>2.23 ± 0.02</w:t>
             </w:r>
           </w:p>
         </w:tc>
@@ -2130,7 +2135,7 @@
                 <w:sz w:val="14"/>
                 <w:szCs w:val="14"/>
               </w:rPr>
-              <w:t>N/A</w:t>
+              <w:t>2.23 ± 0.02</w:t>
             </w:r>
           </w:p>
         </w:tc>
@@ -2160,7 +2165,7 @@
                 <w:sz w:val="14"/>
                 <w:szCs w:val="14"/>
               </w:rPr>
-              <w:t>N/A</w:t>
+              <w:t>67.35 ± 0.57</w:t>
             </w:r>
           </w:p>
         </w:tc>
@@ -2180,17 +2185,18 @@
             <w:pPr>
               <w:jc w:val="center"/>
               <w:rPr>
-                <w:sz w:val="14"/>
-                <w:szCs w:val="14"/>
-              </w:rPr>
-            </w:pPr>
-            <w:r>
-              <w:rPr>
-                <w:rFonts w:eastAsia="Arial"/>
-                <w:sz w:val="14"/>
-                <w:szCs w:val="14"/>
-              </w:rPr>
-              <w:t>N/A</w:t>
+                <w:rFonts w:asciiTheme="majorBidi" w:hAnsiTheme="majorBidi" w:cstheme="majorBidi"/>
+                <w:sz w:val="14"/>
+                <w:szCs w:val="14"/>
+              </w:rPr>
+            </w:pPr>
+            <w:r>
+              <w:rPr>
+                <w:rFonts w:asciiTheme="majorBidi" w:eastAsia="Arial" w:hAnsiTheme="majorBidi" w:cstheme="majorBidi"/>
+                <w:sz w:val="14"/>
+                <w:szCs w:val="14"/>
+              </w:rPr>
+              <w:t>0.04 ± 0.00</w:t>
             </w:r>
           </w:p>
         </w:tc>
@@ -2210,17 +2216,18 @@
             <w:pPr>
               <w:jc w:val="center"/>
               <w:rPr>
-                <w:sz w:val="14"/>
-                <w:szCs w:val="14"/>
-              </w:rPr>
-            </w:pPr>
-            <w:r>
-              <w:rPr>
-                <w:rFonts w:eastAsia="Arial"/>
-                <w:sz w:val="14"/>
-                <w:szCs w:val="14"/>
-              </w:rPr>
-              <w:t>N/A</w:t>
+                <w:rFonts w:asciiTheme="majorBidi" w:hAnsiTheme="majorBidi" w:cstheme="majorBidi"/>
+                <w:sz w:val="14"/>
+                <w:szCs w:val="14"/>
+              </w:rPr>
+            </w:pPr>
+            <w:r>
+              <w:rPr>
+                <w:rFonts w:asciiTheme="majorBidi" w:eastAsia="Arial" w:hAnsiTheme="majorBidi" w:cstheme="majorBidi"/>
+                <w:sz w:val="14"/>
+                <w:szCs w:val="14"/>
+              </w:rPr>
+              <w:t>50.50 ± 0.55</w:t>
             </w:r>
           </w:p>
         </w:tc>
@@ -2240,17 +2247,18 @@
             <w:pPr>
               <w:jc w:val="center"/>
               <w:rPr>
-                <w:sz w:val="14"/>
-                <w:szCs w:val="14"/>
-              </w:rPr>
-            </w:pPr>
-            <w:r>
-              <w:rPr>
-                <w:rFonts w:eastAsia="Arial"/>
-                <w:sz w:val="14"/>
-                <w:szCs w:val="14"/>
-              </w:rPr>
-              <w:t>N/A</w:t>
+                <w:rFonts w:asciiTheme="majorBidi" w:hAnsiTheme="majorBidi" w:cstheme="majorBidi"/>
+                <w:sz w:val="14"/>
+                <w:szCs w:val="14"/>
+              </w:rPr>
+            </w:pPr>
+            <w:r>
+              <w:rPr>
+                <w:rFonts w:asciiTheme="majorBidi" w:eastAsia="Arial" w:hAnsiTheme="majorBidi" w:cstheme="majorBidi"/>
+                <w:sz w:val="14"/>
+                <w:szCs w:val="14"/>
+              </w:rPr>
+              <w:t>2.99 ± 0.03</w:t>
             </w:r>
           </w:p>
         </w:tc>
@@ -2270,17 +2278,18 @@
             <w:pPr>
               <w:jc w:val="center"/>
               <w:rPr>
-                <w:sz w:val="14"/>
-                <w:szCs w:val="14"/>
-              </w:rPr>
-            </w:pPr>
-            <w:r>
-              <w:rPr>
-                <w:rFonts w:eastAsia="Arial"/>
-                <w:sz w:val="14"/>
-                <w:szCs w:val="14"/>
-              </w:rPr>
-              <w:t>N/A</w:t>
+                <w:rFonts w:asciiTheme="majorBidi" w:hAnsiTheme="majorBidi" w:cstheme="majorBidi"/>
+                <w:sz w:val="14"/>
+                <w:szCs w:val="14"/>
+              </w:rPr>
+            </w:pPr>
+            <w:r>
+              <w:rPr>
+                <w:rFonts w:asciiTheme="majorBidi" w:eastAsia="Arial" w:hAnsiTheme="majorBidi" w:cstheme="majorBidi"/>
+                <w:sz w:val="14"/>
+                <w:szCs w:val="14"/>
+              </w:rPr>
+              <w:t>2.99 ± 0.03</w:t>
             </w:r>
           </w:p>
         </w:tc>
@@ -2294,18 +2303,18 @@
             <w:pPr>
               <w:jc w:val="center"/>
               <w:rPr>
-                <w:rFonts w:eastAsia="Arial"/>
-                <w:sz w:val="14"/>
-                <w:szCs w:val="14"/>
-              </w:rPr>
-            </w:pPr>
-            <w:r>
-              <w:rPr>
-                <w:rFonts w:eastAsia="Arial"/>
-                <w:sz w:val="14"/>
-                <w:szCs w:val="14"/>
-              </w:rPr>
-              <w:t>N/A</w:t>
+                <w:rFonts w:asciiTheme="majorBidi" w:eastAsia="Arial" w:hAnsiTheme="majorBidi" w:cstheme="majorBidi"/>
+                <w:sz w:val="14"/>
+                <w:szCs w:val="14"/>
+              </w:rPr>
+            </w:pPr>
+            <w:r>
+              <w:rPr>
+                <w:rFonts w:asciiTheme="majorBidi" w:eastAsia="Arial" w:hAnsiTheme="majorBidi" w:cstheme="majorBidi"/>
+                <w:sz w:val="14"/>
+                <w:szCs w:val="14"/>
+              </w:rPr>
+              <w:t>50.20 ± 0.53</w:t>
             </w:r>
           </w:p>
         </w:tc>
@@ -2536,7 +2545,7 @@
         </w:tc>
         <w:tc>
           <w:tcPr>
-            <w:tcW w:w="190" w:type="pct"/>
+            <w:tcW w:w="191" w:type="pct"/>
             <w:shd w:val="clear" w:color="auto" w:fill="FFFFFF" w:themeFill="background1"/>
             <w:vAlign w:val="center"/>
           </w:tcPr>
@@ -2643,7 +2652,7 @@
                 <w:sz w:val="14"/>
                 <w:szCs w:val="14"/>
               </w:rPr>
-              <w:t>N/A</w:t>
+              <w:t>0.03 ± 0.00</w:t>
             </w:r>
           </w:p>
         </w:tc>
@@ -2673,7 +2682,7 @@
                 <w:sz w:val="14"/>
                 <w:szCs w:val="14"/>
               </w:rPr>
-              <w:t>N/A</w:t>
+              <w:t>67.23 ± 0.90</w:t>
             </w:r>
           </w:p>
         </w:tc>
@@ -2703,7 +2712,7 @@
                 <w:sz w:val="14"/>
                 <w:szCs w:val="14"/>
               </w:rPr>
-              <w:t>N/A</w:t>
+              <w:t>2.25 ± 0.03</w:t>
             </w:r>
           </w:p>
         </w:tc>
@@ -2734,7 +2743,7 @@
                 <w:sz w:val="14"/>
                 <w:szCs w:val="14"/>
               </w:rPr>
-              <w:t>N/A</w:t>
+              <w:t>2.25 ± 0.03</w:t>
             </w:r>
           </w:p>
         </w:tc>
@@ -2764,7 +2773,7 @@
                 <w:sz w:val="14"/>
                 <w:szCs w:val="14"/>
               </w:rPr>
-              <w:t>N/A</w:t>
+              <w:t>66.78 ± 0.89</w:t>
             </w:r>
           </w:p>
         </w:tc>
@@ -2784,17 +2793,18 @@
             <w:pPr>
               <w:jc w:val="center"/>
               <w:rPr>
-                <w:sz w:val="14"/>
-                <w:szCs w:val="14"/>
-              </w:rPr>
-            </w:pPr>
-            <w:r>
-              <w:rPr>
-                <w:rFonts w:eastAsia="Arial"/>
-                <w:sz w:val="14"/>
-                <w:szCs w:val="14"/>
-              </w:rPr>
-              <w:t>N/A</w:t>
+                <w:rFonts w:asciiTheme="majorBidi" w:hAnsiTheme="majorBidi" w:cstheme="majorBidi"/>
+                <w:sz w:val="14"/>
+                <w:szCs w:val="14"/>
+              </w:rPr>
+            </w:pPr>
+            <w:r>
+              <w:rPr>
+                <w:rFonts w:asciiTheme="majorBidi" w:eastAsia="Arial" w:hAnsiTheme="majorBidi" w:cstheme="majorBidi"/>
+                <w:sz w:val="14"/>
+                <w:szCs w:val="14"/>
+              </w:rPr>
+              <w:t>0.04 ± 0.00</w:t>
             </w:r>
           </w:p>
         </w:tc>
@@ -2814,17 +2824,18 @@
             <w:pPr>
               <w:jc w:val="center"/>
               <w:rPr>
-                <w:sz w:val="14"/>
-                <w:szCs w:val="14"/>
-              </w:rPr>
-            </w:pPr>
-            <w:r>
-              <w:rPr>
-                <w:rFonts w:eastAsia="Arial"/>
-                <w:sz w:val="14"/>
-                <w:szCs w:val="14"/>
-              </w:rPr>
-              <w:t>N/A</w:t>
+                <w:rFonts w:asciiTheme="majorBidi" w:hAnsiTheme="majorBidi" w:cstheme="majorBidi"/>
+                <w:sz w:val="14"/>
+                <w:szCs w:val="14"/>
+              </w:rPr>
+            </w:pPr>
+            <w:r>
+              <w:rPr>
+                <w:rFonts w:asciiTheme="majorBidi" w:eastAsia="Arial" w:hAnsiTheme="majorBidi" w:cstheme="majorBidi"/>
+                <w:sz w:val="14"/>
+                <w:szCs w:val="14"/>
+              </w:rPr>
+              <w:t>47.67 ± 4.32</w:t>
             </w:r>
           </w:p>
         </w:tc>
@@ -2844,17 +2855,18 @@
             <w:pPr>
               <w:jc w:val="center"/>
               <w:rPr>
-                <w:sz w:val="14"/>
-                <w:szCs w:val="14"/>
-              </w:rPr>
-            </w:pPr>
-            <w:r>
-              <w:rPr>
-                <w:rFonts w:eastAsia="Arial"/>
-                <w:sz w:val="14"/>
-                <w:szCs w:val="14"/>
-              </w:rPr>
-              <w:t>N/A</w:t>
+                <w:rFonts w:asciiTheme="majorBidi" w:hAnsiTheme="majorBidi" w:cstheme="majorBidi"/>
+                <w:sz w:val="14"/>
+                <w:szCs w:val="14"/>
+              </w:rPr>
+            </w:pPr>
+            <w:r>
+              <w:rPr>
+                <w:rFonts w:asciiTheme="majorBidi" w:eastAsia="Arial" w:hAnsiTheme="majorBidi" w:cstheme="majorBidi"/>
+                <w:sz w:val="14"/>
+                <w:szCs w:val="14"/>
+              </w:rPr>
+              <w:t>3.19 ± 0.31</w:t>
             </w:r>
           </w:p>
         </w:tc>
@@ -2874,17 +2886,18 @@
             <w:pPr>
               <w:jc w:val="center"/>
               <w:rPr>
-                <w:sz w:val="14"/>
-                <w:szCs w:val="14"/>
-              </w:rPr>
-            </w:pPr>
-            <w:r>
-              <w:rPr>
-                <w:rFonts w:eastAsia="Arial"/>
-                <w:sz w:val="14"/>
-                <w:szCs w:val="14"/>
-              </w:rPr>
-              <w:t>N/A</w:t>
+                <w:rFonts w:asciiTheme="majorBidi" w:hAnsiTheme="majorBidi" w:cstheme="majorBidi"/>
+                <w:sz w:val="14"/>
+                <w:szCs w:val="14"/>
+              </w:rPr>
+            </w:pPr>
+            <w:r>
+              <w:rPr>
+                <w:rFonts w:asciiTheme="majorBidi" w:eastAsia="Arial" w:hAnsiTheme="majorBidi" w:cstheme="majorBidi"/>
+                <w:sz w:val="14"/>
+                <w:szCs w:val="14"/>
+              </w:rPr>
+              <w:t>3.19 ± 0.31</w:t>
             </w:r>
           </w:p>
         </w:tc>
@@ -2898,18 +2911,18 @@
             <w:pPr>
               <w:jc w:val="center"/>
               <w:rPr>
-                <w:rFonts w:eastAsia="Arial"/>
-                <w:sz w:val="14"/>
-                <w:szCs w:val="14"/>
-              </w:rPr>
-            </w:pPr>
-            <w:r>
-              <w:rPr>
-                <w:rFonts w:eastAsia="Arial"/>
-                <w:sz w:val="14"/>
-                <w:szCs w:val="14"/>
-              </w:rPr>
-              <w:t>N/A</w:t>
+                <w:rFonts w:asciiTheme="majorBidi" w:eastAsia="Arial" w:hAnsiTheme="majorBidi" w:cstheme="majorBidi"/>
+                <w:sz w:val="14"/>
+                <w:szCs w:val="14"/>
+              </w:rPr>
+            </w:pPr>
+            <w:r>
+              <w:rPr>
+                <w:rFonts w:asciiTheme="majorBidi" w:eastAsia="Arial" w:hAnsiTheme="majorBidi" w:cstheme="majorBidi"/>
+                <w:sz w:val="14"/>
+                <w:szCs w:val="14"/>
+              </w:rPr>
+              <w:t>47.45 ± 4.27</w:t>
             </w:r>
           </w:p>
         </w:tc>
@@ -3140,7 +3153,7 @@
         </w:tc>
         <w:tc>
           <w:tcPr>
-            <w:tcW w:w="190" w:type="pct"/>
+            <w:tcW w:w="191" w:type="pct"/>
             <w:shd w:val="clear" w:color="auto" w:fill="FFFFFF" w:themeFill="background1"/>
             <w:vAlign w:val="center"/>
           </w:tcPr>
@@ -3247,7 +3260,7 @@
                 <w:sz w:val="14"/>
                 <w:szCs w:val="14"/>
               </w:rPr>
-              <w:t>N/A</w:t>
+              <w:t>0.03 ± 0.00</w:t>
             </w:r>
           </w:p>
         </w:tc>
@@ -3277,7 +3290,7 @@
                 <w:sz w:val="14"/>
                 <w:szCs w:val="14"/>
               </w:rPr>
-              <w:t>N/A</w:t>
+              <w:t>68.27 ± 0.57</w:t>
             </w:r>
           </w:p>
         </w:tc>
@@ -3307,7 +3320,7 @@
                 <w:sz w:val="14"/>
                 <w:szCs w:val="14"/>
               </w:rPr>
-              <w:t>N/A</w:t>
+              <w:t>2.21 ± 0.02</w:t>
             </w:r>
           </w:p>
         </w:tc>
@@ -3338,7 +3351,7 @@
                 <w:sz w:val="14"/>
                 <w:szCs w:val="14"/>
               </w:rPr>
-              <w:t>N/A</w:t>
+              <w:t>2.21 ± 0.02</w:t>
             </w:r>
           </w:p>
         </w:tc>
@@ -3368,7 +3381,7 @@
                 <w:sz w:val="14"/>
                 <w:szCs w:val="14"/>
               </w:rPr>
-              <w:t>N/A</w:t>
+              <w:t>67.81 ± 0.57</w:t>
             </w:r>
           </w:p>
         </w:tc>
@@ -3388,17 +3401,18 @@
             <w:pPr>
               <w:jc w:val="center"/>
               <w:rPr>
-                <w:sz w:val="14"/>
-                <w:szCs w:val="14"/>
-              </w:rPr>
-            </w:pPr>
-            <w:r>
-              <w:rPr>
-                <w:rFonts w:eastAsia="Arial"/>
-                <w:sz w:val="14"/>
-                <w:szCs w:val="14"/>
-              </w:rPr>
-              <w:t>N/A</w:t>
+                <w:rFonts w:asciiTheme="majorBidi" w:hAnsiTheme="majorBidi" w:cstheme="majorBidi"/>
+                <w:sz w:val="14"/>
+                <w:szCs w:val="14"/>
+              </w:rPr>
+            </w:pPr>
+            <w:r>
+              <w:rPr>
+                <w:rFonts w:asciiTheme="majorBidi" w:eastAsia="Arial" w:hAnsiTheme="majorBidi" w:cstheme="majorBidi"/>
+                <w:sz w:val="14"/>
+                <w:szCs w:val="14"/>
+              </w:rPr>
+              <w:t>0.03 ± 0.00</w:t>
             </w:r>
           </w:p>
         </w:tc>
@@ -3418,17 +3432,18 @@
             <w:pPr>
               <w:jc w:val="center"/>
               <w:rPr>
-                <w:sz w:val="14"/>
-                <w:szCs w:val="14"/>
-              </w:rPr>
-            </w:pPr>
-            <w:r>
-              <w:rPr>
-                <w:rFonts w:eastAsia="Arial"/>
-                <w:sz w:val="14"/>
-                <w:szCs w:val="14"/>
-              </w:rPr>
-              <w:t>N/A</w:t>
+                <w:rFonts w:asciiTheme="majorBidi" w:hAnsiTheme="majorBidi" w:cstheme="majorBidi"/>
+                <w:sz w:val="14"/>
+                <w:szCs w:val="14"/>
+              </w:rPr>
+            </w:pPr>
+            <w:r>
+              <w:rPr>
+                <w:rFonts w:asciiTheme="majorBidi" w:eastAsia="Arial" w:hAnsiTheme="majorBidi" w:cstheme="majorBidi"/>
+                <w:sz w:val="14"/>
+                <w:szCs w:val="14"/>
+              </w:rPr>
+              <w:t>50.86 ± 1.42</w:t>
             </w:r>
           </w:p>
         </w:tc>
@@ -3448,17 +3463,18 @@
             <w:pPr>
               <w:jc w:val="center"/>
               <w:rPr>
-                <w:sz w:val="14"/>
-                <w:szCs w:val="14"/>
-              </w:rPr>
-            </w:pPr>
-            <w:r>
-              <w:rPr>
-                <w:rFonts w:eastAsia="Arial"/>
-                <w:sz w:val="14"/>
-                <w:szCs w:val="14"/>
-              </w:rPr>
-              <w:t>N/A</w:t>
+                <w:rFonts w:asciiTheme="majorBidi" w:hAnsiTheme="majorBidi" w:cstheme="majorBidi"/>
+                <w:sz w:val="14"/>
+                <w:szCs w:val="14"/>
+              </w:rPr>
+            </w:pPr>
+            <w:r>
+              <w:rPr>
+                <w:rFonts w:asciiTheme="majorBidi" w:eastAsia="Arial" w:hAnsiTheme="majorBidi" w:cstheme="majorBidi"/>
+                <w:sz w:val="14"/>
+                <w:szCs w:val="14"/>
+              </w:rPr>
+              <w:t>2.96 ± 0.08</w:t>
             </w:r>
           </w:p>
         </w:tc>
@@ -3478,17 +3494,18 @@
             <w:pPr>
               <w:jc w:val="center"/>
               <w:rPr>
-                <w:sz w:val="14"/>
-                <w:szCs w:val="14"/>
-              </w:rPr>
-            </w:pPr>
-            <w:r>
-              <w:rPr>
-                <w:rFonts w:eastAsia="Arial"/>
-                <w:sz w:val="14"/>
-                <w:szCs w:val="14"/>
-              </w:rPr>
-              <w:t>N/A</w:t>
+                <w:rFonts w:asciiTheme="majorBidi" w:hAnsiTheme="majorBidi" w:cstheme="majorBidi"/>
+                <w:sz w:val="14"/>
+                <w:szCs w:val="14"/>
+              </w:rPr>
+            </w:pPr>
+            <w:r>
+              <w:rPr>
+                <w:rFonts w:asciiTheme="majorBidi" w:eastAsia="Arial" w:hAnsiTheme="majorBidi" w:cstheme="majorBidi"/>
+                <w:sz w:val="14"/>
+                <w:szCs w:val="14"/>
+              </w:rPr>
+              <w:t>2.96 ± 0.08</w:t>
             </w:r>
           </w:p>
         </w:tc>
@@ -3502,18 +3519,18 @@
             <w:pPr>
               <w:jc w:val="center"/>
               <w:rPr>
-                <w:rFonts w:eastAsia="Arial"/>
-                <w:sz w:val="14"/>
-                <w:szCs w:val="14"/>
-              </w:rPr>
-            </w:pPr>
-            <w:r>
-              <w:rPr>
-                <w:rFonts w:eastAsia="Arial"/>
-                <w:sz w:val="14"/>
-                <w:szCs w:val="14"/>
-              </w:rPr>
-              <w:t>N/A</w:t>
+                <w:rFonts w:asciiTheme="majorBidi" w:eastAsia="Arial" w:hAnsiTheme="majorBidi" w:cstheme="majorBidi"/>
+                <w:sz w:val="14"/>
+                <w:szCs w:val="14"/>
+              </w:rPr>
+            </w:pPr>
+            <w:r>
+              <w:rPr>
+                <w:rFonts w:asciiTheme="majorBidi" w:eastAsia="Arial" w:hAnsiTheme="majorBidi" w:cstheme="majorBidi"/>
+                <w:sz w:val="14"/>
+                <w:szCs w:val="14"/>
+              </w:rPr>
+              <w:t>50.63 ± 1.40</w:t>
             </w:r>
           </w:p>
         </w:tc>
@@ -3744,7 +3761,7 @@
         </w:tc>
         <w:tc>
           <w:tcPr>
-            <w:tcW w:w="190" w:type="pct"/>
+            <w:tcW w:w="191" w:type="pct"/>
             <w:shd w:val="clear" w:color="auto" w:fill="FFFFFF" w:themeFill="background1"/>
             <w:vAlign w:val="center"/>
           </w:tcPr>
@@ -3869,7 +3886,7 @@
                 <w:sz w:val="14"/>
                 <w:szCs w:val="14"/>
               </w:rPr>
-              <w:t>N/A</w:t>
+              <w:t>0.03 ± 0.00</w:t>
             </w:r>
           </w:p>
         </w:tc>
@@ -3899,7 +3916,7 @@
                 <w:sz w:val="14"/>
                 <w:szCs w:val="14"/>
               </w:rPr>
-              <w:t>N/A</w:t>
+              <w:t>64.97 ± 2.05</w:t>
             </w:r>
           </w:p>
         </w:tc>
@@ -3929,7 +3946,7 @@
                 <w:sz w:val="14"/>
                 <w:szCs w:val="14"/>
               </w:rPr>
-              <w:t>N/A</w:t>
+              <w:t>2.33 ± 0.07</w:t>
             </w:r>
           </w:p>
         </w:tc>
@@ -3960,7 +3977,7 @@
                 <w:sz w:val="14"/>
                 <w:szCs w:val="14"/>
               </w:rPr>
-              <w:t>N/A</w:t>
+              <w:t>2.33 ± 0.07</w:t>
             </w:r>
           </w:p>
         </w:tc>
@@ -3990,7 +4007,7 @@
                 <w:sz w:val="14"/>
                 <w:szCs w:val="14"/>
               </w:rPr>
-              <w:t>N/A</w:t>
+              <w:t>64.53 ± 2.02</w:t>
             </w:r>
           </w:p>
         </w:tc>
@@ -4010,17 +4027,18 @@
             <w:pPr>
               <w:jc w:val="center"/>
               <w:rPr>
-                <w:sz w:val="14"/>
-                <w:szCs w:val="14"/>
-              </w:rPr>
-            </w:pPr>
-            <w:r>
-              <w:rPr>
-                <w:rFonts w:eastAsia="Arial"/>
-                <w:sz w:val="14"/>
-                <w:szCs w:val="14"/>
-              </w:rPr>
-              <w:t>N/A</w:t>
+                <w:rFonts w:asciiTheme="majorBidi" w:hAnsiTheme="majorBidi" w:cstheme="majorBidi"/>
+                <w:sz w:val="14"/>
+                <w:szCs w:val="14"/>
+              </w:rPr>
+            </w:pPr>
+            <w:r>
+              <w:rPr>
+                <w:rFonts w:asciiTheme="majorBidi" w:eastAsia="Arial" w:hAnsiTheme="majorBidi" w:cstheme="majorBidi"/>
+                <w:sz w:val="14"/>
+                <w:szCs w:val="14"/>
+              </w:rPr>
+              <w:t>0.04 ± 0.00</w:t>
             </w:r>
           </w:p>
         </w:tc>
@@ -4040,17 +4058,18 @@
             <w:pPr>
               <w:jc w:val="center"/>
               <w:rPr>
-                <w:sz w:val="14"/>
-                <w:szCs w:val="14"/>
-              </w:rPr>
-            </w:pPr>
-            <w:r>
-              <w:rPr>
-                <w:rFonts w:eastAsia="Arial"/>
-                <w:sz w:val="14"/>
-                <w:szCs w:val="14"/>
-              </w:rPr>
-              <w:t>N/A</w:t>
+                <w:rFonts w:asciiTheme="majorBidi" w:hAnsiTheme="majorBidi" w:cstheme="majorBidi"/>
+                <w:sz w:val="14"/>
+                <w:szCs w:val="14"/>
+              </w:rPr>
+            </w:pPr>
+            <w:r>
+              <w:rPr>
+                <w:rFonts w:asciiTheme="majorBidi" w:eastAsia="Arial" w:hAnsiTheme="majorBidi" w:cstheme="majorBidi"/>
+                <w:sz w:val="14"/>
+                <w:szCs w:val="14"/>
+              </w:rPr>
+              <w:t>46.46 ± 2.77</w:t>
             </w:r>
           </w:p>
         </w:tc>
@@ -4070,17 +4089,18 @@
             <w:pPr>
               <w:jc w:val="center"/>
               <w:rPr>
-                <w:sz w:val="14"/>
-                <w:szCs w:val="14"/>
-              </w:rPr>
-            </w:pPr>
-            <w:r>
-              <w:rPr>
-                <w:rFonts w:eastAsia="Arial"/>
-                <w:sz w:val="14"/>
-                <w:szCs w:val="14"/>
-              </w:rPr>
-              <w:t>N/A</w:t>
+                <w:rFonts w:asciiTheme="majorBidi" w:hAnsiTheme="majorBidi" w:cstheme="majorBidi"/>
+                <w:sz w:val="14"/>
+                <w:szCs w:val="14"/>
+              </w:rPr>
+            </w:pPr>
+            <w:r>
+              <w:rPr>
+                <w:rFonts w:asciiTheme="majorBidi" w:eastAsia="Arial" w:hAnsiTheme="majorBidi" w:cstheme="majorBidi"/>
+                <w:sz w:val="14"/>
+                <w:szCs w:val="14"/>
+              </w:rPr>
+              <w:t>3.26 ± 0.20</w:t>
             </w:r>
           </w:p>
         </w:tc>
@@ -4100,17 +4120,18 @@
             <w:pPr>
               <w:jc w:val="center"/>
               <w:rPr>
-                <w:sz w:val="14"/>
-                <w:szCs w:val="14"/>
-              </w:rPr>
-            </w:pPr>
-            <w:r>
-              <w:rPr>
-                <w:rFonts w:eastAsia="Arial"/>
-                <w:sz w:val="14"/>
-                <w:szCs w:val="14"/>
-              </w:rPr>
-              <w:t>N/A</w:t>
+                <w:rFonts w:asciiTheme="majorBidi" w:hAnsiTheme="majorBidi" w:cstheme="majorBidi"/>
+                <w:sz w:val="14"/>
+                <w:szCs w:val="14"/>
+              </w:rPr>
+            </w:pPr>
+            <w:r>
+              <w:rPr>
+                <w:rFonts w:asciiTheme="majorBidi" w:eastAsia="Arial" w:hAnsiTheme="majorBidi" w:cstheme="majorBidi"/>
+                <w:sz w:val="14"/>
+                <w:szCs w:val="14"/>
+              </w:rPr>
+              <w:t>3.26 ± 0.20</w:t>
             </w:r>
           </w:p>
         </w:tc>
@@ -4124,18 +4145,18 @@
             <w:pPr>
               <w:jc w:val="center"/>
               <w:rPr>
-                <w:rFonts w:eastAsia="Arial"/>
-                <w:sz w:val="14"/>
-                <w:szCs w:val="14"/>
-              </w:rPr>
-            </w:pPr>
-            <w:r>
-              <w:rPr>
-                <w:rFonts w:eastAsia="Arial"/>
-                <w:sz w:val="14"/>
-                <w:szCs w:val="14"/>
-              </w:rPr>
-              <w:t>N/A</w:t>
+                <w:rFonts w:asciiTheme="majorBidi" w:eastAsia="Arial" w:hAnsiTheme="majorBidi" w:cstheme="majorBidi"/>
+                <w:sz w:val="14"/>
+                <w:szCs w:val="14"/>
+              </w:rPr>
+            </w:pPr>
+            <w:r>
+              <w:rPr>
+                <w:rFonts w:asciiTheme="majorBidi" w:eastAsia="Arial" w:hAnsiTheme="majorBidi" w:cstheme="majorBidi"/>
+                <w:sz w:val="14"/>
+                <w:szCs w:val="14"/>
+              </w:rPr>
+              <w:t>46.24 ± 2.72</w:t>
             </w:r>
           </w:p>
         </w:tc>
@@ -4366,7 +4387,7 @@
         </w:tc>
         <w:tc>
           <w:tcPr>
-            <w:tcW w:w="190" w:type="pct"/>
+            <w:tcW w:w="191" w:type="pct"/>
             <w:shd w:val="clear" w:color="auto" w:fill="FFFFFF" w:themeFill="background1"/>
             <w:vAlign w:val="center"/>
           </w:tcPr>
@@ -4473,7 +4494,7 @@
                 <w:sz w:val="14"/>
                 <w:szCs w:val="14"/>
               </w:rPr>
-              <w:t>N/A</w:t>
+              <w:t>0.03 ± 0.00</w:t>
             </w:r>
           </w:p>
         </w:tc>
@@ -4503,7 +4524,7 @@
                 <w:sz w:val="14"/>
                 <w:szCs w:val="14"/>
               </w:rPr>
-              <w:t>N/A</w:t>
+              <w:t>66.61 ± 1.11</w:t>
             </w:r>
           </w:p>
         </w:tc>
@@ -4533,7 +4554,7 @@
                 <w:sz w:val="14"/>
                 <w:szCs w:val="14"/>
               </w:rPr>
-              <w:t>N/A</w:t>
+              <w:t>2.27 ± 0.04</w:t>
             </w:r>
           </w:p>
         </w:tc>
@@ -4564,7 +4585,7 @@
                 <w:sz w:val="14"/>
                 <w:szCs w:val="14"/>
               </w:rPr>
-              <w:t>N/A</w:t>
+              <w:t>2.27 ± 0.04</w:t>
             </w:r>
           </w:p>
         </w:tc>
@@ -4594,7 +4615,7 @@
                 <w:sz w:val="14"/>
                 <w:szCs w:val="14"/>
               </w:rPr>
-              <w:t>N/A</w:t>
+              <w:t>66.17 ± 1.10</w:t>
             </w:r>
           </w:p>
         </w:tc>
@@ -4614,17 +4635,18 @@
             <w:pPr>
               <w:jc w:val="center"/>
               <w:rPr>
-                <w:sz w:val="14"/>
-                <w:szCs w:val="14"/>
-              </w:rPr>
-            </w:pPr>
-            <w:r>
-              <w:rPr>
-                <w:rFonts w:eastAsia="Arial"/>
-                <w:sz w:val="14"/>
-                <w:szCs w:val="14"/>
-              </w:rPr>
-              <w:t>N/A</w:t>
+                <w:rFonts w:asciiTheme="majorBidi" w:hAnsiTheme="majorBidi" w:cstheme="majorBidi"/>
+                <w:sz w:val="14"/>
+                <w:szCs w:val="14"/>
+              </w:rPr>
+            </w:pPr>
+            <w:r>
+              <w:rPr>
+                <w:rFonts w:asciiTheme="majorBidi" w:eastAsia="Arial" w:hAnsiTheme="majorBidi" w:cstheme="majorBidi"/>
+                <w:sz w:val="14"/>
+                <w:szCs w:val="14"/>
+              </w:rPr>
+              <w:t>0.03 ± 0.00</w:t>
             </w:r>
           </w:p>
         </w:tc>
@@ -4644,17 +4666,18 @@
             <w:pPr>
               <w:jc w:val="center"/>
               <w:rPr>
-                <w:sz w:val="14"/>
-                <w:szCs w:val="14"/>
-              </w:rPr>
-            </w:pPr>
-            <w:r>
-              <w:rPr>
-                <w:rFonts w:eastAsia="Arial"/>
-                <w:sz w:val="14"/>
-                <w:szCs w:val="14"/>
-              </w:rPr>
-              <w:t>N/A</w:t>
+                <w:rFonts w:asciiTheme="majorBidi" w:hAnsiTheme="majorBidi" w:cstheme="majorBidi"/>
+                <w:sz w:val="14"/>
+                <w:szCs w:val="14"/>
+              </w:rPr>
+            </w:pPr>
+            <w:r>
+              <w:rPr>
+                <w:rFonts w:asciiTheme="majorBidi" w:eastAsia="Arial" w:hAnsiTheme="majorBidi" w:cstheme="majorBidi"/>
+                <w:sz w:val="14"/>
+                <w:szCs w:val="14"/>
+              </w:rPr>
+              <w:t>49.24 ± 3.78</w:t>
             </w:r>
           </w:p>
         </w:tc>
@@ -4674,17 +4697,18 @@
             <w:pPr>
               <w:jc w:val="center"/>
               <w:rPr>
-                <w:sz w:val="14"/>
-                <w:szCs w:val="14"/>
-              </w:rPr>
-            </w:pPr>
-            <w:r>
-              <w:rPr>
-                <w:rFonts w:eastAsia="Arial"/>
-                <w:sz w:val="14"/>
-                <w:szCs w:val="14"/>
-              </w:rPr>
-              <w:t>N/A</w:t>
+                <w:rFonts w:asciiTheme="majorBidi" w:hAnsiTheme="majorBidi" w:cstheme="majorBidi"/>
+                <w:sz w:val="14"/>
+                <w:szCs w:val="14"/>
+              </w:rPr>
+            </w:pPr>
+            <w:r>
+              <w:rPr>
+                <w:rFonts w:asciiTheme="majorBidi" w:eastAsia="Arial" w:hAnsiTheme="majorBidi" w:cstheme="majorBidi"/>
+                <w:sz w:val="14"/>
+                <w:szCs w:val="14"/>
+              </w:rPr>
+              <w:t>3.08 ± 0.27</w:t>
             </w:r>
           </w:p>
         </w:tc>
@@ -4704,17 +4728,18 @@
             <w:pPr>
               <w:jc w:val="center"/>
               <w:rPr>
-                <w:sz w:val="14"/>
-                <w:szCs w:val="14"/>
-              </w:rPr>
-            </w:pPr>
-            <w:r>
-              <w:rPr>
-                <w:rFonts w:eastAsia="Arial"/>
-                <w:sz w:val="14"/>
-                <w:szCs w:val="14"/>
-              </w:rPr>
-              <w:t>N/A</w:t>
+                <w:rFonts w:asciiTheme="majorBidi" w:hAnsiTheme="majorBidi" w:cstheme="majorBidi"/>
+                <w:sz w:val="14"/>
+                <w:szCs w:val="14"/>
+              </w:rPr>
+            </w:pPr>
+            <w:r>
+              <w:rPr>
+                <w:rFonts w:asciiTheme="majorBidi" w:eastAsia="Arial" w:hAnsiTheme="majorBidi" w:cstheme="majorBidi"/>
+                <w:sz w:val="14"/>
+                <w:szCs w:val="14"/>
+              </w:rPr>
+              <w:t>3.08 ± 0.27</w:t>
             </w:r>
           </w:p>
         </w:tc>
@@ -4728,18 +4753,18 @@
             <w:pPr>
               <w:jc w:val="center"/>
               <w:rPr>
-                <w:rFonts w:eastAsia="Arial"/>
-                <w:sz w:val="14"/>
-                <w:szCs w:val="14"/>
-              </w:rPr>
-            </w:pPr>
-            <w:r>
-              <w:rPr>
-                <w:rFonts w:eastAsia="Arial"/>
-                <w:sz w:val="14"/>
-                <w:szCs w:val="14"/>
-              </w:rPr>
-              <w:t>N/A</w:t>
+                <w:rFonts w:asciiTheme="majorBidi" w:eastAsia="Arial" w:hAnsiTheme="majorBidi" w:cstheme="majorBidi"/>
+                <w:sz w:val="14"/>
+                <w:szCs w:val="14"/>
+              </w:rPr>
+            </w:pPr>
+            <w:r>
+              <w:rPr>
+                <w:rFonts w:asciiTheme="majorBidi" w:eastAsia="Arial" w:hAnsiTheme="majorBidi" w:cstheme="majorBidi"/>
+                <w:sz w:val="14"/>
+                <w:szCs w:val="14"/>
+              </w:rPr>
+              <w:t>49.02 ± 3.73</w:t>
             </w:r>
           </w:p>
         </w:tc>
@@ -4970,7 +4995,7 @@
         </w:tc>
         <w:tc>
           <w:tcPr>
-            <w:tcW w:w="190" w:type="pct"/>
+            <w:tcW w:w="191" w:type="pct"/>
             <w:shd w:val="clear" w:color="auto" w:fill="FFFFFF" w:themeFill="background1"/>
             <w:vAlign w:val="center"/>
           </w:tcPr>
@@ -5077,7 +5102,7 @@
                 <w:sz w:val="14"/>
                 <w:szCs w:val="14"/>
               </w:rPr>
-              <w:t>N/A</w:t>
+              <w:t>0.03 ± 0.00</w:t>
             </w:r>
           </w:p>
         </w:tc>
@@ -5107,7 +5132,7 @@
                 <w:sz w:val="14"/>
                 <w:szCs w:val="14"/>
               </w:rPr>
-              <w:t>N/A</w:t>
+              <w:t>68.40 ± 0.44</w:t>
             </w:r>
           </w:p>
         </w:tc>
@@ -5137,7 +5162,7 @@
                 <w:sz w:val="14"/>
                 <w:szCs w:val="14"/>
               </w:rPr>
-              <w:t>N/A</w:t>
+              <w:t>2.21 ± 0.01</w:t>
             </w:r>
           </w:p>
         </w:tc>
@@ -5168,7 +5193,7 @@
                 <w:sz w:val="14"/>
                 <w:szCs w:val="14"/>
               </w:rPr>
-              <w:t>N/A</w:t>
+              <w:t>2.21 ± 0.01</w:t>
             </w:r>
           </w:p>
         </w:tc>
@@ -5198,7 +5223,7 @@
                 <w:sz w:val="14"/>
                 <w:szCs w:val="14"/>
               </w:rPr>
-              <w:t>N/A</w:t>
+              <w:t>67.94 ± 0.44</w:t>
             </w:r>
           </w:p>
         </w:tc>
@@ -5218,17 +5243,18 @@
             <w:pPr>
               <w:jc w:val="center"/>
               <w:rPr>
-                <w:sz w:val="14"/>
-                <w:szCs w:val="14"/>
-              </w:rPr>
-            </w:pPr>
-            <w:r>
-              <w:rPr>
-                <w:rFonts w:eastAsia="Arial"/>
-                <w:sz w:val="14"/>
-                <w:szCs w:val="14"/>
-              </w:rPr>
-              <w:t>N/A</w:t>
+                <w:rFonts w:asciiTheme="majorBidi" w:hAnsiTheme="majorBidi" w:cstheme="majorBidi"/>
+                <w:sz w:val="14"/>
+                <w:szCs w:val="14"/>
+              </w:rPr>
+            </w:pPr>
+            <w:r>
+              <w:rPr>
+                <w:rFonts w:asciiTheme="majorBidi" w:eastAsia="Arial" w:hAnsiTheme="majorBidi" w:cstheme="majorBidi"/>
+                <w:sz w:val="14"/>
+                <w:szCs w:val="14"/>
+              </w:rPr>
+              <w:t>0.03 ± 0.00</w:t>
             </w:r>
           </w:p>
         </w:tc>
@@ -5248,17 +5274,18 @@
             <w:pPr>
               <w:jc w:val="center"/>
               <w:rPr>
-                <w:sz w:val="14"/>
-                <w:szCs w:val="14"/>
-              </w:rPr>
-            </w:pPr>
-            <w:r>
-              <w:rPr>
-                <w:rFonts w:eastAsia="Arial"/>
-                <w:sz w:val="14"/>
-                <w:szCs w:val="14"/>
-              </w:rPr>
-              <w:t>N/A</w:t>
+                <w:rFonts w:asciiTheme="majorBidi" w:hAnsiTheme="majorBidi" w:cstheme="majorBidi"/>
+                <w:sz w:val="14"/>
+                <w:szCs w:val="14"/>
+              </w:rPr>
+            </w:pPr>
+            <w:r>
+              <w:rPr>
+                <w:rFonts w:asciiTheme="majorBidi" w:eastAsia="Arial" w:hAnsiTheme="majorBidi" w:cstheme="majorBidi"/>
+                <w:sz w:val="14"/>
+                <w:szCs w:val="14"/>
+              </w:rPr>
+              <w:t>51.25 ± 0.77</w:t>
             </w:r>
           </w:p>
         </w:tc>
@@ -5278,17 +5305,18 @@
             <w:pPr>
               <w:jc w:val="center"/>
               <w:rPr>
-                <w:sz w:val="14"/>
-                <w:szCs w:val="14"/>
-              </w:rPr>
-            </w:pPr>
-            <w:r>
-              <w:rPr>
-                <w:rFonts w:eastAsia="Arial"/>
-                <w:sz w:val="14"/>
-                <w:szCs w:val="14"/>
-              </w:rPr>
-              <w:t>N/A</w:t>
+                <w:rFonts w:asciiTheme="majorBidi" w:hAnsiTheme="majorBidi" w:cstheme="majorBidi"/>
+                <w:sz w:val="14"/>
+                <w:szCs w:val="14"/>
+              </w:rPr>
+            </w:pPr>
+            <w:r>
+              <w:rPr>
+                <w:rFonts w:asciiTheme="majorBidi" w:eastAsia="Arial" w:hAnsiTheme="majorBidi" w:cstheme="majorBidi"/>
+                <w:sz w:val="14"/>
+                <w:szCs w:val="14"/>
+              </w:rPr>
+              <w:t>2.94 ± 0.04</w:t>
             </w:r>
           </w:p>
         </w:tc>
@@ -5308,17 +5336,18 @@
             <w:pPr>
               <w:jc w:val="center"/>
               <w:rPr>
-                <w:sz w:val="14"/>
-                <w:szCs w:val="14"/>
-              </w:rPr>
-            </w:pPr>
-            <w:r>
-              <w:rPr>
-                <w:rFonts w:eastAsia="Arial"/>
-                <w:sz w:val="14"/>
-                <w:szCs w:val="14"/>
-              </w:rPr>
-              <w:t>N/A</w:t>
+                <w:rFonts w:asciiTheme="majorBidi" w:hAnsiTheme="majorBidi" w:cstheme="majorBidi"/>
+                <w:sz w:val="14"/>
+                <w:szCs w:val="14"/>
+              </w:rPr>
+            </w:pPr>
+            <w:r>
+              <w:rPr>
+                <w:rFonts w:asciiTheme="majorBidi" w:eastAsia="Arial" w:hAnsiTheme="majorBidi" w:cstheme="majorBidi"/>
+                <w:sz w:val="14"/>
+                <w:szCs w:val="14"/>
+              </w:rPr>
+              <w:t>2.94 ± 0.04</w:t>
             </w:r>
           </w:p>
         </w:tc>
@@ -5332,18 +5361,18 @@
             <w:pPr>
               <w:jc w:val="center"/>
               <w:rPr>
-                <w:rFonts w:eastAsia="Arial"/>
-                <w:sz w:val="14"/>
-                <w:szCs w:val="14"/>
-              </w:rPr>
-            </w:pPr>
-            <w:r>
-              <w:rPr>
-                <w:rFonts w:eastAsia="Arial"/>
-                <w:sz w:val="14"/>
-                <w:szCs w:val="14"/>
-              </w:rPr>
-              <w:t>N/A</w:t>
+                <w:rFonts w:asciiTheme="majorBidi" w:eastAsia="Arial" w:hAnsiTheme="majorBidi" w:cstheme="majorBidi"/>
+                <w:sz w:val="14"/>
+                <w:szCs w:val="14"/>
+              </w:rPr>
+            </w:pPr>
+            <w:r>
+              <w:rPr>
+                <w:rFonts w:asciiTheme="majorBidi" w:eastAsia="Arial" w:hAnsiTheme="majorBidi" w:cstheme="majorBidi"/>
+                <w:sz w:val="14"/>
+                <w:szCs w:val="14"/>
+              </w:rPr>
+              <w:t>50.98 ± 0.76</w:t>
             </w:r>
           </w:p>
         </w:tc>
@@ -5574,7 +5603,7 @@
         </w:tc>
         <w:tc>
           <w:tcPr>
-            <w:tcW w:w="190" w:type="pct"/>
+            <w:tcW w:w="191" w:type="pct"/>
             <w:shd w:val="clear" w:color="auto" w:fill="FFFFFF" w:themeFill="background1"/>
             <w:vAlign w:val="center"/>
           </w:tcPr>
@@ -5642,7 +5671,7 @@
           <w:p>
             <w:pPr>
               <w:rPr>
-                <w:rFonts w:eastAsia="Arial"/>
+                <w:rFonts w:asciiTheme="majorBidi" w:eastAsia="Arial" w:hAnsiTheme="majorBidi" w:cstheme="majorBidi"/>
                 <w:color w:val="FFFFFF" w:themeColor="background1"/>
                 <w:sz w:val="14"/>
                 <w:szCs w:val="14"/>
@@ -5796,7 +5825,7 @@
         </w:tc>
         <w:tc>
           <w:tcPr>
-            <w:tcW w:w="190" w:type="pct"/>
+            <w:tcW w:w="191" w:type="pct"/>
             <w:shd w:val="clear" w:color="auto" w:fill="000000" w:themeFill="text1"/>
           </w:tcPr>
           <w:p>
@@ -5893,7 +5922,7 @@
                 <w:sz w:val="14"/>
                 <w:szCs w:val="14"/>
               </w:rPr>
-              <w:t>N/A</w:t>
+              <w:t>0.03 ± 0.00</w:t>
             </w:r>
           </w:p>
         </w:tc>
@@ -5923,7 +5952,7 @@
                 <w:sz w:val="14"/>
                 <w:szCs w:val="14"/>
               </w:rPr>
-              <w:t>N/A</w:t>
+              <w:t>130.51 ± 1.32</w:t>
             </w:r>
           </w:p>
         </w:tc>
@@ -5953,7 +5982,7 @@
                 <w:sz w:val="14"/>
                 <w:szCs w:val="14"/>
               </w:rPr>
-              <w:t>N/A</w:t>
+              <w:t>1.17 ± 0.01</w:t>
             </w:r>
           </w:p>
         </w:tc>
@@ -5985,7 +6014,7 @@
                 <w:sz w:val="14"/>
                 <w:szCs w:val="14"/>
               </w:rPr>
-              <w:t>N/A</w:t>
+              <w:t>1.17 ± 0.01</w:t>
             </w:r>
           </w:p>
         </w:tc>
@@ -6015,7 +6044,7 @@
                 <w:sz w:val="14"/>
                 <w:szCs w:val="14"/>
               </w:rPr>
-              <w:t>N/A</w:t>
+              <w:t>128.51 ± 1.28</w:t>
             </w:r>
           </w:p>
         </w:tc>
@@ -6035,17 +6064,18 @@
             <w:pPr>
               <w:jc w:val="center"/>
               <w:rPr>
-                <w:sz w:val="14"/>
-                <w:szCs w:val="14"/>
-              </w:rPr>
-            </w:pPr>
-            <w:r>
-              <w:rPr>
-                <w:rFonts w:eastAsia="Arial"/>
-                <w:sz w:val="14"/>
-                <w:szCs w:val="14"/>
-              </w:rPr>
-              <w:t>N/A</w:t>
+                <w:rFonts w:asciiTheme="majorBidi" w:hAnsiTheme="majorBidi" w:cstheme="majorBidi"/>
+                <w:sz w:val="14"/>
+                <w:szCs w:val="14"/>
+              </w:rPr>
+            </w:pPr>
+            <w:r>
+              <w:rPr>
+                <w:rFonts w:asciiTheme="majorBidi" w:eastAsia="Arial" w:hAnsiTheme="majorBidi" w:cstheme="majorBidi"/>
+                <w:sz w:val="14"/>
+                <w:szCs w:val="14"/>
+              </w:rPr>
+              <w:t>0.03 ± 0.00</w:t>
             </w:r>
           </w:p>
         </w:tc>
@@ -6065,17 +6095,18 @@
             <w:pPr>
               <w:jc w:val="center"/>
               <w:rPr>
-                <w:sz w:val="14"/>
-                <w:szCs w:val="14"/>
-              </w:rPr>
-            </w:pPr>
-            <w:r>
-              <w:rPr>
-                <w:rFonts w:eastAsia="Arial"/>
-                <w:sz w:val="14"/>
-                <w:szCs w:val="14"/>
-              </w:rPr>
-              <w:t>N/A</w:t>
+                <w:rFonts w:asciiTheme="majorBidi" w:hAnsiTheme="majorBidi" w:cstheme="majorBidi"/>
+                <w:sz w:val="14"/>
+                <w:szCs w:val="14"/>
+              </w:rPr>
+            </w:pPr>
+            <w:r>
+              <w:rPr>
+                <w:rFonts w:asciiTheme="majorBidi" w:eastAsia="Arial" w:hAnsiTheme="majorBidi" w:cstheme="majorBidi"/>
+                <w:sz w:val="14"/>
+                <w:szCs w:val="14"/>
+              </w:rPr>
+              <w:t>116.26 ± 1.45</w:t>
             </w:r>
           </w:p>
         </w:tc>
@@ -6095,17 +6126,18 @@
             <w:pPr>
               <w:jc w:val="center"/>
               <w:rPr>
-                <w:sz w:val="14"/>
-                <w:szCs w:val="14"/>
-              </w:rPr>
-            </w:pPr>
-            <w:r>
-              <w:rPr>
-                <w:rFonts w:eastAsia="Arial"/>
-                <w:sz w:val="14"/>
-                <w:szCs w:val="14"/>
-              </w:rPr>
-              <w:t>N/A</w:t>
+                <w:rFonts w:asciiTheme="majorBidi" w:hAnsiTheme="majorBidi" w:cstheme="majorBidi"/>
+                <w:sz w:val="14"/>
+                <w:szCs w:val="14"/>
+              </w:rPr>
+            </w:pPr>
+            <w:r>
+              <w:rPr>
+                <w:rFonts w:asciiTheme="majorBidi" w:eastAsia="Arial" w:hAnsiTheme="majorBidi" w:cstheme="majorBidi"/>
+                <w:sz w:val="14"/>
+                <w:szCs w:val="14"/>
+              </w:rPr>
+              <w:t>1.31 ± 0.02</w:t>
             </w:r>
           </w:p>
         </w:tc>
@@ -6125,17 +6157,18 @@
             <w:pPr>
               <w:jc w:val="center"/>
               <w:rPr>
-                <w:sz w:val="14"/>
-                <w:szCs w:val="14"/>
-              </w:rPr>
-            </w:pPr>
-            <w:r>
-              <w:rPr>
-                <w:rFonts w:eastAsia="Arial"/>
-                <w:sz w:val="14"/>
-                <w:szCs w:val="14"/>
-              </w:rPr>
-              <w:t>N/A</w:t>
+                <w:rFonts w:asciiTheme="majorBidi" w:hAnsiTheme="majorBidi" w:cstheme="majorBidi"/>
+                <w:sz w:val="14"/>
+                <w:szCs w:val="14"/>
+              </w:rPr>
+            </w:pPr>
+            <w:r>
+              <w:rPr>
+                <w:rFonts w:asciiTheme="majorBidi" w:eastAsia="Arial" w:hAnsiTheme="majorBidi" w:cstheme="majorBidi"/>
+                <w:sz w:val="14"/>
+                <w:szCs w:val="14"/>
+              </w:rPr>
+              <w:t>1.31 ± 0.02</w:t>
             </w:r>
           </w:p>
         </w:tc>
@@ -6149,18 +6182,18 @@
             <w:pPr>
               <w:jc w:val="center"/>
               <w:rPr>
-                <w:rFonts w:eastAsia="Arial"/>
-                <w:sz w:val="14"/>
-                <w:szCs w:val="14"/>
-              </w:rPr>
-            </w:pPr>
-            <w:r>
-              <w:rPr>
-                <w:rFonts w:eastAsia="Arial"/>
-                <w:sz w:val="14"/>
-                <w:szCs w:val="14"/>
-              </w:rPr>
-              <w:t>N/A</w:t>
+                <w:rFonts w:asciiTheme="majorBidi" w:eastAsia="Arial" w:hAnsiTheme="majorBidi" w:cstheme="majorBidi"/>
+                <w:sz w:val="14"/>
+                <w:szCs w:val="14"/>
+              </w:rPr>
+            </w:pPr>
+            <w:r>
+              <w:rPr>
+                <w:rFonts w:asciiTheme="majorBidi" w:eastAsia="Arial" w:hAnsiTheme="majorBidi" w:cstheme="majorBidi"/>
+                <w:sz w:val="14"/>
+                <w:szCs w:val="14"/>
+              </w:rPr>
+              <w:t>114.30 ± 1.37</w:t>
             </w:r>
           </w:p>
         </w:tc>
@@ -6391,7 +6424,7 @@
         </w:tc>
         <w:tc>
           <w:tcPr>
-            <w:tcW w:w="190" w:type="pct"/>
+            <w:tcW w:w="191" w:type="pct"/>
             <w:shd w:val="clear" w:color="auto" w:fill="FFFFFF" w:themeFill="background1"/>
             <w:vAlign w:val="center"/>
           </w:tcPr>
@@ -6497,7 +6530,7 @@
                 <w:sz w:val="14"/>
                 <w:szCs w:val="14"/>
               </w:rPr>
-              <w:t>N/A</w:t>
+              <w:t>0.03 ± 0.00</w:t>
             </w:r>
           </w:p>
         </w:tc>
@@ -6527,7 +6560,7 @@
                 <w:sz w:val="14"/>
                 <w:szCs w:val="14"/>
               </w:rPr>
-              <w:t>N/A</w:t>
+              <w:t>129.93 ± 1.46</w:t>
             </w:r>
           </w:p>
         </w:tc>
@@ -6557,7 +6590,7 @@
                 <w:sz w:val="14"/>
                 <w:szCs w:val="14"/>
               </w:rPr>
-              <w:t>N/A</w:t>
+              <w:t>1.17 ± 0.01</w:t>
             </w:r>
           </w:p>
         </w:tc>
@@ -6588,7 +6621,7 @@
                 <w:sz w:val="14"/>
                 <w:szCs w:val="14"/>
               </w:rPr>
-              <w:t>N/A</w:t>
+              <w:t>1.17 ± 0.01</w:t>
             </w:r>
           </w:p>
         </w:tc>
@@ -6618,7 +6651,7 @@
                 <w:sz w:val="14"/>
                 <w:szCs w:val="14"/>
               </w:rPr>
-              <w:t>N/A</w:t>
+              <w:t>127.93 ± 1.34</w:t>
             </w:r>
           </w:p>
         </w:tc>
@@ -6638,17 +6671,18 @@
             <w:pPr>
               <w:jc w:val="center"/>
               <w:rPr>
-                <w:sz w:val="14"/>
-                <w:szCs w:val="14"/>
-              </w:rPr>
-            </w:pPr>
-            <w:r>
-              <w:rPr>
-                <w:rFonts w:eastAsia="Arial"/>
-                <w:sz w:val="14"/>
-                <w:szCs w:val="14"/>
-              </w:rPr>
-              <w:t>N/A</w:t>
+                <w:rFonts w:asciiTheme="majorBidi" w:hAnsiTheme="majorBidi" w:cstheme="majorBidi"/>
+                <w:sz w:val="14"/>
+                <w:szCs w:val="14"/>
+              </w:rPr>
+            </w:pPr>
+            <w:r>
+              <w:rPr>
+                <w:rFonts w:asciiTheme="majorBidi" w:eastAsia="Arial" w:hAnsiTheme="majorBidi" w:cstheme="majorBidi"/>
+                <w:sz w:val="14"/>
+                <w:szCs w:val="14"/>
+              </w:rPr>
+              <w:t>0.03 ± 0.00</w:t>
             </w:r>
           </w:p>
         </w:tc>
@@ -6668,17 +6702,18 @@
             <w:pPr>
               <w:jc w:val="center"/>
               <w:rPr>
-                <w:sz w:val="14"/>
-                <w:szCs w:val="14"/>
-              </w:rPr>
-            </w:pPr>
-            <w:r>
-              <w:rPr>
-                <w:rFonts w:eastAsia="Arial"/>
-                <w:sz w:val="14"/>
-                <w:szCs w:val="14"/>
-              </w:rPr>
-              <w:t>N/A</w:t>
+                <w:rFonts w:asciiTheme="majorBidi" w:hAnsiTheme="majorBidi" w:cstheme="majorBidi"/>
+                <w:sz w:val="14"/>
+                <w:szCs w:val="14"/>
+              </w:rPr>
+            </w:pPr>
+            <w:r>
+              <w:rPr>
+                <w:rFonts w:asciiTheme="majorBidi" w:eastAsia="Arial" w:hAnsiTheme="majorBidi" w:cstheme="majorBidi"/>
+                <w:sz w:val="14"/>
+                <w:szCs w:val="14"/>
+              </w:rPr>
+              <w:t>111.29 ± 0.81</w:t>
             </w:r>
           </w:p>
         </w:tc>
@@ -6698,17 +6733,18 @@
             <w:pPr>
               <w:jc w:val="center"/>
               <w:rPr>
-                <w:sz w:val="14"/>
-                <w:szCs w:val="14"/>
-              </w:rPr>
-            </w:pPr>
-            <w:r>
-              <w:rPr>
-                <w:rFonts w:eastAsia="Arial"/>
-                <w:sz w:val="14"/>
-                <w:szCs w:val="14"/>
-              </w:rPr>
-              <w:t>N/A</w:t>
+                <w:rFonts w:asciiTheme="majorBidi" w:hAnsiTheme="majorBidi" w:cstheme="majorBidi"/>
+                <w:sz w:val="14"/>
+                <w:szCs w:val="14"/>
+              </w:rPr>
+            </w:pPr>
+            <w:r>
+              <w:rPr>
+                <w:rFonts w:asciiTheme="majorBidi" w:eastAsia="Arial" w:hAnsiTheme="majorBidi" w:cstheme="majorBidi"/>
+                <w:sz w:val="14"/>
+                <w:szCs w:val="14"/>
+              </w:rPr>
+              <w:t>1.37 ± 0.01</w:t>
             </w:r>
           </w:p>
         </w:tc>
@@ -6728,17 +6764,18 @@
             <w:pPr>
               <w:jc w:val="center"/>
               <w:rPr>
-                <w:sz w:val="14"/>
-                <w:szCs w:val="14"/>
-              </w:rPr>
-            </w:pPr>
-            <w:r>
-              <w:rPr>
-                <w:rFonts w:eastAsia="Arial"/>
-                <w:sz w:val="14"/>
-                <w:szCs w:val="14"/>
-              </w:rPr>
-              <w:t>N/A</w:t>
+                <w:rFonts w:asciiTheme="majorBidi" w:hAnsiTheme="majorBidi" w:cstheme="majorBidi"/>
+                <w:sz w:val="14"/>
+                <w:szCs w:val="14"/>
+              </w:rPr>
+            </w:pPr>
+            <w:r>
+              <w:rPr>
+                <w:rFonts w:asciiTheme="majorBidi" w:eastAsia="Arial" w:hAnsiTheme="majorBidi" w:cstheme="majorBidi"/>
+                <w:sz w:val="14"/>
+                <w:szCs w:val="14"/>
+              </w:rPr>
+              <w:t>1.37 ± 0.01</w:t>
             </w:r>
           </w:p>
         </w:tc>
@@ -6752,18 +6789,18 @@
             <w:pPr>
               <w:jc w:val="center"/>
               <w:rPr>
-                <w:rFonts w:eastAsia="Arial"/>
-                <w:sz w:val="14"/>
-                <w:szCs w:val="14"/>
-              </w:rPr>
-            </w:pPr>
-            <w:r>
-              <w:rPr>
-                <w:rFonts w:eastAsia="Arial"/>
-                <w:sz w:val="14"/>
-                <w:szCs w:val="14"/>
-              </w:rPr>
-              <w:t>N/A</w:t>
+                <w:rFonts w:asciiTheme="majorBidi" w:eastAsia="Arial" w:hAnsiTheme="majorBidi" w:cstheme="majorBidi"/>
+                <w:sz w:val="14"/>
+                <w:szCs w:val="14"/>
+              </w:rPr>
+            </w:pPr>
+            <w:r>
+              <w:rPr>
+                <w:rFonts w:asciiTheme="majorBidi" w:eastAsia="Arial" w:hAnsiTheme="majorBidi" w:cstheme="majorBidi"/>
+                <w:sz w:val="14"/>
+                <w:szCs w:val="14"/>
+              </w:rPr>
+              <w:t>109.44 ± 0.82</w:t>
             </w:r>
           </w:p>
         </w:tc>
@@ -6994,7 +7031,7 @@
         </w:tc>
         <w:tc>
           <w:tcPr>
-            <w:tcW w:w="190" w:type="pct"/>
+            <w:tcW w:w="191" w:type="pct"/>
             <w:shd w:val="clear" w:color="auto" w:fill="FFFFFF" w:themeFill="background1"/>
             <w:vAlign w:val="center"/>
           </w:tcPr>
@@ -7062,7 +7099,7 @@
           <w:p>
             <w:pPr>
               <w:rPr>
-                <w:rFonts w:eastAsia="Arial"/>
+                <w:rFonts w:asciiTheme="majorBidi" w:eastAsia="Arial" w:hAnsiTheme="majorBidi" w:cstheme="majorBidi"/>
                 <w:color w:val="FFFFFF" w:themeColor="background1"/>
                 <w:sz w:val="14"/>
                 <w:szCs w:val="14"/>
@@ -7216,7 +7253,7 @@
         </w:tc>
         <w:tc>
           <w:tcPr>
-            <w:tcW w:w="190" w:type="pct"/>
+            <w:tcW w:w="191" w:type="pct"/>
             <w:shd w:val="clear" w:color="auto" w:fill="000000" w:themeFill="text1"/>
           </w:tcPr>
           <w:p>
@@ -7322,7 +7359,7 @@
                 <w:sz w:val="14"/>
                 <w:szCs w:val="14"/>
               </w:rPr>
-              <w:t>N/A</w:t>
+              <w:t>0.02 ± 0.00</w:t>
             </w:r>
           </w:p>
         </w:tc>
@@ -7352,7 +7389,7 @@
                 <w:sz w:val="14"/>
                 <w:szCs w:val="14"/>
               </w:rPr>
-              <w:t>N/A</w:t>
+              <w:t>141.19 ± 1.77</w:t>
             </w:r>
           </w:p>
         </w:tc>
@@ -7382,7 +7419,7 @@
                 <w:sz w:val="14"/>
                 <w:szCs w:val="14"/>
               </w:rPr>
-              <w:t>N/A</w:t>
+              <w:t>1.08 ± 0.01</w:t>
             </w:r>
           </w:p>
         </w:tc>
@@ -7413,7 +7450,7 @@
                 <w:sz w:val="14"/>
                 <w:szCs w:val="14"/>
               </w:rPr>
-              <w:t>N/A</w:t>
+              <w:t>1.08 ± 0.01</w:t>
             </w:r>
           </w:p>
         </w:tc>
@@ -7443,7 +7480,7 @@
                 <w:sz w:val="14"/>
                 <w:szCs w:val="14"/>
               </w:rPr>
-              <w:t>N/A</w:t>
+              <w:t>139.07 ± 1.69</w:t>
             </w:r>
           </w:p>
         </w:tc>
@@ -7463,17 +7500,18 @@
             <w:pPr>
               <w:jc w:val="center"/>
               <w:rPr>
-                <w:sz w:val="14"/>
-                <w:szCs w:val="14"/>
-              </w:rPr>
-            </w:pPr>
-            <w:r>
-              <w:rPr>
-                <w:rFonts w:eastAsia="Arial"/>
-                <w:sz w:val="14"/>
-                <w:szCs w:val="14"/>
-              </w:rPr>
-              <w:t>N/A</w:t>
+                <w:rFonts w:asciiTheme="majorBidi" w:hAnsiTheme="majorBidi" w:cstheme="majorBidi"/>
+                <w:sz w:val="14"/>
+                <w:szCs w:val="14"/>
+              </w:rPr>
+            </w:pPr>
+            <w:r>
+              <w:rPr>
+                <w:rFonts w:asciiTheme="majorBidi" w:eastAsia="Arial" w:hAnsiTheme="majorBidi" w:cstheme="majorBidi"/>
+                <w:sz w:val="14"/>
+                <w:szCs w:val="14"/>
+              </w:rPr>
+              <w:t>0.03 ± 0.00</w:t>
             </w:r>
           </w:p>
         </w:tc>
@@ -7493,17 +7531,18 @@
             <w:pPr>
               <w:jc w:val="center"/>
               <w:rPr>
-                <w:sz w:val="14"/>
-                <w:szCs w:val="14"/>
-              </w:rPr>
-            </w:pPr>
-            <w:r>
-              <w:rPr>
-                <w:rFonts w:eastAsia="Arial"/>
-                <w:sz w:val="14"/>
-                <w:szCs w:val="14"/>
-              </w:rPr>
-              <w:t>N/A</w:t>
+                <w:rFonts w:asciiTheme="majorBidi" w:hAnsiTheme="majorBidi" w:cstheme="majorBidi"/>
+                <w:sz w:val="14"/>
+                <w:szCs w:val="14"/>
+              </w:rPr>
+            </w:pPr>
+            <w:r>
+              <w:rPr>
+                <w:rFonts w:asciiTheme="majorBidi" w:eastAsia="Arial" w:hAnsiTheme="majorBidi" w:cstheme="majorBidi"/>
+                <w:sz w:val="14"/>
+                <w:szCs w:val="14"/>
+              </w:rPr>
+              <w:t>116.66 ± 1.02</w:t>
             </w:r>
           </w:p>
         </w:tc>
@@ -7523,17 +7562,18 @@
             <w:pPr>
               <w:jc w:val="center"/>
               <w:rPr>
-                <w:sz w:val="14"/>
-                <w:szCs w:val="14"/>
-              </w:rPr>
-            </w:pPr>
-            <w:r>
-              <w:rPr>
-                <w:rFonts w:eastAsia="Arial"/>
-                <w:sz w:val="14"/>
-                <w:szCs w:val="14"/>
-              </w:rPr>
-              <w:t>N/A</w:t>
+                <w:rFonts w:asciiTheme="majorBidi" w:hAnsiTheme="majorBidi" w:cstheme="majorBidi"/>
+                <w:sz w:val="14"/>
+                <w:szCs w:val="14"/>
+              </w:rPr>
+            </w:pPr>
+            <w:r>
+              <w:rPr>
+                <w:rFonts w:asciiTheme="majorBidi" w:eastAsia="Arial" w:hAnsiTheme="majorBidi" w:cstheme="majorBidi"/>
+                <w:sz w:val="14"/>
+                <w:szCs w:val="14"/>
+              </w:rPr>
+              <w:t>1.31 ± 0.01</w:t>
             </w:r>
           </w:p>
         </w:tc>
@@ -7553,17 +7593,18 @@
             <w:pPr>
               <w:jc w:val="center"/>
               <w:rPr>
-                <w:sz w:val="14"/>
-                <w:szCs w:val="14"/>
-              </w:rPr>
-            </w:pPr>
-            <w:r>
-              <w:rPr>
-                <w:rFonts w:eastAsia="Arial"/>
-                <w:sz w:val="14"/>
-                <w:szCs w:val="14"/>
-              </w:rPr>
-              <w:t>N/A</w:t>
+                <w:rFonts w:asciiTheme="majorBidi" w:hAnsiTheme="majorBidi" w:cstheme="majorBidi"/>
+                <w:sz w:val="14"/>
+                <w:szCs w:val="14"/>
+              </w:rPr>
+            </w:pPr>
+            <w:r>
+              <w:rPr>
+                <w:rFonts w:asciiTheme="majorBidi" w:eastAsia="Arial" w:hAnsiTheme="majorBidi" w:cstheme="majorBidi"/>
+                <w:sz w:val="14"/>
+                <w:szCs w:val="14"/>
+              </w:rPr>
+              <w:t>1.31 ± 0.01</w:t>
             </w:r>
           </w:p>
         </w:tc>
@@ -7577,18 +7618,18 @@
             <w:pPr>
               <w:jc w:val="center"/>
               <w:rPr>
-                <w:rFonts w:eastAsia="Arial"/>
-                <w:sz w:val="14"/>
-                <w:szCs w:val="14"/>
-              </w:rPr>
-            </w:pPr>
-            <w:r>
-              <w:rPr>
-                <w:rFonts w:eastAsia="Arial"/>
-                <w:sz w:val="14"/>
-                <w:szCs w:val="14"/>
-              </w:rPr>
-              <w:t>N/A</w:t>
+                <w:rFonts w:asciiTheme="majorBidi" w:eastAsia="Arial" w:hAnsiTheme="majorBidi" w:cstheme="majorBidi"/>
+                <w:sz w:val="14"/>
+                <w:szCs w:val="14"/>
+              </w:rPr>
+            </w:pPr>
+            <w:r>
+              <w:rPr>
+                <w:rFonts w:asciiTheme="majorBidi" w:eastAsia="Arial" w:hAnsiTheme="majorBidi" w:cstheme="majorBidi"/>
+                <w:sz w:val="14"/>
+                <w:szCs w:val="14"/>
+              </w:rPr>
+              <w:t>114.94 ± 1.08</w:t>
             </w:r>
           </w:p>
         </w:tc>
@@ -7819,7 +7860,7 @@
         </w:tc>
         <w:tc>
           <w:tcPr>
-            <w:tcW w:w="190" w:type="pct"/>
+            <w:tcW w:w="191" w:type="pct"/>
             <w:shd w:val="clear" w:color="auto" w:fill="FFFFFF" w:themeFill="background1"/>
             <w:vAlign w:val="center"/>
           </w:tcPr>
@@ -7926,7 +7967,7 @@
                 <w:sz w:val="14"/>
                 <w:szCs w:val="14"/>
               </w:rPr>
-              <w:t>N/A</w:t>
+              <w:t>0.02 ± 0.00</w:t>
             </w:r>
           </w:p>
         </w:tc>
@@ -7956,7 +7997,7 @@
                 <w:sz w:val="14"/>
                 <w:szCs w:val="14"/>
               </w:rPr>
-              <w:t>N/A</w:t>
+              <w:t>140.90 ± 2.23</w:t>
             </w:r>
           </w:p>
         </w:tc>
@@ -7986,7 +8027,7 @@
                 <w:sz w:val="14"/>
                 <w:szCs w:val="14"/>
               </w:rPr>
-              <w:t>N/A</w:t>
+              <w:t>1.08 ± 0.02</w:t>
             </w:r>
           </w:p>
         </w:tc>
@@ -8017,7 +8058,7 @@
                 <w:sz w:val="14"/>
                 <w:szCs w:val="14"/>
               </w:rPr>
-              <w:t>N/A</w:t>
+              <w:t>1.08 ± 0.02</w:t>
             </w:r>
           </w:p>
         </w:tc>
@@ -8047,7 +8088,7 @@
                 <w:sz w:val="14"/>
                 <w:szCs w:val="14"/>
               </w:rPr>
-              <w:t>N/A</w:t>
+              <w:t>138.76 ± 2.12</w:t>
             </w:r>
           </w:p>
         </w:tc>
@@ -8067,17 +8108,18 @@
             <w:pPr>
               <w:jc w:val="center"/>
               <w:rPr>
-                <w:sz w:val="14"/>
-                <w:szCs w:val="14"/>
-              </w:rPr>
-            </w:pPr>
-            <w:r>
-              <w:rPr>
-                <w:rFonts w:eastAsia="Arial"/>
-                <w:sz w:val="14"/>
-                <w:szCs w:val="14"/>
-              </w:rPr>
-              <w:t>N/A</w:t>
+                <w:rFonts w:asciiTheme="majorBidi" w:hAnsiTheme="majorBidi" w:cstheme="majorBidi"/>
+                <w:sz w:val="14"/>
+                <w:szCs w:val="14"/>
+              </w:rPr>
+            </w:pPr>
+            <w:r>
+              <w:rPr>
+                <w:rFonts w:asciiTheme="majorBidi" w:eastAsia="Arial" w:hAnsiTheme="majorBidi" w:cstheme="majorBidi"/>
+                <w:sz w:val="14"/>
+                <w:szCs w:val="14"/>
+              </w:rPr>
+              <w:t>0.03 ± 0.00</w:t>
             </w:r>
           </w:p>
         </w:tc>
@@ -8097,17 +8139,18 @@
             <w:pPr>
               <w:jc w:val="center"/>
               <w:rPr>
-                <w:sz w:val="14"/>
-                <w:szCs w:val="14"/>
-              </w:rPr>
-            </w:pPr>
-            <w:r>
-              <w:rPr>
-                <w:rFonts w:eastAsia="Arial"/>
-                <w:sz w:val="14"/>
-                <w:szCs w:val="14"/>
-              </w:rPr>
-              <w:t>N/A</w:t>
+                <w:rFonts w:asciiTheme="majorBidi" w:hAnsiTheme="majorBidi" w:cstheme="majorBidi"/>
+                <w:sz w:val="14"/>
+                <w:szCs w:val="14"/>
+              </w:rPr>
+            </w:pPr>
+            <w:r>
+              <w:rPr>
+                <w:rFonts w:asciiTheme="majorBidi" w:eastAsia="Arial" w:hAnsiTheme="majorBidi" w:cstheme="majorBidi"/>
+                <w:sz w:val="14"/>
+                <w:szCs w:val="14"/>
+              </w:rPr>
+              <w:t>119.75 ± 0.88</w:t>
             </w:r>
           </w:p>
         </w:tc>
@@ -8127,17 +8170,18 @@
             <w:pPr>
               <w:jc w:val="center"/>
               <w:rPr>
-                <w:sz w:val="14"/>
-                <w:szCs w:val="14"/>
-              </w:rPr>
-            </w:pPr>
-            <w:r>
-              <w:rPr>
-                <w:rFonts w:eastAsia="Arial"/>
-                <w:sz w:val="14"/>
-                <w:szCs w:val="14"/>
-              </w:rPr>
-              <w:t>N/A</w:t>
+                <w:rFonts w:asciiTheme="majorBidi" w:hAnsiTheme="majorBidi" w:cstheme="majorBidi"/>
+                <w:sz w:val="14"/>
+                <w:szCs w:val="14"/>
+              </w:rPr>
+            </w:pPr>
+            <w:r>
+              <w:rPr>
+                <w:rFonts w:asciiTheme="majorBidi" w:eastAsia="Arial" w:hAnsiTheme="majorBidi" w:cstheme="majorBidi"/>
+                <w:sz w:val="14"/>
+                <w:szCs w:val="14"/>
+              </w:rPr>
+              <w:t>1.27 ± 0.01</w:t>
             </w:r>
           </w:p>
         </w:tc>
@@ -8157,17 +8201,18 @@
             <w:pPr>
               <w:jc w:val="center"/>
               <w:rPr>
-                <w:sz w:val="14"/>
-                <w:szCs w:val="14"/>
-              </w:rPr>
-            </w:pPr>
-            <w:r>
-              <w:rPr>
-                <w:rFonts w:eastAsia="Arial"/>
-                <w:sz w:val="14"/>
-                <w:szCs w:val="14"/>
-              </w:rPr>
-              <w:t>N/A</w:t>
+                <w:rFonts w:asciiTheme="majorBidi" w:hAnsiTheme="majorBidi" w:cstheme="majorBidi"/>
+                <w:sz w:val="14"/>
+                <w:szCs w:val="14"/>
+              </w:rPr>
+            </w:pPr>
+            <w:r>
+              <w:rPr>
+                <w:rFonts w:asciiTheme="majorBidi" w:eastAsia="Arial" w:hAnsiTheme="majorBidi" w:cstheme="majorBidi"/>
+                <w:sz w:val="14"/>
+                <w:szCs w:val="14"/>
+              </w:rPr>
+              <w:t>1.27 ± 0.01</w:t>
             </w:r>
           </w:p>
         </w:tc>
@@ -8181,18 +8226,18 @@
             <w:pPr>
               <w:jc w:val="center"/>
               <w:rPr>
-                <w:rFonts w:eastAsia="Arial"/>
-                <w:sz w:val="14"/>
-                <w:szCs w:val="14"/>
-              </w:rPr>
-            </w:pPr>
-            <w:r>
-              <w:rPr>
-                <w:rFonts w:eastAsia="Arial"/>
-                <w:sz w:val="14"/>
-                <w:szCs w:val="14"/>
-              </w:rPr>
-              <w:t>N/A</w:t>
+                <w:rFonts w:asciiTheme="majorBidi" w:eastAsia="Arial" w:hAnsiTheme="majorBidi" w:cstheme="majorBidi"/>
+                <w:sz w:val="14"/>
+                <w:szCs w:val="14"/>
+              </w:rPr>
+            </w:pPr>
+            <w:r>
+              <w:rPr>
+                <w:rFonts w:asciiTheme="majorBidi" w:eastAsia="Arial" w:hAnsiTheme="majorBidi" w:cstheme="majorBidi"/>
+                <w:sz w:val="14"/>
+                <w:szCs w:val="14"/>
+              </w:rPr>
+              <w:t>117.77 ± 0.89</w:t>
             </w:r>
           </w:p>
         </w:tc>
@@ -8423,7 +8468,7 @@
         </w:tc>
         <w:tc>
           <w:tcPr>
-            <w:tcW w:w="190" w:type="pct"/>
+            <w:tcW w:w="191" w:type="pct"/>
             <w:shd w:val="clear" w:color="auto" w:fill="FFFFFF" w:themeFill="background1"/>
             <w:vAlign w:val="center"/>
           </w:tcPr>
@@ -8530,7 +8575,7 @@
                 <w:sz w:val="14"/>
                 <w:szCs w:val="14"/>
               </w:rPr>
-              <w:t>N/A</w:t>
+              <w:t>0.03 ± 0.00</w:t>
             </w:r>
           </w:p>
         </w:tc>
@@ -8560,7 +8605,7 @@
                 <w:sz w:val="14"/>
                 <w:szCs w:val="14"/>
               </w:rPr>
-              <w:t>N/A</w:t>
+              <w:t>146.34 ± 0.85</w:t>
             </w:r>
           </w:p>
         </w:tc>
@@ -8590,7 +8635,7 @@
                 <w:sz w:val="14"/>
                 <w:szCs w:val="14"/>
               </w:rPr>
-              <w:t>N/A</w:t>
+              <w:t>1.04 ± 0.01</w:t>
             </w:r>
           </w:p>
         </w:tc>
@@ -8621,7 +8666,7 @@
                 <w:sz w:val="14"/>
                 <w:szCs w:val="14"/>
               </w:rPr>
-              <w:t>N/A</w:t>
+              <w:t>1.04 ± 0.01</w:t>
             </w:r>
           </w:p>
         </w:tc>
@@ -8651,7 +8696,7 @@
                 <w:sz w:val="14"/>
                 <w:szCs w:val="14"/>
               </w:rPr>
-              <w:t>N/A</w:t>
+              <w:t>143.67 ± 0.80</w:t>
             </w:r>
           </w:p>
         </w:tc>
@@ -8671,17 +8716,18 @@
             <w:pPr>
               <w:jc w:val="center"/>
               <w:rPr>
-                <w:sz w:val="14"/>
-                <w:szCs w:val="14"/>
-              </w:rPr>
-            </w:pPr>
-            <w:r>
-              <w:rPr>
-                <w:rFonts w:eastAsia="Arial"/>
-                <w:sz w:val="14"/>
-                <w:szCs w:val="14"/>
-              </w:rPr>
-              <w:t>N/A</w:t>
+                <w:rFonts w:asciiTheme="majorBidi" w:hAnsiTheme="majorBidi" w:cstheme="majorBidi"/>
+                <w:sz w:val="14"/>
+                <w:szCs w:val="14"/>
+              </w:rPr>
+            </w:pPr>
+            <w:r>
+              <w:rPr>
+                <w:rFonts w:asciiTheme="majorBidi" w:eastAsia="Arial" w:hAnsiTheme="majorBidi" w:cstheme="majorBidi"/>
+                <w:sz w:val="14"/>
+                <w:szCs w:val="14"/>
+              </w:rPr>
+              <w:t>0.03 ± 0.00</w:t>
             </w:r>
           </w:p>
         </w:tc>
@@ -8701,17 +8747,18 @@
             <w:pPr>
               <w:jc w:val="center"/>
               <w:rPr>
-                <w:sz w:val="14"/>
-                <w:szCs w:val="14"/>
-              </w:rPr>
-            </w:pPr>
-            <w:r>
-              <w:rPr>
-                <w:rFonts w:eastAsia="Arial"/>
-                <w:sz w:val="14"/>
-                <w:szCs w:val="14"/>
-              </w:rPr>
-              <w:t>N/A</w:t>
+                <w:rFonts w:asciiTheme="majorBidi" w:hAnsiTheme="majorBidi" w:cstheme="majorBidi"/>
+                <w:sz w:val="14"/>
+                <w:szCs w:val="14"/>
+              </w:rPr>
+            </w:pPr>
+            <w:r>
+              <w:rPr>
+                <w:rFonts w:asciiTheme="majorBidi" w:eastAsia="Arial" w:hAnsiTheme="majorBidi" w:cstheme="majorBidi"/>
+                <w:sz w:val="14"/>
+                <w:szCs w:val="14"/>
+              </w:rPr>
+              <w:t>116.08 ± 1.76</w:t>
             </w:r>
           </w:p>
         </w:tc>
@@ -8731,17 +8778,18 @@
             <w:pPr>
               <w:jc w:val="center"/>
               <w:rPr>
-                <w:sz w:val="14"/>
-                <w:szCs w:val="14"/>
-              </w:rPr>
-            </w:pPr>
-            <w:r>
-              <w:rPr>
-                <w:rFonts w:eastAsia="Arial"/>
-                <w:sz w:val="14"/>
-                <w:szCs w:val="14"/>
-              </w:rPr>
-              <w:t>N/A</w:t>
+                <w:rFonts w:asciiTheme="majorBidi" w:hAnsiTheme="majorBidi" w:cstheme="majorBidi"/>
+                <w:sz w:val="14"/>
+                <w:szCs w:val="14"/>
+              </w:rPr>
+            </w:pPr>
+            <w:r>
+              <w:rPr>
+                <w:rFonts w:asciiTheme="majorBidi" w:eastAsia="Arial" w:hAnsiTheme="majorBidi" w:cstheme="majorBidi"/>
+                <w:sz w:val="14"/>
+                <w:szCs w:val="14"/>
+              </w:rPr>
+              <w:t>1.31 ± 0.02</w:t>
             </w:r>
           </w:p>
         </w:tc>
@@ -8761,17 +8809,18 @@
             <w:pPr>
               <w:jc w:val="center"/>
               <w:rPr>
-                <w:sz w:val="14"/>
-                <w:szCs w:val="14"/>
-              </w:rPr>
-            </w:pPr>
-            <w:r>
-              <w:rPr>
-                <w:rFonts w:eastAsia="Arial"/>
-                <w:sz w:val="14"/>
-                <w:szCs w:val="14"/>
-              </w:rPr>
-              <w:t>N/A</w:t>
+                <w:rFonts w:asciiTheme="majorBidi" w:hAnsiTheme="majorBidi" w:cstheme="majorBidi"/>
+                <w:sz w:val="14"/>
+                <w:szCs w:val="14"/>
+              </w:rPr>
+            </w:pPr>
+            <w:r>
+              <w:rPr>
+                <w:rFonts w:asciiTheme="majorBidi" w:eastAsia="Arial" w:hAnsiTheme="majorBidi" w:cstheme="majorBidi"/>
+                <w:sz w:val="14"/>
+                <w:szCs w:val="14"/>
+              </w:rPr>
+              <w:t>1.31 ± 0.02</w:t>
             </w:r>
           </w:p>
         </w:tc>
@@ -8785,18 +8834,18 @@
             <w:pPr>
               <w:jc w:val="center"/>
               <w:rPr>
-                <w:rFonts w:eastAsia="Arial"/>
-                <w:sz w:val="14"/>
-                <w:szCs w:val="14"/>
-              </w:rPr>
-            </w:pPr>
-            <w:r>
-              <w:rPr>
-                <w:rFonts w:eastAsia="Arial"/>
-                <w:sz w:val="14"/>
-                <w:szCs w:val="14"/>
-              </w:rPr>
-              <w:t>N/A</w:t>
+                <w:rFonts w:asciiTheme="majorBidi" w:eastAsia="Arial" w:hAnsiTheme="majorBidi" w:cstheme="majorBidi"/>
+                <w:sz w:val="14"/>
+                <w:szCs w:val="14"/>
+              </w:rPr>
+            </w:pPr>
+            <w:r>
+              <w:rPr>
+                <w:rFonts w:asciiTheme="majorBidi" w:eastAsia="Arial" w:hAnsiTheme="majorBidi" w:cstheme="majorBidi"/>
+                <w:sz w:val="14"/>
+                <w:szCs w:val="14"/>
+              </w:rPr>
+              <w:t>114.45 ± 1.69</w:t>
             </w:r>
           </w:p>
         </w:tc>
@@ -9027,7 +9076,7 @@
         </w:tc>
         <w:tc>
           <w:tcPr>
-            <w:tcW w:w="190" w:type="pct"/>
+            <w:tcW w:w="191" w:type="pct"/>
             <w:shd w:val="clear" w:color="auto" w:fill="FFFFFF" w:themeFill="background1"/>
             <w:vAlign w:val="center"/>
           </w:tcPr>
@@ -9142,7 +9191,7 @@
                 <w:sz w:val="14"/>
                 <w:szCs w:val="14"/>
               </w:rPr>
-              <w:t>N/A</w:t>
+              <w:t>0.03 ± 0.00</w:t>
             </w:r>
           </w:p>
         </w:tc>
@@ -9172,7 +9221,7 @@
                 <w:sz w:val="14"/>
                 <w:szCs w:val="14"/>
               </w:rPr>
-              <w:t>N/A</w:t>
+              <w:t>132.57 ± 0.54</w:t>
             </w:r>
           </w:p>
         </w:tc>
@@ -9202,7 +9251,7 @@
                 <w:sz w:val="14"/>
                 <w:szCs w:val="14"/>
               </w:rPr>
-              <w:t>N/A</w:t>
+              <w:t>1.15 ± 0.01</w:t>
             </w:r>
           </w:p>
         </w:tc>
@@ -9233,7 +9282,7 @@
                 <w:sz w:val="14"/>
                 <w:szCs w:val="14"/>
               </w:rPr>
-              <w:t>N/A</w:t>
+              <w:t>1.15 ± 0.01</w:t>
             </w:r>
           </w:p>
         </w:tc>
@@ -9263,7 +9312,7 @@
                 <w:sz w:val="14"/>
                 <w:szCs w:val="14"/>
               </w:rPr>
-              <w:t>N/A</w:t>
+              <w:t>130.48 ± 0.60</w:t>
             </w:r>
           </w:p>
         </w:tc>
@@ -9283,17 +9332,18 @@
             <w:pPr>
               <w:jc w:val="center"/>
               <w:rPr>
-                <w:sz w:val="14"/>
-                <w:szCs w:val="14"/>
-              </w:rPr>
-            </w:pPr>
-            <w:r>
-              <w:rPr>
-                <w:rFonts w:eastAsia="Arial"/>
-                <w:sz w:val="14"/>
-                <w:szCs w:val="14"/>
-              </w:rPr>
-              <w:t>N/A</w:t>
+                <w:rFonts w:asciiTheme="majorBidi" w:hAnsiTheme="majorBidi" w:cstheme="majorBidi"/>
+                <w:sz w:val="14"/>
+                <w:szCs w:val="14"/>
+              </w:rPr>
+            </w:pPr>
+            <w:r>
+              <w:rPr>
+                <w:rFonts w:asciiTheme="majorBidi" w:eastAsia="Arial" w:hAnsiTheme="majorBidi" w:cstheme="majorBidi"/>
+                <w:sz w:val="14"/>
+                <w:szCs w:val="14"/>
+              </w:rPr>
+              <w:t>0.03 ± 0.00</w:t>
             </w:r>
           </w:p>
         </w:tc>
@@ -9313,17 +9363,18 @@
             <w:pPr>
               <w:jc w:val="center"/>
               <w:rPr>
-                <w:sz w:val="14"/>
-                <w:szCs w:val="14"/>
-              </w:rPr>
-            </w:pPr>
-            <w:r>
-              <w:rPr>
-                <w:rFonts w:eastAsia="Arial"/>
-                <w:sz w:val="14"/>
-                <w:szCs w:val="14"/>
-              </w:rPr>
-              <w:t>N/A</w:t>
+                <w:rFonts w:asciiTheme="majorBidi" w:hAnsiTheme="majorBidi" w:cstheme="majorBidi"/>
+                <w:sz w:val="14"/>
+                <w:szCs w:val="14"/>
+              </w:rPr>
+            </w:pPr>
+            <w:r>
+              <w:rPr>
+                <w:rFonts w:asciiTheme="majorBidi" w:eastAsia="Arial" w:hAnsiTheme="majorBidi" w:cstheme="majorBidi"/>
+                <w:sz w:val="14"/>
+                <w:szCs w:val="14"/>
+              </w:rPr>
+              <w:t>118.15 ± 1.02</w:t>
             </w:r>
           </w:p>
         </w:tc>
@@ -9343,17 +9394,18 @@
             <w:pPr>
               <w:jc w:val="center"/>
               <w:rPr>
-                <w:sz w:val="14"/>
-                <w:szCs w:val="14"/>
-              </w:rPr>
-            </w:pPr>
-            <w:r>
-              <w:rPr>
-                <w:rFonts w:eastAsia="Arial"/>
-                <w:sz w:val="14"/>
-                <w:szCs w:val="14"/>
-              </w:rPr>
-              <w:t>N/A</w:t>
+                <w:rFonts w:asciiTheme="majorBidi" w:hAnsiTheme="majorBidi" w:cstheme="majorBidi"/>
+                <w:sz w:val="14"/>
+                <w:szCs w:val="14"/>
+              </w:rPr>
+            </w:pPr>
+            <w:r>
+              <w:rPr>
+                <w:rFonts w:asciiTheme="majorBidi" w:eastAsia="Arial" w:hAnsiTheme="majorBidi" w:cstheme="majorBidi"/>
+                <w:sz w:val="14"/>
+                <w:szCs w:val="14"/>
+              </w:rPr>
+              <w:t>1.29 ± 0.01</w:t>
             </w:r>
           </w:p>
         </w:tc>
@@ -9373,17 +9425,18 @@
             <w:pPr>
               <w:jc w:val="center"/>
               <w:rPr>
-                <w:sz w:val="14"/>
-                <w:szCs w:val="14"/>
-              </w:rPr>
-            </w:pPr>
-            <w:r>
-              <w:rPr>
-                <w:rFonts w:eastAsia="Arial"/>
-                <w:sz w:val="14"/>
-                <w:szCs w:val="14"/>
-              </w:rPr>
-              <w:t>N/A</w:t>
+                <w:rFonts w:asciiTheme="majorBidi" w:hAnsiTheme="majorBidi" w:cstheme="majorBidi"/>
+                <w:sz w:val="14"/>
+                <w:szCs w:val="14"/>
+              </w:rPr>
+            </w:pPr>
+            <w:r>
+              <w:rPr>
+                <w:rFonts w:asciiTheme="majorBidi" w:eastAsia="Arial" w:hAnsiTheme="majorBidi" w:cstheme="majorBidi"/>
+                <w:sz w:val="14"/>
+                <w:szCs w:val="14"/>
+              </w:rPr>
+              <w:t>1.29 ± 0.01</w:t>
             </w:r>
           </w:p>
         </w:tc>
@@ -9397,18 +9450,18 @@
             <w:pPr>
               <w:jc w:val="center"/>
               <w:rPr>
-                <w:rFonts w:eastAsia="Arial"/>
-                <w:sz w:val="14"/>
-                <w:szCs w:val="14"/>
-              </w:rPr>
-            </w:pPr>
-            <w:r>
-              <w:rPr>
-                <w:rFonts w:eastAsia="Arial"/>
-                <w:sz w:val="14"/>
-                <w:szCs w:val="14"/>
-              </w:rPr>
-              <w:t>N/A</w:t>
+                <w:rFonts w:asciiTheme="majorBidi" w:eastAsia="Arial" w:hAnsiTheme="majorBidi" w:cstheme="majorBidi"/>
+                <w:sz w:val="14"/>
+                <w:szCs w:val="14"/>
+              </w:rPr>
+            </w:pPr>
+            <w:r>
+              <w:rPr>
+                <w:rFonts w:asciiTheme="majorBidi" w:eastAsia="Arial" w:hAnsiTheme="majorBidi" w:cstheme="majorBidi"/>
+                <w:sz w:val="14"/>
+                <w:szCs w:val="14"/>
+              </w:rPr>
+              <w:t>116.45 ± 1.00</w:t>
             </w:r>
           </w:p>
         </w:tc>
@@ -9639,7 +9692,7 @@
         </w:tc>
         <w:tc>
           <w:tcPr>
-            <w:tcW w:w="190" w:type="pct"/>
+            <w:tcW w:w="191" w:type="pct"/>
             <w:shd w:val="clear" w:color="auto" w:fill="FFFFFF" w:themeFill="background1"/>
             <w:vAlign w:val="center"/>
           </w:tcPr>
@@ -9746,7 +9799,7 @@
                 <w:sz w:val="14"/>
                 <w:szCs w:val="14"/>
               </w:rPr>
-              <w:t>N/A</w:t>
+              <w:t>0.02 ± 0.00</w:t>
             </w:r>
           </w:p>
         </w:tc>
@@ -9776,7 +9829,7 @@
                 <w:sz w:val="14"/>
                 <w:szCs w:val="14"/>
               </w:rPr>
-              <w:t>N/A</w:t>
+              <w:t>142.56 ± 1.70</w:t>
             </w:r>
           </w:p>
         </w:tc>
@@ -9806,7 +9859,7 @@
                 <w:sz w:val="14"/>
                 <w:szCs w:val="14"/>
               </w:rPr>
-              <w:t>N/A</w:t>
+              <w:t>1.07 ± 0.01</w:t>
             </w:r>
           </w:p>
         </w:tc>
@@ -9837,7 +9890,7 @@
                 <w:sz w:val="14"/>
                 <w:szCs w:val="14"/>
               </w:rPr>
-              <w:t>N/A</w:t>
+              <w:t>1.07 ± 0.01</w:t>
             </w:r>
           </w:p>
         </w:tc>
@@ -9867,7 +9920,7 @@
                 <w:sz w:val="14"/>
                 <w:szCs w:val="14"/>
               </w:rPr>
-              <w:t>N/A</w:t>
+              <w:t>140.53 ± 1.62</w:t>
             </w:r>
           </w:p>
         </w:tc>
@@ -9887,17 +9940,18 @@
             <w:pPr>
               <w:jc w:val="center"/>
               <w:rPr>
-                <w:sz w:val="14"/>
-                <w:szCs w:val="14"/>
-              </w:rPr>
-            </w:pPr>
-            <w:r>
-              <w:rPr>
-                <w:rFonts w:eastAsia="Arial"/>
-                <w:sz w:val="14"/>
-                <w:szCs w:val="14"/>
-              </w:rPr>
-              <w:t>N/A</w:t>
+                <w:rFonts w:asciiTheme="majorBidi" w:hAnsiTheme="majorBidi" w:cstheme="majorBidi"/>
+                <w:sz w:val="14"/>
+                <w:szCs w:val="14"/>
+              </w:rPr>
+            </w:pPr>
+            <w:r>
+              <w:rPr>
+                <w:rFonts w:asciiTheme="majorBidi" w:eastAsia="Arial" w:hAnsiTheme="majorBidi" w:cstheme="majorBidi"/>
+                <w:sz w:val="14"/>
+                <w:szCs w:val="14"/>
+              </w:rPr>
+              <w:t>0.03 ± 0.00</w:t>
             </w:r>
           </w:p>
         </w:tc>
@@ -9917,17 +9971,18 @@
             <w:pPr>
               <w:jc w:val="center"/>
               <w:rPr>
-                <w:sz w:val="14"/>
-                <w:szCs w:val="14"/>
-              </w:rPr>
-            </w:pPr>
-            <w:r>
-              <w:rPr>
-                <w:rFonts w:eastAsia="Arial"/>
-                <w:sz w:val="14"/>
-                <w:szCs w:val="14"/>
-              </w:rPr>
-              <w:t>N/A</w:t>
+                <w:rFonts w:asciiTheme="majorBidi" w:hAnsiTheme="majorBidi" w:cstheme="majorBidi"/>
+                <w:sz w:val="14"/>
+                <w:szCs w:val="14"/>
+              </w:rPr>
+            </w:pPr>
+            <w:r>
+              <w:rPr>
+                <w:rFonts w:asciiTheme="majorBidi" w:eastAsia="Arial" w:hAnsiTheme="majorBidi" w:cstheme="majorBidi"/>
+                <w:sz w:val="14"/>
+                <w:szCs w:val="14"/>
+              </w:rPr>
+              <w:t>103.52 ± 1.89</w:t>
             </w:r>
           </w:p>
         </w:tc>
@@ -9947,17 +10002,18 @@
             <w:pPr>
               <w:jc w:val="center"/>
               <w:rPr>
-                <w:sz w:val="14"/>
-                <w:szCs w:val="14"/>
-              </w:rPr>
-            </w:pPr>
-            <w:r>
-              <w:rPr>
-                <w:rFonts w:eastAsia="Arial"/>
-                <w:sz w:val="14"/>
-                <w:szCs w:val="14"/>
-              </w:rPr>
-              <w:t>N/A</w:t>
+                <w:rFonts w:asciiTheme="majorBidi" w:hAnsiTheme="majorBidi" w:cstheme="majorBidi"/>
+                <w:sz w:val="14"/>
+                <w:szCs w:val="14"/>
+              </w:rPr>
+            </w:pPr>
+            <w:r>
+              <w:rPr>
+                <w:rFonts w:asciiTheme="majorBidi" w:eastAsia="Arial" w:hAnsiTheme="majorBidi" w:cstheme="majorBidi"/>
+                <w:sz w:val="14"/>
+                <w:szCs w:val="14"/>
+              </w:rPr>
+              <w:t>1.47 ± 0.03</w:t>
             </w:r>
           </w:p>
         </w:tc>
@@ -9977,17 +10033,18 @@
             <w:pPr>
               <w:jc w:val="center"/>
               <w:rPr>
-                <w:sz w:val="14"/>
-                <w:szCs w:val="14"/>
-              </w:rPr>
-            </w:pPr>
-            <w:r>
-              <w:rPr>
-                <w:rFonts w:eastAsia="Arial"/>
-                <w:sz w:val="14"/>
-                <w:szCs w:val="14"/>
-              </w:rPr>
-              <w:t>N/A</w:t>
+                <w:rFonts w:asciiTheme="majorBidi" w:hAnsiTheme="majorBidi" w:cstheme="majorBidi"/>
+                <w:sz w:val="14"/>
+                <w:szCs w:val="14"/>
+              </w:rPr>
+            </w:pPr>
+            <w:r>
+              <w:rPr>
+                <w:rFonts w:asciiTheme="majorBidi" w:eastAsia="Arial" w:hAnsiTheme="majorBidi" w:cstheme="majorBidi"/>
+                <w:sz w:val="14"/>
+                <w:szCs w:val="14"/>
+              </w:rPr>
+              <w:t>1.47 ± 0.03</w:t>
             </w:r>
           </w:p>
         </w:tc>
@@ -10001,18 +10058,18 @@
             <w:pPr>
               <w:jc w:val="center"/>
               <w:rPr>
-                <w:rFonts w:eastAsia="Arial"/>
-                <w:sz w:val="14"/>
-                <w:szCs w:val="14"/>
-              </w:rPr>
-            </w:pPr>
-            <w:r>
-              <w:rPr>
-                <w:rFonts w:eastAsia="Arial"/>
-                <w:sz w:val="14"/>
-                <w:szCs w:val="14"/>
-              </w:rPr>
-              <w:t>N/A</w:t>
+                <w:rFonts w:asciiTheme="majorBidi" w:eastAsia="Arial" w:hAnsiTheme="majorBidi" w:cstheme="majorBidi"/>
+                <w:sz w:val="14"/>
+                <w:szCs w:val="14"/>
+              </w:rPr>
+            </w:pPr>
+            <w:r>
+              <w:rPr>
+                <w:rFonts w:asciiTheme="majorBidi" w:eastAsia="Arial" w:hAnsiTheme="majorBidi" w:cstheme="majorBidi"/>
+                <w:sz w:val="14"/>
+                <w:szCs w:val="14"/>
+              </w:rPr>
+              <w:t>102.03 ± 1.76</w:t>
             </w:r>
           </w:p>
         </w:tc>
@@ -10243,7 +10300,7 @@
         </w:tc>
         <w:tc>
           <w:tcPr>
-            <w:tcW w:w="190" w:type="pct"/>
+            <w:tcW w:w="191" w:type="pct"/>
             <w:shd w:val="clear" w:color="auto" w:fill="FFFFFF" w:themeFill="background1"/>
             <w:vAlign w:val="center"/>
           </w:tcPr>
@@ -10350,7 +10407,7 @@
                 <w:sz w:val="14"/>
                 <w:szCs w:val="14"/>
               </w:rPr>
-              <w:t>N/A</w:t>
+              <w:t>0.02 ± 0.00</w:t>
             </w:r>
           </w:p>
         </w:tc>
@@ -10380,7 +10437,7 @@
                 <w:sz w:val="14"/>
                 <w:szCs w:val="14"/>
               </w:rPr>
-              <w:t>N/A</w:t>
+              <w:t>146.07 ± 1.06</w:t>
             </w:r>
           </w:p>
         </w:tc>
@@ -10410,7 +10467,7 @@
                 <w:sz w:val="14"/>
                 <w:szCs w:val="14"/>
               </w:rPr>
-              <w:t>N/A</w:t>
+              <w:t>1.04 ± 0.01</w:t>
             </w:r>
           </w:p>
         </w:tc>
@@ -10441,7 +10498,7 @@
                 <w:sz w:val="14"/>
                 <w:szCs w:val="14"/>
               </w:rPr>
-              <w:t>N/A</w:t>
+              <w:t>1.04 ± 0.01</w:t>
             </w:r>
           </w:p>
         </w:tc>
@@ -10471,7 +10528,7 @@
                 <w:sz w:val="14"/>
                 <w:szCs w:val="14"/>
               </w:rPr>
-              <w:t>N/A</w:t>
+              <w:t>143.87 ± 1.10</w:t>
             </w:r>
           </w:p>
         </w:tc>
@@ -10491,17 +10548,18 @@
             <w:pPr>
               <w:jc w:val="center"/>
               <w:rPr>
-                <w:sz w:val="14"/>
-                <w:szCs w:val="14"/>
-              </w:rPr>
-            </w:pPr>
-            <w:r>
-              <w:rPr>
-                <w:rFonts w:eastAsia="Arial"/>
-                <w:sz w:val="14"/>
-                <w:szCs w:val="14"/>
-              </w:rPr>
-              <w:t>N/A</w:t>
+                <w:rFonts w:asciiTheme="majorBidi" w:hAnsiTheme="majorBidi" w:cstheme="majorBidi"/>
+                <w:sz w:val="14"/>
+                <w:szCs w:val="14"/>
+              </w:rPr>
+            </w:pPr>
+            <w:r>
+              <w:rPr>
+                <w:rFonts w:asciiTheme="majorBidi" w:eastAsia="Arial" w:hAnsiTheme="majorBidi" w:cstheme="majorBidi"/>
+                <w:sz w:val="14"/>
+                <w:szCs w:val="14"/>
+              </w:rPr>
+              <w:t>0.03 ± 0.00</w:t>
             </w:r>
           </w:p>
         </w:tc>
@@ -10521,17 +10579,18 @@
             <w:pPr>
               <w:jc w:val="center"/>
               <w:rPr>
-                <w:sz w:val="14"/>
-                <w:szCs w:val="14"/>
-              </w:rPr>
-            </w:pPr>
-            <w:r>
-              <w:rPr>
-                <w:rFonts w:eastAsia="Arial"/>
-                <w:sz w:val="14"/>
-                <w:szCs w:val="14"/>
-              </w:rPr>
-              <w:t>N/A</w:t>
+                <w:rFonts w:asciiTheme="majorBidi" w:hAnsiTheme="majorBidi" w:cstheme="majorBidi"/>
+                <w:sz w:val="14"/>
+                <w:szCs w:val="14"/>
+              </w:rPr>
+            </w:pPr>
+            <w:r>
+              <w:rPr>
+                <w:rFonts w:asciiTheme="majorBidi" w:eastAsia="Arial" w:hAnsiTheme="majorBidi" w:cstheme="majorBidi"/>
+                <w:sz w:val="14"/>
+                <w:szCs w:val="14"/>
+              </w:rPr>
+              <w:t>119.25 ± 0.92</w:t>
             </w:r>
           </w:p>
         </w:tc>
@@ -10551,17 +10610,18 @@
             <w:pPr>
               <w:jc w:val="center"/>
               <w:rPr>
-                <w:sz w:val="14"/>
-                <w:szCs w:val="14"/>
-              </w:rPr>
-            </w:pPr>
-            <w:r>
-              <w:rPr>
-                <w:rFonts w:eastAsia="Arial"/>
-                <w:sz w:val="14"/>
-                <w:szCs w:val="14"/>
-              </w:rPr>
-              <w:t>N/A</w:t>
+                <w:rFonts w:asciiTheme="majorBidi" w:hAnsiTheme="majorBidi" w:cstheme="majorBidi"/>
+                <w:sz w:val="14"/>
+                <w:szCs w:val="14"/>
+              </w:rPr>
+            </w:pPr>
+            <w:r>
+              <w:rPr>
+                <w:rFonts w:asciiTheme="majorBidi" w:eastAsia="Arial" w:hAnsiTheme="majorBidi" w:cstheme="majorBidi"/>
+                <w:sz w:val="14"/>
+                <w:szCs w:val="14"/>
+              </w:rPr>
+              <w:t>1.28 ± 0.01</w:t>
             </w:r>
           </w:p>
         </w:tc>
@@ -10581,17 +10641,18 @@
             <w:pPr>
               <w:jc w:val="center"/>
               <w:rPr>
-                <w:sz w:val="14"/>
-                <w:szCs w:val="14"/>
-              </w:rPr>
-            </w:pPr>
-            <w:r>
-              <w:rPr>
-                <w:rFonts w:eastAsia="Arial"/>
-                <w:sz w:val="14"/>
-                <w:szCs w:val="14"/>
-              </w:rPr>
-              <w:t>N/A</w:t>
+                <w:rFonts w:asciiTheme="majorBidi" w:hAnsiTheme="majorBidi" w:cstheme="majorBidi"/>
+                <w:sz w:val="14"/>
+                <w:szCs w:val="14"/>
+              </w:rPr>
+            </w:pPr>
+            <w:r>
+              <w:rPr>
+                <w:rFonts w:asciiTheme="majorBidi" w:eastAsia="Arial" w:hAnsiTheme="majorBidi" w:cstheme="majorBidi"/>
+                <w:sz w:val="14"/>
+                <w:szCs w:val="14"/>
+              </w:rPr>
+              <w:t>1.28 ± 0.01</w:t>
             </w:r>
           </w:p>
         </w:tc>
@@ -10605,18 +10666,18 @@
             <w:pPr>
               <w:jc w:val="center"/>
               <w:rPr>
-                <w:rFonts w:eastAsia="Arial"/>
-                <w:sz w:val="14"/>
-                <w:szCs w:val="14"/>
-              </w:rPr>
-            </w:pPr>
-            <w:r>
-              <w:rPr>
-                <w:rFonts w:eastAsia="Arial"/>
-                <w:sz w:val="14"/>
-                <w:szCs w:val="14"/>
-              </w:rPr>
-              <w:t>N/A</w:t>
+                <w:rFonts w:asciiTheme="majorBidi" w:eastAsia="Arial" w:hAnsiTheme="majorBidi" w:cstheme="majorBidi"/>
+                <w:sz w:val="14"/>
+                <w:szCs w:val="14"/>
+              </w:rPr>
+            </w:pPr>
+            <w:r>
+              <w:rPr>
+                <w:rFonts w:asciiTheme="majorBidi" w:eastAsia="Arial" w:hAnsiTheme="majorBidi" w:cstheme="majorBidi"/>
+                <w:sz w:val="14"/>
+                <w:szCs w:val="14"/>
+              </w:rPr>
+              <w:t>117.37 ± 0.88</w:t>
             </w:r>
           </w:p>
         </w:tc>
@@ -10847,7 +10908,7 @@
         </w:tc>
         <w:tc>
           <w:tcPr>
-            <w:tcW w:w="190" w:type="pct"/>
+            <w:tcW w:w="191" w:type="pct"/>
             <w:shd w:val="clear" w:color="auto" w:fill="FFFFFF" w:themeFill="background1"/>
             <w:vAlign w:val="center"/>
           </w:tcPr>
@@ -10972,7 +11033,7 @@
                 <w:sz w:val="14"/>
                 <w:szCs w:val="14"/>
               </w:rPr>
-              <w:t>N/A</w:t>
+              <w:t>0.03 ± 0.00</w:t>
             </w:r>
           </w:p>
         </w:tc>
@@ -11002,7 +11063,7 @@
                 <w:sz w:val="14"/>
                 <w:szCs w:val="14"/>
               </w:rPr>
-              <w:t>N/A</w:t>
+              <w:t>140.78 ± 1.28</w:t>
             </w:r>
           </w:p>
         </w:tc>
@@ -11032,7 +11093,7 @@
                 <w:sz w:val="14"/>
                 <w:szCs w:val="14"/>
               </w:rPr>
-              <w:t>N/A</w:t>
+              <w:t>1.08 ± 0.01</w:t>
             </w:r>
           </w:p>
         </w:tc>
@@ -11063,7 +11124,7 @@
                 <w:sz w:val="14"/>
                 <w:szCs w:val="14"/>
               </w:rPr>
-              <w:t>N/A</w:t>
+              <w:t>1.08 ± 0.01</w:t>
             </w:r>
           </w:p>
         </w:tc>
@@ -11093,7 +11154,7 @@
                 <w:sz w:val="14"/>
                 <w:szCs w:val="14"/>
               </w:rPr>
-              <w:t>N/A</w:t>
+              <w:t>138.36 ± 1.37</w:t>
             </w:r>
           </w:p>
         </w:tc>
@@ -11113,17 +11174,18 @@
             <w:pPr>
               <w:jc w:val="center"/>
               <w:rPr>
-                <w:sz w:val="14"/>
-                <w:szCs w:val="14"/>
-              </w:rPr>
-            </w:pPr>
-            <w:r>
-              <w:rPr>
-                <w:rFonts w:eastAsia="Arial"/>
-                <w:sz w:val="14"/>
-                <w:szCs w:val="14"/>
-              </w:rPr>
-              <w:t>N/A</w:t>
+                <w:rFonts w:asciiTheme="majorBidi" w:hAnsiTheme="majorBidi" w:cstheme="majorBidi"/>
+                <w:sz w:val="14"/>
+                <w:szCs w:val="14"/>
+              </w:rPr>
+            </w:pPr>
+            <w:r>
+              <w:rPr>
+                <w:rFonts w:asciiTheme="majorBidi" w:eastAsia="Arial" w:hAnsiTheme="majorBidi" w:cstheme="majorBidi"/>
+                <w:sz w:val="14"/>
+                <w:szCs w:val="14"/>
+              </w:rPr>
+              <w:t>0.03 ± 0.00</w:t>
             </w:r>
           </w:p>
         </w:tc>
@@ -11143,17 +11205,18 @@
             <w:pPr>
               <w:jc w:val="center"/>
               <w:rPr>
-                <w:sz w:val="14"/>
-                <w:szCs w:val="14"/>
-              </w:rPr>
-            </w:pPr>
-            <w:r>
-              <w:rPr>
-                <w:rFonts w:eastAsia="Arial"/>
-                <w:sz w:val="14"/>
-                <w:szCs w:val="14"/>
-              </w:rPr>
-              <w:t>N/A</w:t>
+                <w:rFonts w:asciiTheme="majorBidi" w:hAnsiTheme="majorBidi" w:cstheme="majorBidi"/>
+                <w:sz w:val="14"/>
+                <w:szCs w:val="14"/>
+              </w:rPr>
+            </w:pPr>
+            <w:r>
+              <w:rPr>
+                <w:rFonts w:asciiTheme="majorBidi" w:eastAsia="Arial" w:hAnsiTheme="majorBidi" w:cstheme="majorBidi"/>
+                <w:sz w:val="14"/>
+                <w:szCs w:val="14"/>
+              </w:rPr>
+              <w:t>107.61 ± 0.75</w:t>
             </w:r>
           </w:p>
         </w:tc>
@@ -11173,17 +11236,18 @@
             <w:pPr>
               <w:jc w:val="center"/>
               <w:rPr>
-                <w:sz w:val="14"/>
-                <w:szCs w:val="14"/>
-              </w:rPr>
-            </w:pPr>
-            <w:r>
-              <w:rPr>
-                <w:rFonts w:eastAsia="Arial"/>
-                <w:sz w:val="14"/>
-                <w:szCs w:val="14"/>
-              </w:rPr>
-              <w:t>N/A</w:t>
+                <w:rFonts w:asciiTheme="majorBidi" w:hAnsiTheme="majorBidi" w:cstheme="majorBidi"/>
+                <w:sz w:val="14"/>
+                <w:szCs w:val="14"/>
+              </w:rPr>
+            </w:pPr>
+            <w:r>
+              <w:rPr>
+                <w:rFonts w:asciiTheme="majorBidi" w:eastAsia="Arial" w:hAnsiTheme="majorBidi" w:cstheme="majorBidi"/>
+                <w:sz w:val="14"/>
+                <w:szCs w:val="14"/>
+              </w:rPr>
+              <w:t>1.42 ± 0.01</w:t>
             </w:r>
           </w:p>
         </w:tc>
@@ -11203,17 +11267,18 @@
             <w:pPr>
               <w:jc w:val="center"/>
               <w:rPr>
-                <w:sz w:val="14"/>
-                <w:szCs w:val="14"/>
-              </w:rPr>
-            </w:pPr>
-            <w:r>
-              <w:rPr>
-                <w:rFonts w:eastAsia="Arial"/>
-                <w:sz w:val="14"/>
-                <w:szCs w:val="14"/>
-              </w:rPr>
-              <w:t>N/A</w:t>
+                <w:rFonts w:asciiTheme="majorBidi" w:hAnsiTheme="majorBidi" w:cstheme="majorBidi"/>
+                <w:sz w:val="14"/>
+                <w:szCs w:val="14"/>
+              </w:rPr>
+            </w:pPr>
+            <w:r>
+              <w:rPr>
+                <w:rFonts w:asciiTheme="majorBidi" w:eastAsia="Arial" w:hAnsiTheme="majorBidi" w:cstheme="majorBidi"/>
+                <w:sz w:val="14"/>
+                <w:szCs w:val="14"/>
+              </w:rPr>
+              <w:t>1.42 ± 0.01</w:t>
             </w:r>
           </w:p>
         </w:tc>
@@ -11227,18 +11292,18 @@
             <w:pPr>
               <w:jc w:val="center"/>
               <w:rPr>
-                <w:rFonts w:eastAsia="Arial"/>
-                <w:sz w:val="14"/>
-                <w:szCs w:val="14"/>
-              </w:rPr>
-            </w:pPr>
-            <w:r>
-              <w:rPr>
-                <w:rFonts w:eastAsia="Arial"/>
-                <w:sz w:val="14"/>
-                <w:szCs w:val="14"/>
-              </w:rPr>
-              <w:t>N/A</w:t>
+                <w:rFonts w:asciiTheme="majorBidi" w:eastAsia="Arial" w:hAnsiTheme="majorBidi" w:cstheme="majorBidi"/>
+                <w:sz w:val="14"/>
+                <w:szCs w:val="14"/>
+              </w:rPr>
+            </w:pPr>
+            <w:r>
+              <w:rPr>
+                <w:rFonts w:asciiTheme="majorBidi" w:eastAsia="Arial" w:hAnsiTheme="majorBidi" w:cstheme="majorBidi"/>
+                <w:sz w:val="14"/>
+                <w:szCs w:val="14"/>
+              </w:rPr>
+              <w:t>105.82 ± 0.73</w:t>
             </w:r>
           </w:p>
         </w:tc>
@@ -11469,7 +11534,7 @@
         </w:tc>
         <w:tc>
           <w:tcPr>
-            <w:tcW w:w="190" w:type="pct"/>
+            <w:tcW w:w="191" w:type="pct"/>
             <w:shd w:val="clear" w:color="auto" w:fill="FFFFFF" w:themeFill="background1"/>
             <w:vAlign w:val="center"/>
           </w:tcPr>
@@ -11576,7 +11641,7 @@
                 <w:sz w:val="14"/>
                 <w:szCs w:val="14"/>
               </w:rPr>
-              <w:t>N/A</w:t>
+              <w:t>0.03 ± 0.00</w:t>
             </w:r>
           </w:p>
         </w:tc>
@@ -11606,7 +11671,7 @@
                 <w:sz w:val="14"/>
                 <w:szCs w:val="14"/>
               </w:rPr>
-              <w:t>N/A</w:t>
+              <w:t>133.51 ± 0.74</w:t>
             </w:r>
           </w:p>
         </w:tc>
@@ -11637,8 +11702,9 @@
                 <w:rFonts w:eastAsia="Arial"/>
                 <w:sz w:val="14"/>
                 <w:szCs w:val="14"/>
-              </w:rPr>
-              <w:t>N/A</w:t>
+                <w:lang w:bidi="ar-EG"/>
+              </w:rPr>
+              <w:t>1.14 ± 0.01</w:t>
             </w:r>
           </w:p>
         </w:tc>
@@ -11669,7 +11735,7 @@
                 <w:sz w:val="14"/>
                 <w:szCs w:val="14"/>
               </w:rPr>
-              <w:t>N/A</w:t>
+              <w:t>1.14 ± 0.01</w:t>
             </w:r>
           </w:p>
         </w:tc>
@@ -11699,7 +11765,7 @@
                 <w:sz w:val="14"/>
                 <w:szCs w:val="14"/>
               </w:rPr>
-              <w:t>N/A</w:t>
+              <w:t>131.22 ± 0.66</w:t>
             </w:r>
           </w:p>
         </w:tc>
@@ -11719,17 +11785,18 @@
             <w:pPr>
               <w:jc w:val="center"/>
               <w:rPr>
-                <w:sz w:val="14"/>
-                <w:szCs w:val="14"/>
-              </w:rPr>
-            </w:pPr>
-            <w:r>
-              <w:rPr>
-                <w:rFonts w:eastAsia="Arial"/>
-                <w:sz w:val="14"/>
-                <w:szCs w:val="14"/>
-              </w:rPr>
-              <w:t>N/A</w:t>
+                <w:rFonts w:asciiTheme="majorBidi" w:hAnsiTheme="majorBidi" w:cstheme="majorBidi"/>
+                <w:sz w:val="14"/>
+                <w:szCs w:val="14"/>
+              </w:rPr>
+            </w:pPr>
+            <w:r>
+              <w:rPr>
+                <w:rFonts w:asciiTheme="majorBidi" w:eastAsia="Arial" w:hAnsiTheme="majorBidi" w:cstheme="majorBidi"/>
+                <w:sz w:val="14"/>
+                <w:szCs w:val="14"/>
+              </w:rPr>
+              <w:t>0.03 ± 0.00</w:t>
             </w:r>
           </w:p>
         </w:tc>
@@ -11749,17 +11816,18 @@
             <w:pPr>
               <w:jc w:val="center"/>
               <w:rPr>
-                <w:sz w:val="14"/>
-                <w:szCs w:val="14"/>
-              </w:rPr>
-            </w:pPr>
-            <w:r>
-              <w:rPr>
-                <w:rFonts w:eastAsia="Arial"/>
-                <w:sz w:val="14"/>
-                <w:szCs w:val="14"/>
-              </w:rPr>
-              <w:t>N/A</w:t>
+                <w:rFonts w:asciiTheme="majorBidi" w:hAnsiTheme="majorBidi" w:cstheme="majorBidi"/>
+                <w:sz w:val="14"/>
+                <w:szCs w:val="14"/>
+              </w:rPr>
+            </w:pPr>
+            <w:r>
+              <w:rPr>
+                <w:rFonts w:asciiTheme="majorBidi" w:eastAsia="Arial" w:hAnsiTheme="majorBidi" w:cstheme="majorBidi"/>
+                <w:sz w:val="14"/>
+                <w:szCs w:val="14"/>
+              </w:rPr>
+              <w:t>117.53 ± 1.07</w:t>
             </w:r>
           </w:p>
         </w:tc>
@@ -11779,17 +11847,18 @@
             <w:pPr>
               <w:jc w:val="center"/>
               <w:rPr>
-                <w:sz w:val="14"/>
-                <w:szCs w:val="14"/>
-              </w:rPr>
-            </w:pPr>
-            <w:r>
-              <w:rPr>
-                <w:rFonts w:eastAsia="Arial"/>
-                <w:sz w:val="14"/>
-                <w:szCs w:val="14"/>
-              </w:rPr>
-              <w:t>N/A</w:t>
+                <w:rFonts w:asciiTheme="majorBidi" w:hAnsiTheme="majorBidi" w:cstheme="majorBidi"/>
+                <w:sz w:val="14"/>
+                <w:szCs w:val="14"/>
+              </w:rPr>
+            </w:pPr>
+            <w:r>
+              <w:rPr>
+                <w:rFonts w:asciiTheme="majorBidi" w:eastAsia="Arial" w:hAnsiTheme="majorBidi" w:cstheme="majorBidi"/>
+                <w:sz w:val="14"/>
+                <w:szCs w:val="14"/>
+              </w:rPr>
+              <w:t>1.30 ± 0.01</w:t>
             </w:r>
           </w:p>
         </w:tc>
@@ -11809,17 +11878,18 @@
             <w:pPr>
               <w:jc w:val="center"/>
               <w:rPr>
-                <w:sz w:val="14"/>
-                <w:szCs w:val="14"/>
-              </w:rPr>
-            </w:pPr>
-            <w:r>
-              <w:rPr>
-                <w:rFonts w:eastAsia="Arial"/>
-                <w:sz w:val="14"/>
-                <w:szCs w:val="14"/>
-              </w:rPr>
-              <w:t>N/A</w:t>
+                <w:rFonts w:asciiTheme="majorBidi" w:hAnsiTheme="majorBidi" w:cstheme="majorBidi"/>
+                <w:sz w:val="14"/>
+                <w:szCs w:val="14"/>
+              </w:rPr>
+            </w:pPr>
+            <w:r>
+              <w:rPr>
+                <w:rFonts w:asciiTheme="majorBidi" w:eastAsia="Arial" w:hAnsiTheme="majorBidi" w:cstheme="majorBidi"/>
+                <w:sz w:val="14"/>
+                <w:szCs w:val="14"/>
+              </w:rPr>
+              <w:t>1.30 ± 0.01</w:t>
             </w:r>
           </w:p>
         </w:tc>
@@ -11833,18 +11903,18 @@
             <w:pPr>
               <w:jc w:val="center"/>
               <w:rPr>
-                <w:rFonts w:eastAsia="Arial"/>
-                <w:sz w:val="14"/>
-                <w:szCs w:val="14"/>
-              </w:rPr>
-            </w:pPr>
-            <w:r>
-              <w:rPr>
-                <w:rFonts w:eastAsia="Arial"/>
-                <w:sz w:val="14"/>
-                <w:szCs w:val="14"/>
-              </w:rPr>
-              <w:t>N/A</w:t>
+                <w:rFonts w:asciiTheme="majorBidi" w:eastAsia="Arial" w:hAnsiTheme="majorBidi" w:cstheme="majorBidi"/>
+                <w:sz w:val="14"/>
+                <w:szCs w:val="14"/>
+              </w:rPr>
+            </w:pPr>
+            <w:r>
+              <w:rPr>
+                <w:rFonts w:asciiTheme="majorBidi" w:eastAsia="Arial" w:hAnsiTheme="majorBidi" w:cstheme="majorBidi"/>
+                <w:sz w:val="14"/>
+                <w:szCs w:val="14"/>
+              </w:rPr>
+              <w:t>115.48 ± 1.01</w:t>
             </w:r>
           </w:p>
         </w:tc>
@@ -12075,7 +12145,7 @@
         </w:tc>
         <w:tc>
           <w:tcPr>
-            <w:tcW w:w="190" w:type="pct"/>
+            <w:tcW w:w="191" w:type="pct"/>
             <w:shd w:val="clear" w:color="auto" w:fill="FFFFFF" w:themeFill="background1"/>
             <w:vAlign w:val="center"/>
           </w:tcPr>
@@ -12182,7 +12252,7 @@
                 <w:sz w:val="14"/>
                 <w:szCs w:val="14"/>
               </w:rPr>
-              <w:t>N/A</w:t>
+              <w:t>0.03 ± 0.00</w:t>
             </w:r>
           </w:p>
         </w:tc>
@@ -12212,7 +12282,7 @@
                 <w:sz w:val="14"/>
                 <w:szCs w:val="14"/>
               </w:rPr>
-              <w:t>N/A</w:t>
+              <w:t>133.00 ± 0.88</w:t>
             </w:r>
           </w:p>
         </w:tc>
@@ -12242,7 +12312,7 @@
                 <w:sz w:val="14"/>
                 <w:szCs w:val="14"/>
               </w:rPr>
-              <w:t>N/A</w:t>
+              <w:t>1.15 ± 0.01</w:t>
             </w:r>
           </w:p>
         </w:tc>
@@ -12273,7 +12343,7 @@
                 <w:sz w:val="14"/>
                 <w:szCs w:val="14"/>
               </w:rPr>
-              <w:t>N/A</w:t>
+              <w:t>1.15 ± 0.01</w:t>
             </w:r>
           </w:p>
         </w:tc>
@@ -12303,7 +12373,7 @@
                 <w:sz w:val="14"/>
                 <w:szCs w:val="14"/>
               </w:rPr>
-              <w:t>N/A</w:t>
+              <w:t>130.72 ± 0.80</w:t>
             </w:r>
           </w:p>
         </w:tc>
@@ -12323,17 +12393,18 @@
             <w:pPr>
               <w:jc w:val="center"/>
               <w:rPr>
-                <w:sz w:val="14"/>
-                <w:szCs w:val="14"/>
-              </w:rPr>
-            </w:pPr>
-            <w:r>
-              <w:rPr>
-                <w:rFonts w:eastAsia="Arial"/>
-                <w:sz w:val="14"/>
-                <w:szCs w:val="14"/>
-              </w:rPr>
-              <w:t>N/A</w:t>
+                <w:rFonts w:asciiTheme="majorBidi" w:hAnsiTheme="majorBidi" w:cstheme="majorBidi"/>
+                <w:sz w:val="14"/>
+                <w:szCs w:val="14"/>
+              </w:rPr>
+            </w:pPr>
+            <w:r>
+              <w:rPr>
+                <w:rFonts w:asciiTheme="majorBidi" w:eastAsia="Arial" w:hAnsiTheme="majorBidi" w:cstheme="majorBidi"/>
+                <w:sz w:val="14"/>
+                <w:szCs w:val="14"/>
+              </w:rPr>
+              <w:t>0.03 ± 0.00</w:t>
             </w:r>
           </w:p>
         </w:tc>
@@ -12353,17 +12424,18 @@
             <w:pPr>
               <w:jc w:val="center"/>
               <w:rPr>
-                <w:sz w:val="14"/>
-                <w:szCs w:val="14"/>
-              </w:rPr>
-            </w:pPr>
-            <w:r>
-              <w:rPr>
-                <w:rFonts w:eastAsia="Arial"/>
-                <w:sz w:val="14"/>
-                <w:szCs w:val="14"/>
-              </w:rPr>
-              <w:t>N/A</w:t>
+                <w:rFonts w:asciiTheme="majorBidi" w:hAnsiTheme="majorBidi" w:cstheme="majorBidi"/>
+                <w:sz w:val="14"/>
+                <w:szCs w:val="14"/>
+              </w:rPr>
+            </w:pPr>
+            <w:r>
+              <w:rPr>
+                <w:rFonts w:asciiTheme="majorBidi" w:eastAsia="Arial" w:hAnsiTheme="majorBidi" w:cstheme="majorBidi"/>
+                <w:sz w:val="14"/>
+                <w:szCs w:val="14"/>
+              </w:rPr>
+              <w:t>105.65 ± 1.93</w:t>
             </w:r>
           </w:p>
         </w:tc>
@@ -12383,17 +12455,18 @@
             <w:pPr>
               <w:jc w:val="center"/>
               <w:rPr>
-                <w:sz w:val="14"/>
-                <w:szCs w:val="14"/>
-              </w:rPr>
-            </w:pPr>
-            <w:r>
-              <w:rPr>
-                <w:rFonts w:eastAsia="Arial"/>
-                <w:sz w:val="14"/>
-                <w:szCs w:val="14"/>
-              </w:rPr>
-              <w:t>N/A</w:t>
+                <w:rFonts w:asciiTheme="majorBidi" w:hAnsiTheme="majorBidi" w:cstheme="majorBidi"/>
+                <w:sz w:val="14"/>
+                <w:szCs w:val="14"/>
+              </w:rPr>
+            </w:pPr>
+            <w:r>
+              <w:rPr>
+                <w:rFonts w:asciiTheme="majorBidi" w:eastAsia="Arial" w:hAnsiTheme="majorBidi" w:cstheme="majorBidi"/>
+                <w:sz w:val="14"/>
+                <w:szCs w:val="14"/>
+              </w:rPr>
+              <w:t>1.44 ± 0.03</w:t>
             </w:r>
           </w:p>
         </w:tc>
@@ -12413,17 +12486,18 @@
             <w:pPr>
               <w:jc w:val="center"/>
               <w:rPr>
-                <w:sz w:val="14"/>
-                <w:szCs w:val="14"/>
-              </w:rPr>
-            </w:pPr>
-            <w:r>
-              <w:rPr>
-                <w:rFonts w:eastAsia="Arial"/>
-                <w:sz w:val="14"/>
-                <w:szCs w:val="14"/>
-              </w:rPr>
-              <w:t>N/A</w:t>
+                <w:rFonts w:asciiTheme="majorBidi" w:hAnsiTheme="majorBidi" w:cstheme="majorBidi"/>
+                <w:sz w:val="14"/>
+                <w:szCs w:val="14"/>
+              </w:rPr>
+            </w:pPr>
+            <w:r>
+              <w:rPr>
+                <w:rFonts w:asciiTheme="majorBidi" w:eastAsia="Arial" w:hAnsiTheme="majorBidi" w:cstheme="majorBidi"/>
+                <w:sz w:val="14"/>
+                <w:szCs w:val="14"/>
+              </w:rPr>
+              <w:t>1.44 ± 0.03</w:t>
             </w:r>
           </w:p>
         </w:tc>
@@ -12437,18 +12511,18 @@
             <w:pPr>
               <w:jc w:val="center"/>
               <w:rPr>
-                <w:rFonts w:eastAsia="Arial"/>
-                <w:sz w:val="14"/>
-                <w:szCs w:val="14"/>
-              </w:rPr>
-            </w:pPr>
-            <w:r>
-              <w:rPr>
-                <w:rFonts w:eastAsia="Arial"/>
-                <w:sz w:val="14"/>
-                <w:szCs w:val="14"/>
-              </w:rPr>
-              <w:t>N/A</w:t>
+                <w:rFonts w:asciiTheme="majorBidi" w:eastAsia="Arial" w:hAnsiTheme="majorBidi" w:cstheme="majorBidi"/>
+                <w:sz w:val="14"/>
+                <w:szCs w:val="14"/>
+              </w:rPr>
+            </w:pPr>
+            <w:r>
+              <w:rPr>
+                <w:rFonts w:asciiTheme="majorBidi" w:eastAsia="Arial" w:hAnsiTheme="majorBidi" w:cstheme="majorBidi"/>
+                <w:sz w:val="14"/>
+                <w:szCs w:val="14"/>
+              </w:rPr>
+              <w:t>103.96 ± 1.89</w:t>
             </w:r>
           </w:p>
         </w:tc>
@@ -12679,7 +12753,7 @@
         </w:tc>
         <w:tc>
           <w:tcPr>
-            <w:tcW w:w="190" w:type="pct"/>
+            <w:tcW w:w="191" w:type="pct"/>
             <w:shd w:val="clear" w:color="auto" w:fill="FFFFFF" w:themeFill="background1"/>
             <w:vAlign w:val="center"/>
           </w:tcPr>
@@ -12804,7 +12878,7 @@
                 <w:sz w:val="14"/>
                 <w:szCs w:val="14"/>
               </w:rPr>
-              <w:t>N/A</w:t>
+              <w:t>0.03 ± 0.00</w:t>
             </w:r>
           </w:p>
         </w:tc>
@@ -12834,7 +12908,7 @@
                 <w:sz w:val="14"/>
                 <w:szCs w:val="14"/>
               </w:rPr>
-              <w:t>N/A</w:t>
+              <w:t>136.04 ± 1.98</w:t>
             </w:r>
           </w:p>
         </w:tc>
@@ -12864,7 +12938,7 @@
                 <w:sz w:val="14"/>
                 <w:szCs w:val="14"/>
               </w:rPr>
-              <w:t>N/A</w:t>
+              <w:t>1.12 ± 0.02</w:t>
             </w:r>
           </w:p>
         </w:tc>
@@ -12895,7 +12969,7 @@
                 <w:sz w:val="14"/>
                 <w:szCs w:val="14"/>
               </w:rPr>
-              <w:t>N/A</w:t>
+              <w:t>1.12 ± 0.02</w:t>
             </w:r>
           </w:p>
         </w:tc>
@@ -12925,7 +12999,7 @@
                 <w:sz w:val="14"/>
                 <w:szCs w:val="14"/>
               </w:rPr>
-              <w:t>N/A</w:t>
+              <w:t>133.67 ± 1.82</w:t>
             </w:r>
           </w:p>
         </w:tc>
@@ -12945,17 +13019,18 @@
             <w:pPr>
               <w:jc w:val="center"/>
               <w:rPr>
-                <w:sz w:val="14"/>
-                <w:szCs w:val="14"/>
-              </w:rPr>
-            </w:pPr>
-            <w:r>
-              <w:rPr>
-                <w:rFonts w:eastAsia="Arial"/>
-                <w:sz w:val="14"/>
-                <w:szCs w:val="14"/>
-              </w:rPr>
-              <w:t>N/A</w:t>
+                <w:rFonts w:asciiTheme="majorBidi" w:hAnsiTheme="majorBidi" w:cstheme="majorBidi"/>
+                <w:sz w:val="14"/>
+                <w:szCs w:val="14"/>
+              </w:rPr>
+            </w:pPr>
+            <w:r>
+              <w:rPr>
+                <w:rFonts w:asciiTheme="majorBidi" w:eastAsia="Arial" w:hAnsiTheme="majorBidi" w:cstheme="majorBidi"/>
+                <w:sz w:val="14"/>
+                <w:szCs w:val="14"/>
+              </w:rPr>
+              <w:t>0.03 ± 0.00</w:t>
             </w:r>
           </w:p>
         </w:tc>
@@ -12975,17 +13050,18 @@
             <w:pPr>
               <w:jc w:val="center"/>
               <w:rPr>
-                <w:sz w:val="14"/>
-                <w:szCs w:val="14"/>
-              </w:rPr>
-            </w:pPr>
-            <w:r>
-              <w:rPr>
-                <w:rFonts w:eastAsia="Arial"/>
-                <w:sz w:val="14"/>
-                <w:szCs w:val="14"/>
-              </w:rPr>
-              <w:t>N/A</w:t>
+                <w:rFonts w:asciiTheme="majorBidi" w:hAnsiTheme="majorBidi" w:cstheme="majorBidi"/>
+                <w:sz w:val="14"/>
+                <w:szCs w:val="14"/>
+              </w:rPr>
+            </w:pPr>
+            <w:r>
+              <w:rPr>
+                <w:rFonts w:asciiTheme="majorBidi" w:eastAsia="Arial" w:hAnsiTheme="majorBidi" w:cstheme="majorBidi"/>
+                <w:sz w:val="14"/>
+                <w:szCs w:val="14"/>
+              </w:rPr>
+              <w:t>116.18 ± 1.58</w:t>
             </w:r>
           </w:p>
         </w:tc>
@@ -13005,17 +13081,18 @@
             <w:pPr>
               <w:jc w:val="center"/>
               <w:rPr>
-                <w:sz w:val="14"/>
-                <w:szCs w:val="14"/>
-              </w:rPr>
-            </w:pPr>
-            <w:r>
-              <w:rPr>
-                <w:rFonts w:eastAsia="Arial"/>
-                <w:sz w:val="14"/>
-                <w:szCs w:val="14"/>
-              </w:rPr>
-              <w:t>N/A</w:t>
+                <w:rFonts w:asciiTheme="majorBidi" w:hAnsiTheme="majorBidi" w:cstheme="majorBidi"/>
+                <w:sz w:val="14"/>
+                <w:szCs w:val="14"/>
+              </w:rPr>
+            </w:pPr>
+            <w:r>
+              <w:rPr>
+                <w:rFonts w:asciiTheme="majorBidi" w:eastAsia="Arial" w:hAnsiTheme="majorBidi" w:cstheme="majorBidi"/>
+                <w:sz w:val="14"/>
+                <w:szCs w:val="14"/>
+              </w:rPr>
+              <w:t>1.31 ± 0.02</w:t>
             </w:r>
           </w:p>
         </w:tc>
@@ -13035,17 +13112,18 @@
             <w:pPr>
               <w:jc w:val="center"/>
               <w:rPr>
-                <w:sz w:val="14"/>
-                <w:szCs w:val="14"/>
-              </w:rPr>
-            </w:pPr>
-            <w:r>
-              <w:rPr>
-                <w:rFonts w:eastAsia="Arial"/>
-                <w:sz w:val="14"/>
-                <w:szCs w:val="14"/>
-              </w:rPr>
-              <w:t>N/A</w:t>
+                <w:rFonts w:asciiTheme="majorBidi" w:hAnsiTheme="majorBidi" w:cstheme="majorBidi"/>
+                <w:sz w:val="14"/>
+                <w:szCs w:val="14"/>
+              </w:rPr>
+            </w:pPr>
+            <w:r>
+              <w:rPr>
+                <w:rFonts w:asciiTheme="majorBidi" w:eastAsia="Arial" w:hAnsiTheme="majorBidi" w:cstheme="majorBidi"/>
+                <w:sz w:val="14"/>
+                <w:szCs w:val="14"/>
+              </w:rPr>
+              <w:t>1.31 ± 0.02</w:t>
             </w:r>
           </w:p>
         </w:tc>
@@ -13059,18 +13137,18 @@
             <w:pPr>
               <w:jc w:val="center"/>
               <w:rPr>
-                <w:rFonts w:eastAsia="Arial"/>
-                <w:sz w:val="14"/>
-                <w:szCs w:val="14"/>
-              </w:rPr>
-            </w:pPr>
-            <w:r>
-              <w:rPr>
-                <w:rFonts w:eastAsia="Arial"/>
-                <w:sz w:val="14"/>
-                <w:szCs w:val="14"/>
-              </w:rPr>
-              <w:t>N/A</w:t>
+                <w:rFonts w:asciiTheme="majorBidi" w:eastAsia="Arial" w:hAnsiTheme="majorBidi" w:cstheme="majorBidi"/>
+                <w:sz w:val="14"/>
+                <w:szCs w:val="14"/>
+              </w:rPr>
+            </w:pPr>
+            <w:r>
+              <w:rPr>
+                <w:rFonts w:asciiTheme="majorBidi" w:eastAsia="Arial" w:hAnsiTheme="majorBidi" w:cstheme="majorBidi"/>
+                <w:sz w:val="14"/>
+                <w:szCs w:val="14"/>
+              </w:rPr>
+              <w:t>114.47 ± 1.53</w:t>
             </w:r>
           </w:p>
         </w:tc>
@@ -13301,7 +13379,7 @@
         </w:tc>
         <w:tc>
           <w:tcPr>
-            <w:tcW w:w="190" w:type="pct"/>
+            <w:tcW w:w="191" w:type="pct"/>
             <w:shd w:val="clear" w:color="auto" w:fill="FFFFFF" w:themeFill="background1"/>
             <w:vAlign w:val="center"/>
           </w:tcPr>
@@ -13408,7 +13486,7 @@
                 <w:sz w:val="14"/>
                 <w:szCs w:val="14"/>
               </w:rPr>
-              <w:t>N/A</w:t>
+              <w:t>0.02 ± 0.00</w:t>
             </w:r>
           </w:p>
         </w:tc>
@@ -13438,7 +13516,7 @@
                 <w:sz w:val="14"/>
                 <w:szCs w:val="14"/>
               </w:rPr>
-              <w:t>N/A</w:t>
+              <w:t>145.72 ± 1.01</w:t>
             </w:r>
           </w:p>
         </w:tc>
@@ -13468,7 +13546,7 @@
                 <w:sz w:val="14"/>
                 <w:szCs w:val="14"/>
               </w:rPr>
-              <w:t>N/A</w:t>
+              <w:t>1.04 ± 0.01</w:t>
             </w:r>
           </w:p>
         </w:tc>
@@ -13499,7 +13577,7 @@
                 <w:sz w:val="14"/>
                 <w:szCs w:val="14"/>
               </w:rPr>
-              <w:t>N/A</w:t>
+              <w:t>1.04 ± 0.01</w:t>
             </w:r>
           </w:p>
         </w:tc>
@@ -13529,7 +13607,7 @@
                 <w:sz w:val="14"/>
                 <w:szCs w:val="14"/>
               </w:rPr>
-              <w:t>N/A</w:t>
+              <w:t>143.61 ± 0.96</w:t>
             </w:r>
           </w:p>
         </w:tc>
@@ -13549,17 +13627,18 @@
             <w:pPr>
               <w:jc w:val="center"/>
               <w:rPr>
-                <w:sz w:val="14"/>
-                <w:szCs w:val="14"/>
-              </w:rPr>
-            </w:pPr>
-            <w:r>
-              <w:rPr>
-                <w:rFonts w:eastAsia="Arial"/>
-                <w:sz w:val="14"/>
-                <w:szCs w:val="14"/>
-              </w:rPr>
-              <w:t>N/A</w:t>
+                <w:rFonts w:asciiTheme="majorBidi" w:hAnsiTheme="majorBidi" w:cstheme="majorBidi"/>
+                <w:sz w:val="14"/>
+                <w:szCs w:val="14"/>
+              </w:rPr>
+            </w:pPr>
+            <w:r>
+              <w:rPr>
+                <w:rFonts w:asciiTheme="majorBidi" w:eastAsia="Arial" w:hAnsiTheme="majorBidi" w:cstheme="majorBidi"/>
+                <w:sz w:val="14"/>
+                <w:szCs w:val="14"/>
+              </w:rPr>
+              <w:t>0.03 ± 0.00</w:t>
             </w:r>
           </w:p>
         </w:tc>
@@ -13579,17 +13658,18 @@
             <w:pPr>
               <w:jc w:val="center"/>
               <w:rPr>
-                <w:sz w:val="14"/>
-                <w:szCs w:val="14"/>
-              </w:rPr>
-            </w:pPr>
-            <w:r>
-              <w:rPr>
-                <w:rFonts w:eastAsia="Arial"/>
-                <w:sz w:val="14"/>
-                <w:szCs w:val="14"/>
-              </w:rPr>
-              <w:t>N/A</w:t>
+                <w:rFonts w:asciiTheme="majorBidi" w:hAnsiTheme="majorBidi" w:cstheme="majorBidi"/>
+                <w:sz w:val="14"/>
+                <w:szCs w:val="14"/>
+              </w:rPr>
+            </w:pPr>
+            <w:r>
+              <w:rPr>
+                <w:rFonts w:asciiTheme="majorBidi" w:eastAsia="Arial" w:hAnsiTheme="majorBidi" w:cstheme="majorBidi"/>
+                <w:sz w:val="14"/>
+                <w:szCs w:val="14"/>
+              </w:rPr>
+              <w:t>117.76 ± 1.01</w:t>
             </w:r>
           </w:p>
         </w:tc>
@@ -13609,17 +13689,18 @@
             <w:pPr>
               <w:jc w:val="center"/>
               <w:rPr>
-                <w:sz w:val="14"/>
-                <w:szCs w:val="14"/>
-              </w:rPr>
-            </w:pPr>
-            <w:r>
-              <w:rPr>
-                <w:rFonts w:eastAsia="Arial"/>
-                <w:sz w:val="14"/>
-                <w:szCs w:val="14"/>
-              </w:rPr>
-              <w:t>N/A</w:t>
+                <w:rFonts w:asciiTheme="majorBidi" w:hAnsiTheme="majorBidi" w:cstheme="majorBidi"/>
+                <w:sz w:val="14"/>
+                <w:szCs w:val="14"/>
+              </w:rPr>
+            </w:pPr>
+            <w:r>
+              <w:rPr>
+                <w:rFonts w:asciiTheme="majorBidi" w:eastAsia="Arial" w:hAnsiTheme="majorBidi" w:cstheme="majorBidi"/>
+                <w:sz w:val="14"/>
+                <w:szCs w:val="14"/>
+              </w:rPr>
+              <w:t>1.30 ± 0.01</w:t>
             </w:r>
           </w:p>
         </w:tc>
@@ -13639,17 +13720,18 @@
             <w:pPr>
               <w:jc w:val="center"/>
               <w:rPr>
-                <w:sz w:val="14"/>
-                <w:szCs w:val="14"/>
-              </w:rPr>
-            </w:pPr>
-            <w:r>
-              <w:rPr>
-                <w:rFonts w:eastAsia="Arial"/>
-                <w:sz w:val="14"/>
-                <w:szCs w:val="14"/>
-              </w:rPr>
-              <w:t>N/A</w:t>
+                <w:rFonts w:asciiTheme="majorBidi" w:hAnsiTheme="majorBidi" w:cstheme="majorBidi"/>
+                <w:sz w:val="14"/>
+                <w:szCs w:val="14"/>
+              </w:rPr>
+            </w:pPr>
+            <w:r>
+              <w:rPr>
+                <w:rFonts w:asciiTheme="majorBidi" w:eastAsia="Arial" w:hAnsiTheme="majorBidi" w:cstheme="majorBidi"/>
+                <w:sz w:val="14"/>
+                <w:szCs w:val="14"/>
+              </w:rPr>
+              <w:t>1.30 ± 0.01</w:t>
             </w:r>
           </w:p>
         </w:tc>
@@ -13663,18 +13745,18 @@
             <w:pPr>
               <w:jc w:val="center"/>
               <w:rPr>
-                <w:rFonts w:eastAsia="Arial"/>
-                <w:sz w:val="14"/>
-                <w:szCs w:val="14"/>
-              </w:rPr>
-            </w:pPr>
-            <w:r>
-              <w:rPr>
-                <w:rFonts w:eastAsia="Arial"/>
-                <w:sz w:val="14"/>
-                <w:szCs w:val="14"/>
-              </w:rPr>
-              <w:t>N/A</w:t>
+                <w:rFonts w:asciiTheme="majorBidi" w:eastAsia="Arial" w:hAnsiTheme="majorBidi" w:cstheme="majorBidi"/>
+                <w:sz w:val="14"/>
+                <w:szCs w:val="14"/>
+              </w:rPr>
+            </w:pPr>
+            <w:r>
+              <w:rPr>
+                <w:rFonts w:asciiTheme="majorBidi" w:eastAsia="Arial" w:hAnsiTheme="majorBidi" w:cstheme="majorBidi"/>
+                <w:sz w:val="14"/>
+                <w:szCs w:val="14"/>
+              </w:rPr>
+              <w:t>115.80 ± 0.98</w:t>
             </w:r>
           </w:p>
         </w:tc>
@@ -13905,7 +13987,7 @@
         </w:tc>
         <w:tc>
           <w:tcPr>
-            <w:tcW w:w="190" w:type="pct"/>
+            <w:tcW w:w="191" w:type="pct"/>
             <w:shd w:val="clear" w:color="auto" w:fill="FFFFFF" w:themeFill="background1"/>
             <w:vAlign w:val="center"/>
           </w:tcPr>
@@ -14012,7 +14094,7 @@
                 <w:sz w:val="14"/>
                 <w:szCs w:val="14"/>
               </w:rPr>
-              <w:t>N/A</w:t>
+              <w:t>0.02 ± 0.00</w:t>
             </w:r>
           </w:p>
         </w:tc>
@@ -14042,7 +14124,7 @@
                 <w:sz w:val="14"/>
                 <w:szCs w:val="14"/>
               </w:rPr>
-              <w:t>N/A</w:t>
+              <w:t>145.32 ± 1.06</w:t>
             </w:r>
           </w:p>
         </w:tc>
@@ -14072,7 +14154,7 @@
                 <w:sz w:val="14"/>
                 <w:szCs w:val="14"/>
               </w:rPr>
-              <w:t>N/A</w:t>
+              <w:t>1.05 ± 0.01</w:t>
             </w:r>
           </w:p>
         </w:tc>
@@ -14103,7 +14185,7 @@
                 <w:sz w:val="14"/>
                 <w:szCs w:val="14"/>
               </w:rPr>
-              <w:t>N/A</w:t>
+              <w:t>1.05 ± 0.01</w:t>
             </w:r>
           </w:p>
         </w:tc>
@@ -14133,7 +14215,7 @@
                 <w:sz w:val="14"/>
                 <w:szCs w:val="14"/>
               </w:rPr>
-              <w:t>N/A</w:t>
+              <w:t>143.14 ± 1.08</w:t>
             </w:r>
           </w:p>
         </w:tc>
@@ -14153,17 +14235,18 @@
             <w:pPr>
               <w:jc w:val="center"/>
               <w:rPr>
-                <w:sz w:val="14"/>
-                <w:szCs w:val="14"/>
-              </w:rPr>
-            </w:pPr>
-            <w:r>
-              <w:rPr>
-                <w:rFonts w:eastAsia="Arial"/>
-                <w:sz w:val="14"/>
-                <w:szCs w:val="14"/>
-              </w:rPr>
-              <w:t>N/A</w:t>
+                <w:rFonts w:asciiTheme="majorBidi" w:hAnsiTheme="majorBidi" w:cstheme="majorBidi"/>
+                <w:sz w:val="14"/>
+                <w:szCs w:val="14"/>
+              </w:rPr>
+            </w:pPr>
+            <w:r>
+              <w:rPr>
+                <w:rFonts w:asciiTheme="majorBidi" w:eastAsia="Arial" w:hAnsiTheme="majorBidi" w:cstheme="majorBidi"/>
+                <w:sz w:val="14"/>
+                <w:szCs w:val="14"/>
+              </w:rPr>
+              <w:t>0.03 ± 0.00</w:t>
             </w:r>
           </w:p>
         </w:tc>
@@ -14183,17 +14266,18 @@
             <w:pPr>
               <w:jc w:val="center"/>
               <w:rPr>
-                <w:sz w:val="14"/>
-                <w:szCs w:val="14"/>
-              </w:rPr>
-            </w:pPr>
-            <w:r>
-              <w:rPr>
-                <w:rFonts w:eastAsia="Arial"/>
-                <w:sz w:val="14"/>
-                <w:szCs w:val="14"/>
-              </w:rPr>
-              <w:t>N/A</w:t>
+                <w:rFonts w:asciiTheme="majorBidi" w:hAnsiTheme="majorBidi" w:cstheme="majorBidi"/>
+                <w:sz w:val="14"/>
+                <w:szCs w:val="14"/>
+              </w:rPr>
+            </w:pPr>
+            <w:r>
+              <w:rPr>
+                <w:rFonts w:asciiTheme="majorBidi" w:eastAsia="Arial" w:hAnsiTheme="majorBidi" w:cstheme="majorBidi"/>
+                <w:sz w:val="14"/>
+                <w:szCs w:val="14"/>
+              </w:rPr>
+              <w:t>106.13 ± 1.50</w:t>
             </w:r>
           </w:p>
         </w:tc>
@@ -14213,17 +14297,18 @@
             <w:pPr>
               <w:jc w:val="center"/>
               <w:rPr>
-                <w:sz w:val="14"/>
-                <w:szCs w:val="14"/>
-              </w:rPr>
-            </w:pPr>
-            <w:r>
-              <w:rPr>
-                <w:rFonts w:eastAsia="Arial"/>
-                <w:sz w:val="14"/>
-                <w:szCs w:val="14"/>
-              </w:rPr>
-              <w:t>N/A</w:t>
+                <w:rFonts w:asciiTheme="majorBidi" w:hAnsiTheme="majorBidi" w:cstheme="majorBidi"/>
+                <w:sz w:val="14"/>
+                <w:szCs w:val="14"/>
+              </w:rPr>
+            </w:pPr>
+            <w:r>
+              <w:rPr>
+                <w:rFonts w:asciiTheme="majorBidi" w:eastAsia="Arial" w:hAnsiTheme="majorBidi" w:cstheme="majorBidi"/>
+                <w:sz w:val="14"/>
+                <w:szCs w:val="14"/>
+              </w:rPr>
+              <w:t>1.44 ± 0.02</w:t>
             </w:r>
           </w:p>
         </w:tc>
@@ -14243,17 +14328,18 @@
             <w:pPr>
               <w:jc w:val="center"/>
               <w:rPr>
-                <w:sz w:val="14"/>
-                <w:szCs w:val="14"/>
-              </w:rPr>
-            </w:pPr>
-            <w:r>
-              <w:rPr>
-                <w:rFonts w:eastAsia="Arial"/>
-                <w:sz w:val="14"/>
-                <w:szCs w:val="14"/>
-              </w:rPr>
-              <w:t>N/A</w:t>
+                <w:rFonts w:asciiTheme="majorBidi" w:hAnsiTheme="majorBidi" w:cstheme="majorBidi"/>
+                <w:sz w:val="14"/>
+                <w:szCs w:val="14"/>
+              </w:rPr>
+            </w:pPr>
+            <w:r>
+              <w:rPr>
+                <w:rFonts w:asciiTheme="majorBidi" w:eastAsia="Arial" w:hAnsiTheme="majorBidi" w:cstheme="majorBidi"/>
+                <w:sz w:val="14"/>
+                <w:szCs w:val="14"/>
+              </w:rPr>
+              <w:t>1.44 ± 0.02</w:t>
             </w:r>
           </w:p>
         </w:tc>
@@ -14267,18 +14353,18 @@
             <w:pPr>
               <w:jc w:val="center"/>
               <w:rPr>
-                <w:rFonts w:eastAsia="Arial"/>
-                <w:sz w:val="14"/>
-                <w:szCs w:val="14"/>
-              </w:rPr>
-            </w:pPr>
-            <w:r>
-              <w:rPr>
-                <w:rFonts w:eastAsia="Arial"/>
-                <w:sz w:val="14"/>
-                <w:szCs w:val="14"/>
-              </w:rPr>
-              <w:t>N/A</w:t>
+                <w:rFonts w:asciiTheme="majorBidi" w:eastAsia="Arial" w:hAnsiTheme="majorBidi" w:cstheme="majorBidi"/>
+                <w:sz w:val="14"/>
+                <w:szCs w:val="14"/>
+              </w:rPr>
+            </w:pPr>
+            <w:r>
+              <w:rPr>
+                <w:rFonts w:asciiTheme="majorBidi" w:eastAsia="Arial" w:hAnsiTheme="majorBidi" w:cstheme="majorBidi"/>
+                <w:sz w:val="14"/>
+                <w:szCs w:val="14"/>
+              </w:rPr>
+              <w:t>104.25 ± 1.49</w:t>
             </w:r>
           </w:p>
         </w:tc>
@@ -14509,7 +14595,7 @@
         </w:tc>
         <w:tc>
           <w:tcPr>
-            <w:tcW w:w="190" w:type="pct"/>
+            <w:tcW w:w="191" w:type="pct"/>
             <w:shd w:val="clear" w:color="auto" w:fill="FFFFFF" w:themeFill="background1"/>
             <w:vAlign w:val="center"/>
           </w:tcPr>

</xml_diff>

<commit_message>
Added Notebook and filled cloud comparison table
</commit_message>
<xml_diff>
--- a/Evaluations/InferenceEvaluations/CloudEvaluation/Inference_Comparison.docx
+++ b/Evaluations/InferenceEvaluations/CloudEvaluation/Inference_Comparison.docx
@@ -162,6 +162,7 @@
                 <w:szCs w:val="16"/>
               </w:rPr>
             </w:pPr>
+            <w:proofErr w:type="spellStart"/>
             <w:r>
               <w:rPr>
                 <w:rFonts w:eastAsia="Arial"/>
@@ -170,7 +171,18 @@
                 <w:sz w:val="16"/>
                 <w:szCs w:val="16"/>
               </w:rPr>
-              <w:t>LLaMA 3.2-3B-Instruct</w:t>
+              <w:t>LLaMA</w:t>
+            </w:r>
+            <w:proofErr w:type="spellEnd"/>
+            <w:r>
+              <w:rPr>
+                <w:rFonts w:eastAsia="Arial"/>
+                <w:b/>
+                <w:bCs/>
+                <w:sz w:val="16"/>
+                <w:szCs w:val="16"/>
+              </w:rPr>
+              <w:t xml:space="preserve"> 3.2-3B-Instruct</w:t>
             </w:r>
           </w:p>
         </w:tc>
@@ -1605,125 +1617,120 @@
         <w:tc>
           <w:tcPr>
             <w:tcW w:w="190" w:type="pct"/>
-            <w:shd w:val="clear" w:color="auto" w:fill="FFFFFF" w:themeFill="background1"/>
-            <w:vAlign w:val="center"/>
-          </w:tcPr>
-          <w:p>
-            <w:pPr>
-              <w:jc w:val="center"/>
-              <w:rPr>
-                <w:rFonts w:eastAsia="Arial"/>
-                <w:sz w:val="14"/>
-                <w:szCs w:val="14"/>
-              </w:rPr>
-            </w:pPr>
-            <w:r>
-              <w:rPr>
-                <w:rFonts w:eastAsia="Arial"/>
-                <w:sz w:val="14"/>
-                <w:szCs w:val="14"/>
-              </w:rPr>
-              <w:t>N/A</w:t>
+            <w:shd w:val="clear" w:color="auto" w:fill="auto"/>
+            <w:vAlign w:val="center"/>
+          </w:tcPr>
+          <w:p>
+            <w:pPr>
+              <w:jc w:val="center"/>
+              <w:rPr>
+                <w:rFonts w:eastAsia="Arial"/>
+                <w:sz w:val="14"/>
+                <w:szCs w:val="14"/>
+              </w:rPr>
+            </w:pPr>
+            <w:r>
+              <w:rPr>
+                <w:sz w:val="14"/>
+                <w:szCs w:val="14"/>
+              </w:rPr>
+              <w:t>0.03 ± 0.00</w:t>
             </w:r>
           </w:p>
         </w:tc>
         <w:tc>
           <w:tcPr>
             <w:tcW w:w="190" w:type="pct"/>
-            <w:shd w:val="clear" w:color="auto" w:fill="FFFFFF" w:themeFill="background1"/>
-            <w:vAlign w:val="center"/>
-          </w:tcPr>
-          <w:p>
-            <w:pPr>
-              <w:jc w:val="center"/>
-              <w:rPr>
-                <w:rFonts w:eastAsia="Arial"/>
-                <w:sz w:val="14"/>
-                <w:szCs w:val="14"/>
-              </w:rPr>
-            </w:pPr>
-            <w:r>
-              <w:rPr>
-                <w:rFonts w:eastAsia="Arial"/>
-                <w:sz w:val="14"/>
-                <w:szCs w:val="14"/>
-              </w:rPr>
-              <w:t>N/A</w:t>
+            <w:shd w:val="clear" w:color="auto" w:fill="auto"/>
+            <w:vAlign w:val="center"/>
+          </w:tcPr>
+          <w:p>
+            <w:pPr>
+              <w:jc w:val="center"/>
+              <w:rPr>
+                <w:rFonts w:eastAsia="Arial"/>
+                <w:sz w:val="14"/>
+                <w:szCs w:val="14"/>
+              </w:rPr>
+            </w:pPr>
+            <w:r>
+              <w:rPr>
+                <w:sz w:val="14"/>
+                <w:szCs w:val="14"/>
+              </w:rPr>
+              <w:t>51.24 ± 3.62</w:t>
             </w:r>
           </w:p>
         </w:tc>
         <w:tc>
           <w:tcPr>
             <w:tcW w:w="190" w:type="pct"/>
-            <w:shd w:val="clear" w:color="auto" w:fill="FFFFFF" w:themeFill="background1"/>
-            <w:vAlign w:val="center"/>
-          </w:tcPr>
-          <w:p>
-            <w:pPr>
-              <w:jc w:val="center"/>
-              <w:rPr>
-                <w:rFonts w:eastAsia="Arial"/>
-                <w:sz w:val="14"/>
-                <w:szCs w:val="14"/>
-              </w:rPr>
-            </w:pPr>
-            <w:r>
-              <w:rPr>
-                <w:rFonts w:eastAsia="Arial"/>
-                <w:sz w:val="14"/>
-                <w:szCs w:val="14"/>
-              </w:rPr>
-              <w:t>N/A</w:t>
+            <w:shd w:val="clear" w:color="auto" w:fill="auto"/>
+            <w:vAlign w:val="center"/>
+          </w:tcPr>
+          <w:p>
+            <w:pPr>
+              <w:jc w:val="center"/>
+              <w:rPr>
+                <w:rFonts w:eastAsia="Arial"/>
+                <w:sz w:val="14"/>
+                <w:szCs w:val="14"/>
+              </w:rPr>
+            </w:pPr>
+            <w:r>
+              <w:rPr>
+                <w:sz w:val="14"/>
+                <w:szCs w:val="14"/>
+              </w:rPr>
+              <w:t>2.96 ± 0.23</w:t>
             </w:r>
           </w:p>
         </w:tc>
         <w:tc>
           <w:tcPr>
             <w:tcW w:w="190" w:type="pct"/>
-            <w:shd w:val="clear" w:color="auto" w:fill="FFFFFF" w:themeFill="background1"/>
-            <w:vAlign w:val="center"/>
-          </w:tcPr>
-          <w:p>
-            <w:pPr>
-              <w:jc w:val="center"/>
-              <w:rPr>
-                <w:rFonts w:eastAsia="Arial"/>
-                <w:sz w:val="14"/>
-                <w:szCs w:val="14"/>
-              </w:rPr>
-            </w:pPr>
-            <w:r>
-              <w:rPr>
-                <w:rFonts w:eastAsia="Arial"/>
-                <w:sz w:val="14"/>
-                <w:szCs w:val="14"/>
-              </w:rPr>
-              <w:t>N/A</w:t>
+            <w:shd w:val="clear" w:color="auto" w:fill="auto"/>
+            <w:vAlign w:val="center"/>
+          </w:tcPr>
+          <w:p>
+            <w:pPr>
+              <w:jc w:val="center"/>
+              <w:rPr>
+                <w:rFonts w:eastAsia="Arial"/>
+                <w:sz w:val="14"/>
+                <w:szCs w:val="14"/>
+              </w:rPr>
+            </w:pPr>
+            <w:r>
+              <w:rPr>
+                <w:sz w:val="14"/>
+                <w:szCs w:val="14"/>
+              </w:rPr>
+              <w:t>2.96 ± 0.23</w:t>
             </w:r>
           </w:p>
         </w:tc>
         <w:tc>
           <w:tcPr>
             <w:tcW w:w="191" w:type="pct"/>
-            <w:shd w:val="clear" w:color="auto" w:fill="FFFFFF" w:themeFill="background1"/>
-            <w:vAlign w:val="center"/>
-          </w:tcPr>
-          <w:p>
-            <w:pPr>
-              <w:jc w:val="center"/>
-              <w:rPr>
-                <w:rFonts w:eastAsia="Arial"/>
-                <w:sz w:val="14"/>
-                <w:szCs w:val="14"/>
-              </w:rPr>
-            </w:pPr>
-            <w:r>
-              <w:rPr>
-                <w:rFonts w:eastAsia="Arial"/>
-                <w:sz w:val="14"/>
-                <w:szCs w:val="14"/>
-              </w:rPr>
-              <w:t>N/A</w:t>
+            <w:shd w:val="clear" w:color="auto" w:fill="auto"/>
+            <w:vAlign w:val="center"/>
+          </w:tcPr>
+          <w:p>
+            <w:pPr>
+              <w:jc w:val="center"/>
+              <w:rPr>
+                <w:rFonts w:eastAsia="Arial"/>
+                <w:sz w:val="14"/>
+                <w:szCs w:val="14"/>
+              </w:rPr>
+            </w:pPr>
+            <w:r>
+              <w:rPr>
+                <w:sz w:val="14"/>
+                <w:szCs w:val="14"/>
+              </w:rPr>
+              <w:t>51.02 ± 3.58</w:t>
             </w:r>
           </w:p>
         </w:tc>
@@ -2434,125 +2441,120 @@
         <w:tc>
           <w:tcPr>
             <w:tcW w:w="190" w:type="pct"/>
-            <w:shd w:val="clear" w:color="auto" w:fill="FFFFFF" w:themeFill="background1"/>
-            <w:vAlign w:val="center"/>
-          </w:tcPr>
-          <w:p>
-            <w:pPr>
-              <w:jc w:val="center"/>
-              <w:rPr>
-                <w:rFonts w:eastAsia="Arial"/>
-                <w:sz w:val="14"/>
-                <w:szCs w:val="14"/>
-              </w:rPr>
-            </w:pPr>
-            <w:r>
-              <w:rPr>
-                <w:rFonts w:eastAsia="Arial"/>
-                <w:sz w:val="14"/>
-                <w:szCs w:val="14"/>
-              </w:rPr>
-              <w:t>N/A</w:t>
+            <w:shd w:val="clear" w:color="auto" w:fill="auto"/>
+            <w:vAlign w:val="center"/>
+          </w:tcPr>
+          <w:p>
+            <w:pPr>
+              <w:jc w:val="center"/>
+              <w:rPr>
+                <w:rFonts w:eastAsia="Arial"/>
+                <w:sz w:val="14"/>
+                <w:szCs w:val="14"/>
+              </w:rPr>
+            </w:pPr>
+            <w:r>
+              <w:rPr>
+                <w:sz w:val="14"/>
+                <w:szCs w:val="14"/>
+              </w:rPr>
+              <w:t>0.03 ± 0.00</w:t>
             </w:r>
           </w:p>
         </w:tc>
         <w:tc>
           <w:tcPr>
             <w:tcW w:w="190" w:type="pct"/>
-            <w:shd w:val="clear" w:color="auto" w:fill="FFFFFF" w:themeFill="background1"/>
-            <w:vAlign w:val="center"/>
-          </w:tcPr>
-          <w:p>
-            <w:pPr>
-              <w:jc w:val="center"/>
-              <w:rPr>
-                <w:rFonts w:eastAsia="Arial"/>
-                <w:sz w:val="14"/>
-                <w:szCs w:val="14"/>
-              </w:rPr>
-            </w:pPr>
-            <w:r>
-              <w:rPr>
-                <w:rFonts w:eastAsia="Arial"/>
-                <w:sz w:val="14"/>
-                <w:szCs w:val="14"/>
-              </w:rPr>
-              <w:t>N/A</w:t>
+            <w:shd w:val="clear" w:color="auto" w:fill="auto"/>
+            <w:vAlign w:val="center"/>
+          </w:tcPr>
+          <w:p>
+            <w:pPr>
+              <w:jc w:val="center"/>
+              <w:rPr>
+                <w:rFonts w:eastAsia="Arial"/>
+                <w:sz w:val="14"/>
+                <w:szCs w:val="14"/>
+              </w:rPr>
+            </w:pPr>
+            <w:r>
+              <w:rPr>
+                <w:sz w:val="14"/>
+                <w:szCs w:val="14"/>
+              </w:rPr>
+              <w:t>53.63 ± 5.33</w:t>
             </w:r>
           </w:p>
         </w:tc>
         <w:tc>
           <w:tcPr>
             <w:tcW w:w="190" w:type="pct"/>
-            <w:shd w:val="clear" w:color="auto" w:fill="FFFFFF" w:themeFill="background1"/>
-            <w:vAlign w:val="center"/>
-          </w:tcPr>
-          <w:p>
-            <w:pPr>
-              <w:jc w:val="center"/>
-              <w:rPr>
-                <w:rFonts w:eastAsia="Arial"/>
-                <w:sz w:val="14"/>
-                <w:szCs w:val="14"/>
-              </w:rPr>
-            </w:pPr>
-            <w:r>
-              <w:rPr>
-                <w:rFonts w:eastAsia="Arial"/>
-                <w:sz w:val="14"/>
-                <w:szCs w:val="14"/>
-              </w:rPr>
-              <w:t>N/A</w:t>
+            <w:shd w:val="clear" w:color="auto" w:fill="auto"/>
+            <w:vAlign w:val="center"/>
+          </w:tcPr>
+          <w:p>
+            <w:pPr>
+              <w:jc w:val="center"/>
+              <w:rPr>
+                <w:rFonts w:eastAsia="Arial"/>
+                <w:sz w:val="14"/>
+                <w:szCs w:val="14"/>
+              </w:rPr>
+            </w:pPr>
+            <w:r>
+              <w:rPr>
+                <w:sz w:val="14"/>
+                <w:szCs w:val="14"/>
+              </w:rPr>
+              <w:t>2.84 ± 0.34</w:t>
             </w:r>
           </w:p>
         </w:tc>
         <w:tc>
           <w:tcPr>
             <w:tcW w:w="190" w:type="pct"/>
-            <w:shd w:val="clear" w:color="auto" w:fill="FFFFFF" w:themeFill="background1"/>
-            <w:vAlign w:val="center"/>
-          </w:tcPr>
-          <w:p>
-            <w:pPr>
-              <w:jc w:val="center"/>
-              <w:rPr>
-                <w:rFonts w:eastAsia="Arial"/>
-                <w:sz w:val="14"/>
-                <w:szCs w:val="14"/>
-              </w:rPr>
-            </w:pPr>
-            <w:r>
-              <w:rPr>
-                <w:rFonts w:eastAsia="Arial"/>
-                <w:sz w:val="14"/>
-                <w:szCs w:val="14"/>
-              </w:rPr>
-              <w:t>N/A</w:t>
+            <w:shd w:val="clear" w:color="auto" w:fill="auto"/>
+            <w:vAlign w:val="center"/>
+          </w:tcPr>
+          <w:p>
+            <w:pPr>
+              <w:jc w:val="center"/>
+              <w:rPr>
+                <w:rFonts w:eastAsia="Arial"/>
+                <w:sz w:val="14"/>
+                <w:szCs w:val="14"/>
+              </w:rPr>
+            </w:pPr>
+            <w:r>
+              <w:rPr>
+                <w:sz w:val="14"/>
+                <w:szCs w:val="14"/>
+              </w:rPr>
+              <w:t>2.84 ± 0.34</w:t>
             </w:r>
           </w:p>
         </w:tc>
         <w:tc>
           <w:tcPr>
             <w:tcW w:w="191" w:type="pct"/>
-            <w:shd w:val="clear" w:color="auto" w:fill="FFFFFF" w:themeFill="background1"/>
-            <w:vAlign w:val="center"/>
-          </w:tcPr>
-          <w:p>
-            <w:pPr>
-              <w:jc w:val="center"/>
-              <w:rPr>
-                <w:rFonts w:eastAsia="Arial"/>
-                <w:sz w:val="14"/>
-                <w:szCs w:val="14"/>
-              </w:rPr>
-            </w:pPr>
-            <w:r>
-              <w:rPr>
-                <w:rFonts w:eastAsia="Arial"/>
-                <w:sz w:val="14"/>
-                <w:szCs w:val="14"/>
-              </w:rPr>
-              <w:t>N/A</w:t>
+            <w:shd w:val="clear" w:color="auto" w:fill="auto"/>
+            <w:vAlign w:val="center"/>
+          </w:tcPr>
+          <w:p>
+            <w:pPr>
+              <w:jc w:val="center"/>
+              <w:rPr>
+                <w:rFonts w:eastAsia="Arial"/>
+                <w:sz w:val="14"/>
+                <w:szCs w:val="14"/>
+              </w:rPr>
+            </w:pPr>
+            <w:r>
+              <w:rPr>
+                <w:sz w:val="14"/>
+                <w:szCs w:val="14"/>
+              </w:rPr>
+              <w:t>53.39 ± 5.27</w:t>
             </w:r>
           </w:p>
         </w:tc>
@@ -3042,125 +3044,120 @@
         <w:tc>
           <w:tcPr>
             <w:tcW w:w="190" w:type="pct"/>
-            <w:shd w:val="clear" w:color="auto" w:fill="FFFFFF" w:themeFill="background1"/>
-            <w:vAlign w:val="center"/>
-          </w:tcPr>
-          <w:p>
-            <w:pPr>
-              <w:jc w:val="center"/>
-              <w:rPr>
-                <w:rFonts w:eastAsia="Arial"/>
-                <w:sz w:val="14"/>
-                <w:szCs w:val="14"/>
-              </w:rPr>
-            </w:pPr>
-            <w:r>
-              <w:rPr>
-                <w:rFonts w:eastAsia="Arial"/>
-                <w:sz w:val="14"/>
-                <w:szCs w:val="14"/>
-              </w:rPr>
-              <w:t>N/A</w:t>
+            <w:shd w:val="clear" w:color="auto" w:fill="auto"/>
+            <w:vAlign w:val="center"/>
+          </w:tcPr>
+          <w:p>
+            <w:pPr>
+              <w:jc w:val="center"/>
+              <w:rPr>
+                <w:rFonts w:eastAsia="Arial"/>
+                <w:sz w:val="14"/>
+                <w:szCs w:val="14"/>
+              </w:rPr>
+            </w:pPr>
+            <w:r>
+              <w:rPr>
+                <w:sz w:val="14"/>
+                <w:szCs w:val="14"/>
+              </w:rPr>
+              <w:t>0.03 ± 0.00</w:t>
             </w:r>
           </w:p>
         </w:tc>
         <w:tc>
           <w:tcPr>
             <w:tcW w:w="190" w:type="pct"/>
-            <w:shd w:val="clear" w:color="auto" w:fill="FFFFFF" w:themeFill="background1"/>
-            <w:vAlign w:val="center"/>
-          </w:tcPr>
-          <w:p>
-            <w:pPr>
-              <w:jc w:val="center"/>
-              <w:rPr>
-                <w:rFonts w:eastAsia="Arial"/>
-                <w:sz w:val="14"/>
-                <w:szCs w:val="14"/>
-              </w:rPr>
-            </w:pPr>
-            <w:r>
-              <w:rPr>
-                <w:rFonts w:eastAsia="Arial"/>
-                <w:sz w:val="14"/>
-                <w:szCs w:val="14"/>
-              </w:rPr>
-              <w:t>N/A</w:t>
+            <w:shd w:val="clear" w:color="auto" w:fill="auto"/>
+            <w:vAlign w:val="center"/>
+          </w:tcPr>
+          <w:p>
+            <w:pPr>
+              <w:jc w:val="center"/>
+              <w:rPr>
+                <w:rFonts w:eastAsia="Arial"/>
+                <w:sz w:val="14"/>
+                <w:szCs w:val="14"/>
+              </w:rPr>
+            </w:pPr>
+            <w:r>
+              <w:rPr>
+                <w:sz w:val="14"/>
+                <w:szCs w:val="14"/>
+              </w:rPr>
+              <w:t>53.47 ± 1.13</w:t>
             </w:r>
           </w:p>
         </w:tc>
         <w:tc>
           <w:tcPr>
             <w:tcW w:w="190" w:type="pct"/>
-            <w:shd w:val="clear" w:color="auto" w:fill="FFFFFF" w:themeFill="background1"/>
-            <w:vAlign w:val="center"/>
-          </w:tcPr>
-          <w:p>
-            <w:pPr>
-              <w:jc w:val="center"/>
-              <w:rPr>
-                <w:rFonts w:eastAsia="Arial"/>
-                <w:sz w:val="14"/>
-                <w:szCs w:val="14"/>
-              </w:rPr>
-            </w:pPr>
-            <w:r>
-              <w:rPr>
-                <w:rFonts w:eastAsia="Arial"/>
-                <w:sz w:val="14"/>
-                <w:szCs w:val="14"/>
-              </w:rPr>
-              <w:t>N/A</w:t>
+            <w:shd w:val="clear" w:color="auto" w:fill="auto"/>
+            <w:vAlign w:val="center"/>
+          </w:tcPr>
+          <w:p>
+            <w:pPr>
+              <w:jc w:val="center"/>
+              <w:rPr>
+                <w:rFonts w:eastAsia="Arial"/>
+                <w:sz w:val="14"/>
+                <w:szCs w:val="14"/>
+              </w:rPr>
+            </w:pPr>
+            <w:r>
+              <w:rPr>
+                <w:sz w:val="14"/>
+                <w:szCs w:val="14"/>
+              </w:rPr>
+              <w:t>2.82 ± 0.06</w:t>
             </w:r>
           </w:p>
         </w:tc>
         <w:tc>
           <w:tcPr>
             <w:tcW w:w="190" w:type="pct"/>
-            <w:shd w:val="clear" w:color="auto" w:fill="FFFFFF" w:themeFill="background1"/>
-            <w:vAlign w:val="center"/>
-          </w:tcPr>
-          <w:p>
-            <w:pPr>
-              <w:jc w:val="center"/>
-              <w:rPr>
-                <w:rFonts w:eastAsia="Arial"/>
-                <w:sz w:val="14"/>
-                <w:szCs w:val="14"/>
-              </w:rPr>
-            </w:pPr>
-            <w:r>
-              <w:rPr>
-                <w:rFonts w:eastAsia="Arial"/>
-                <w:sz w:val="14"/>
-                <w:szCs w:val="14"/>
-              </w:rPr>
-              <w:t>N/A</w:t>
+            <w:shd w:val="clear" w:color="auto" w:fill="auto"/>
+            <w:vAlign w:val="center"/>
+          </w:tcPr>
+          <w:p>
+            <w:pPr>
+              <w:jc w:val="center"/>
+              <w:rPr>
+                <w:rFonts w:eastAsia="Arial"/>
+                <w:sz w:val="14"/>
+                <w:szCs w:val="14"/>
+              </w:rPr>
+            </w:pPr>
+            <w:r>
+              <w:rPr>
+                <w:sz w:val="14"/>
+                <w:szCs w:val="14"/>
+              </w:rPr>
+              <w:t>2.82 ± 0.06</w:t>
             </w:r>
           </w:p>
         </w:tc>
         <w:tc>
           <w:tcPr>
             <w:tcW w:w="191" w:type="pct"/>
-            <w:shd w:val="clear" w:color="auto" w:fill="FFFFFF" w:themeFill="background1"/>
-            <w:vAlign w:val="center"/>
-          </w:tcPr>
-          <w:p>
-            <w:pPr>
-              <w:jc w:val="center"/>
-              <w:rPr>
-                <w:rFonts w:eastAsia="Arial"/>
-                <w:sz w:val="14"/>
-                <w:szCs w:val="14"/>
-              </w:rPr>
-            </w:pPr>
-            <w:r>
-              <w:rPr>
-                <w:rFonts w:eastAsia="Arial"/>
-                <w:sz w:val="14"/>
-                <w:szCs w:val="14"/>
-              </w:rPr>
-              <w:t>N/A</w:t>
+            <w:shd w:val="clear" w:color="auto" w:fill="auto"/>
+            <w:vAlign w:val="center"/>
+          </w:tcPr>
+          <w:p>
+            <w:pPr>
+              <w:jc w:val="center"/>
+              <w:rPr>
+                <w:rFonts w:eastAsia="Arial"/>
+                <w:sz w:val="14"/>
+                <w:szCs w:val="14"/>
+              </w:rPr>
+            </w:pPr>
+            <w:r>
+              <w:rPr>
+                <w:sz w:val="14"/>
+                <w:szCs w:val="14"/>
+              </w:rPr>
+              <w:t>53.22 ± 1.12</w:t>
             </w:r>
           </w:p>
         </w:tc>
@@ -3650,125 +3647,120 @@
         <w:tc>
           <w:tcPr>
             <w:tcW w:w="190" w:type="pct"/>
-            <w:shd w:val="clear" w:color="auto" w:fill="FFFFFF" w:themeFill="background1"/>
-            <w:vAlign w:val="center"/>
-          </w:tcPr>
-          <w:p>
-            <w:pPr>
-              <w:jc w:val="center"/>
-              <w:rPr>
-                <w:rFonts w:eastAsia="Arial"/>
-                <w:sz w:val="14"/>
-                <w:szCs w:val="14"/>
-              </w:rPr>
-            </w:pPr>
-            <w:r>
-              <w:rPr>
-                <w:rFonts w:eastAsia="Arial"/>
-                <w:sz w:val="14"/>
-                <w:szCs w:val="14"/>
-              </w:rPr>
-              <w:t>N/A</w:t>
+            <w:shd w:val="clear" w:color="auto" w:fill="auto"/>
+            <w:vAlign w:val="center"/>
+          </w:tcPr>
+          <w:p>
+            <w:pPr>
+              <w:jc w:val="center"/>
+              <w:rPr>
+                <w:rFonts w:eastAsia="Arial"/>
+                <w:sz w:val="14"/>
+                <w:szCs w:val="14"/>
+              </w:rPr>
+            </w:pPr>
+            <w:r>
+              <w:rPr>
+                <w:sz w:val="14"/>
+                <w:szCs w:val="14"/>
+              </w:rPr>
+              <w:t>0.03 ± 0.00</w:t>
             </w:r>
           </w:p>
         </w:tc>
         <w:tc>
           <w:tcPr>
             <w:tcW w:w="190" w:type="pct"/>
-            <w:shd w:val="clear" w:color="auto" w:fill="FFFFFF" w:themeFill="background1"/>
-            <w:vAlign w:val="center"/>
-          </w:tcPr>
-          <w:p>
-            <w:pPr>
-              <w:jc w:val="center"/>
-              <w:rPr>
-                <w:rFonts w:eastAsia="Arial"/>
-                <w:sz w:val="14"/>
-                <w:szCs w:val="14"/>
-              </w:rPr>
-            </w:pPr>
-            <w:r>
-              <w:rPr>
-                <w:rFonts w:eastAsia="Arial"/>
-                <w:sz w:val="14"/>
-                <w:szCs w:val="14"/>
-              </w:rPr>
-              <w:t>N/A</w:t>
+            <w:shd w:val="clear" w:color="auto" w:fill="auto"/>
+            <w:vAlign w:val="center"/>
+          </w:tcPr>
+          <w:p>
+            <w:pPr>
+              <w:jc w:val="center"/>
+              <w:rPr>
+                <w:rFonts w:eastAsia="Arial"/>
+                <w:sz w:val="14"/>
+                <w:szCs w:val="14"/>
+              </w:rPr>
+            </w:pPr>
+            <w:r>
+              <w:rPr>
+                <w:sz w:val="14"/>
+                <w:szCs w:val="14"/>
+              </w:rPr>
+              <w:t>55.15 ± 3.57</w:t>
             </w:r>
           </w:p>
         </w:tc>
         <w:tc>
           <w:tcPr>
             <w:tcW w:w="190" w:type="pct"/>
-            <w:shd w:val="clear" w:color="auto" w:fill="FFFFFF" w:themeFill="background1"/>
-            <w:vAlign w:val="center"/>
-          </w:tcPr>
-          <w:p>
-            <w:pPr>
-              <w:jc w:val="center"/>
-              <w:rPr>
-                <w:rFonts w:eastAsia="Arial"/>
-                <w:sz w:val="14"/>
-                <w:szCs w:val="14"/>
-              </w:rPr>
-            </w:pPr>
-            <w:r>
-              <w:rPr>
-                <w:rFonts w:eastAsia="Arial"/>
-                <w:sz w:val="14"/>
-                <w:szCs w:val="14"/>
-              </w:rPr>
-              <w:t>N/A</w:t>
+            <w:shd w:val="clear" w:color="auto" w:fill="auto"/>
+            <w:vAlign w:val="center"/>
+          </w:tcPr>
+          <w:p>
+            <w:pPr>
+              <w:jc w:val="center"/>
+              <w:rPr>
+                <w:rFonts w:eastAsia="Arial"/>
+                <w:sz w:val="14"/>
+                <w:szCs w:val="14"/>
+              </w:rPr>
+            </w:pPr>
+            <w:r>
+              <w:rPr>
+                <w:sz w:val="14"/>
+                <w:szCs w:val="14"/>
+              </w:rPr>
+              <w:t>2.74 ± 0.20</w:t>
             </w:r>
           </w:p>
         </w:tc>
         <w:tc>
           <w:tcPr>
             <w:tcW w:w="190" w:type="pct"/>
-            <w:shd w:val="clear" w:color="auto" w:fill="FFFFFF" w:themeFill="background1"/>
-            <w:vAlign w:val="center"/>
-          </w:tcPr>
-          <w:p>
-            <w:pPr>
-              <w:jc w:val="center"/>
-              <w:rPr>
-                <w:rFonts w:eastAsia="Arial"/>
-                <w:sz w:val="14"/>
-                <w:szCs w:val="14"/>
-              </w:rPr>
-            </w:pPr>
-            <w:r>
-              <w:rPr>
-                <w:rFonts w:eastAsia="Arial"/>
-                <w:sz w:val="14"/>
-                <w:szCs w:val="14"/>
-              </w:rPr>
-              <w:t>N/A</w:t>
+            <w:shd w:val="clear" w:color="auto" w:fill="auto"/>
+            <w:vAlign w:val="center"/>
+          </w:tcPr>
+          <w:p>
+            <w:pPr>
+              <w:jc w:val="center"/>
+              <w:rPr>
+                <w:rFonts w:eastAsia="Arial"/>
+                <w:sz w:val="14"/>
+                <w:szCs w:val="14"/>
+              </w:rPr>
+            </w:pPr>
+            <w:r>
+              <w:rPr>
+                <w:sz w:val="14"/>
+                <w:szCs w:val="14"/>
+              </w:rPr>
+              <w:t>2.74 ± 0.20</w:t>
             </w:r>
           </w:p>
         </w:tc>
         <w:tc>
           <w:tcPr>
             <w:tcW w:w="191" w:type="pct"/>
-            <w:shd w:val="clear" w:color="auto" w:fill="FFFFFF" w:themeFill="background1"/>
-            <w:vAlign w:val="center"/>
-          </w:tcPr>
-          <w:p>
-            <w:pPr>
-              <w:jc w:val="center"/>
-              <w:rPr>
-                <w:rFonts w:eastAsia="Arial"/>
-                <w:sz w:val="14"/>
-                <w:szCs w:val="14"/>
-              </w:rPr>
-            </w:pPr>
-            <w:r>
-              <w:rPr>
-                <w:rFonts w:eastAsia="Arial"/>
-                <w:sz w:val="14"/>
-                <w:szCs w:val="14"/>
-              </w:rPr>
-              <w:t>N/A</w:t>
+            <w:shd w:val="clear" w:color="auto" w:fill="auto"/>
+            <w:vAlign w:val="center"/>
+          </w:tcPr>
+          <w:p>
+            <w:pPr>
+              <w:jc w:val="center"/>
+              <w:rPr>
+                <w:rFonts w:eastAsia="Arial"/>
+                <w:sz w:val="14"/>
+                <w:szCs w:val="14"/>
+              </w:rPr>
+            </w:pPr>
+            <w:r>
+              <w:rPr>
+                <w:sz w:val="14"/>
+                <w:szCs w:val="14"/>
+              </w:rPr>
+              <w:t>54.92 ± 3.54</w:t>
             </w:r>
           </w:p>
         </w:tc>
@@ -3798,13 +3790,23 @@
                 <w:szCs w:val="16"/>
               </w:rPr>
             </w:pPr>
+            <w:proofErr w:type="spellStart"/>
             <w:r>
               <w:rPr>
                 <w:rFonts w:eastAsia="Arial"/>
                 <w:sz w:val="16"/>
                 <w:szCs w:val="16"/>
               </w:rPr>
-              <w:t>SparseGPT (unstructured)</w:t>
+              <w:t>SparseGPT</w:t>
+            </w:r>
+            <w:proofErr w:type="spellEnd"/>
+            <w:r>
+              <w:rPr>
+                <w:rFonts w:eastAsia="Arial"/>
+                <w:sz w:val="16"/>
+                <w:szCs w:val="16"/>
+              </w:rPr>
+              <w:t xml:space="preserve"> (unstructured)</w:t>
             </w:r>
           </w:p>
         </w:tc>
@@ -4266,125 +4268,120 @@
         <w:tc>
           <w:tcPr>
             <w:tcW w:w="190" w:type="pct"/>
-            <w:shd w:val="clear" w:color="auto" w:fill="FFFFFF" w:themeFill="background1"/>
-            <w:vAlign w:val="center"/>
-          </w:tcPr>
-          <w:p>
-            <w:pPr>
-              <w:jc w:val="center"/>
-              <w:rPr>
-                <w:rFonts w:eastAsia="Arial"/>
-                <w:sz w:val="14"/>
-                <w:szCs w:val="14"/>
-              </w:rPr>
-            </w:pPr>
-            <w:r>
-              <w:rPr>
-                <w:rFonts w:eastAsia="Arial"/>
-                <w:sz w:val="14"/>
-                <w:szCs w:val="14"/>
-              </w:rPr>
-              <w:t>N/A</w:t>
+            <w:shd w:val="clear" w:color="auto" w:fill="auto"/>
+            <w:vAlign w:val="center"/>
+          </w:tcPr>
+          <w:p>
+            <w:pPr>
+              <w:jc w:val="center"/>
+              <w:rPr>
+                <w:rFonts w:eastAsia="Arial"/>
+                <w:sz w:val="14"/>
+                <w:szCs w:val="14"/>
+              </w:rPr>
+            </w:pPr>
+            <w:r>
+              <w:rPr>
+                <w:sz w:val="14"/>
+                <w:szCs w:val="14"/>
+              </w:rPr>
+              <w:t>0.03 ± 0.00</w:t>
             </w:r>
           </w:p>
         </w:tc>
         <w:tc>
           <w:tcPr>
             <w:tcW w:w="190" w:type="pct"/>
-            <w:shd w:val="clear" w:color="auto" w:fill="FFFFFF" w:themeFill="background1"/>
-            <w:vAlign w:val="center"/>
-          </w:tcPr>
-          <w:p>
-            <w:pPr>
-              <w:jc w:val="center"/>
-              <w:rPr>
-                <w:rFonts w:eastAsia="Arial"/>
-                <w:sz w:val="14"/>
-                <w:szCs w:val="14"/>
-              </w:rPr>
-            </w:pPr>
-            <w:r>
-              <w:rPr>
-                <w:rFonts w:eastAsia="Arial"/>
-                <w:sz w:val="14"/>
-                <w:szCs w:val="14"/>
-              </w:rPr>
-              <w:t>N/A</w:t>
+            <w:shd w:val="clear" w:color="auto" w:fill="auto"/>
+            <w:vAlign w:val="center"/>
+          </w:tcPr>
+          <w:p>
+            <w:pPr>
+              <w:jc w:val="center"/>
+              <w:rPr>
+                <w:rFonts w:eastAsia="Arial"/>
+                <w:sz w:val="14"/>
+                <w:szCs w:val="14"/>
+              </w:rPr>
+            </w:pPr>
+            <w:r>
+              <w:rPr>
+                <w:sz w:val="14"/>
+                <w:szCs w:val="14"/>
+              </w:rPr>
+              <w:t>56.64 ± 0.96</w:t>
             </w:r>
           </w:p>
         </w:tc>
         <w:tc>
           <w:tcPr>
             <w:tcW w:w="190" w:type="pct"/>
-            <w:shd w:val="clear" w:color="auto" w:fill="FFFFFF" w:themeFill="background1"/>
-            <w:vAlign w:val="center"/>
-          </w:tcPr>
-          <w:p>
-            <w:pPr>
-              <w:jc w:val="center"/>
-              <w:rPr>
-                <w:rFonts w:eastAsia="Arial"/>
-                <w:sz w:val="14"/>
-                <w:szCs w:val="14"/>
-              </w:rPr>
-            </w:pPr>
-            <w:r>
-              <w:rPr>
-                <w:rFonts w:eastAsia="Arial"/>
-                <w:sz w:val="14"/>
-                <w:szCs w:val="14"/>
-              </w:rPr>
-              <w:t>N/A</w:t>
+            <w:shd w:val="clear" w:color="auto" w:fill="auto"/>
+            <w:vAlign w:val="center"/>
+          </w:tcPr>
+          <w:p>
+            <w:pPr>
+              <w:jc w:val="center"/>
+              <w:rPr>
+                <w:rFonts w:eastAsia="Arial"/>
+                <w:sz w:val="14"/>
+                <w:szCs w:val="14"/>
+              </w:rPr>
+            </w:pPr>
+            <w:r>
+              <w:rPr>
+                <w:sz w:val="14"/>
+                <w:szCs w:val="14"/>
+              </w:rPr>
+              <w:t>2.66 ± 0.05</w:t>
             </w:r>
           </w:p>
         </w:tc>
         <w:tc>
           <w:tcPr>
             <w:tcW w:w="190" w:type="pct"/>
-            <w:shd w:val="clear" w:color="auto" w:fill="FFFFFF" w:themeFill="background1"/>
-            <w:vAlign w:val="center"/>
-          </w:tcPr>
-          <w:p>
-            <w:pPr>
-              <w:jc w:val="center"/>
-              <w:rPr>
-                <w:rFonts w:eastAsia="Arial"/>
-                <w:sz w:val="14"/>
-                <w:szCs w:val="14"/>
-              </w:rPr>
-            </w:pPr>
-            <w:r>
-              <w:rPr>
-                <w:rFonts w:eastAsia="Arial"/>
-                <w:sz w:val="14"/>
-                <w:szCs w:val="14"/>
-              </w:rPr>
-              <w:t>N/A</w:t>
+            <w:shd w:val="clear" w:color="auto" w:fill="auto"/>
+            <w:vAlign w:val="center"/>
+          </w:tcPr>
+          <w:p>
+            <w:pPr>
+              <w:jc w:val="center"/>
+              <w:rPr>
+                <w:rFonts w:eastAsia="Arial"/>
+                <w:sz w:val="14"/>
+                <w:szCs w:val="14"/>
+              </w:rPr>
+            </w:pPr>
+            <w:r>
+              <w:rPr>
+                <w:sz w:val="14"/>
+                <w:szCs w:val="14"/>
+              </w:rPr>
+              <w:t>2.66 ± 0.05</w:t>
             </w:r>
           </w:p>
         </w:tc>
         <w:tc>
           <w:tcPr>
             <w:tcW w:w="191" w:type="pct"/>
-            <w:shd w:val="clear" w:color="auto" w:fill="FFFFFF" w:themeFill="background1"/>
-            <w:vAlign w:val="center"/>
-          </w:tcPr>
-          <w:p>
-            <w:pPr>
-              <w:jc w:val="center"/>
-              <w:rPr>
-                <w:rFonts w:eastAsia="Arial"/>
-                <w:sz w:val="14"/>
-                <w:szCs w:val="14"/>
-              </w:rPr>
-            </w:pPr>
-            <w:r>
-              <w:rPr>
-                <w:rFonts w:eastAsia="Arial"/>
-                <w:sz w:val="14"/>
-                <w:szCs w:val="14"/>
-              </w:rPr>
-              <w:t>N/A</w:t>
+            <w:shd w:val="clear" w:color="auto" w:fill="auto"/>
+            <w:vAlign w:val="center"/>
+          </w:tcPr>
+          <w:p>
+            <w:pPr>
+              <w:jc w:val="center"/>
+              <w:rPr>
+                <w:rFonts w:eastAsia="Arial"/>
+                <w:sz w:val="14"/>
+                <w:szCs w:val="14"/>
+              </w:rPr>
+            </w:pPr>
+            <w:r>
+              <w:rPr>
+                <w:sz w:val="14"/>
+                <w:szCs w:val="14"/>
+              </w:rPr>
+              <w:t>56.40 ± 0.95</w:t>
             </w:r>
           </w:p>
         </w:tc>
@@ -4874,125 +4871,120 @@
         <w:tc>
           <w:tcPr>
             <w:tcW w:w="190" w:type="pct"/>
-            <w:shd w:val="clear" w:color="auto" w:fill="FFFFFF" w:themeFill="background1"/>
-            <w:vAlign w:val="center"/>
-          </w:tcPr>
-          <w:p>
-            <w:pPr>
-              <w:jc w:val="center"/>
-              <w:rPr>
-                <w:rFonts w:eastAsia="Arial"/>
-                <w:sz w:val="14"/>
-                <w:szCs w:val="14"/>
-              </w:rPr>
-            </w:pPr>
-            <w:r>
-              <w:rPr>
-                <w:rFonts w:eastAsia="Arial"/>
-                <w:sz w:val="14"/>
-                <w:szCs w:val="14"/>
-              </w:rPr>
-              <w:t>N/A</w:t>
+            <w:shd w:val="clear" w:color="auto" w:fill="auto"/>
+            <w:vAlign w:val="center"/>
+          </w:tcPr>
+          <w:p>
+            <w:pPr>
+              <w:jc w:val="center"/>
+              <w:rPr>
+                <w:rFonts w:eastAsia="Arial"/>
+                <w:sz w:val="14"/>
+                <w:szCs w:val="14"/>
+              </w:rPr>
+            </w:pPr>
+            <w:r>
+              <w:rPr>
+                <w:sz w:val="14"/>
+                <w:szCs w:val="14"/>
+              </w:rPr>
+              <w:t>0.03 ± 0.00</w:t>
             </w:r>
           </w:p>
         </w:tc>
         <w:tc>
           <w:tcPr>
             <w:tcW w:w="190" w:type="pct"/>
-            <w:shd w:val="clear" w:color="auto" w:fill="FFFFFF" w:themeFill="background1"/>
-            <w:vAlign w:val="center"/>
-          </w:tcPr>
-          <w:p>
-            <w:pPr>
-              <w:jc w:val="center"/>
-              <w:rPr>
-                <w:rFonts w:eastAsia="Arial"/>
-                <w:sz w:val="14"/>
-                <w:szCs w:val="14"/>
-              </w:rPr>
-            </w:pPr>
-            <w:r>
-              <w:rPr>
-                <w:rFonts w:eastAsia="Arial"/>
-                <w:sz w:val="14"/>
-                <w:szCs w:val="14"/>
-              </w:rPr>
-              <w:t>N/A</w:t>
+            <w:shd w:val="clear" w:color="auto" w:fill="auto"/>
+            <w:vAlign w:val="center"/>
+          </w:tcPr>
+          <w:p>
+            <w:pPr>
+              <w:jc w:val="center"/>
+              <w:rPr>
+                <w:rFonts w:eastAsia="Arial"/>
+                <w:sz w:val="14"/>
+                <w:szCs w:val="14"/>
+              </w:rPr>
+            </w:pPr>
+            <w:r>
+              <w:rPr>
+                <w:sz w:val="14"/>
+                <w:szCs w:val="14"/>
+              </w:rPr>
+              <w:t>54.48 ± 4.45</w:t>
             </w:r>
           </w:p>
         </w:tc>
         <w:tc>
           <w:tcPr>
             <w:tcW w:w="190" w:type="pct"/>
-            <w:shd w:val="clear" w:color="auto" w:fill="FFFFFF" w:themeFill="background1"/>
-            <w:vAlign w:val="center"/>
-          </w:tcPr>
-          <w:p>
-            <w:pPr>
-              <w:jc w:val="center"/>
-              <w:rPr>
-                <w:rFonts w:eastAsia="Arial"/>
-                <w:sz w:val="14"/>
-                <w:szCs w:val="14"/>
-              </w:rPr>
-            </w:pPr>
-            <w:r>
-              <w:rPr>
-                <w:rFonts w:eastAsia="Arial"/>
-                <w:sz w:val="14"/>
-                <w:szCs w:val="14"/>
-              </w:rPr>
-              <w:t>N/A</w:t>
+            <w:shd w:val="clear" w:color="auto" w:fill="auto"/>
+            <w:vAlign w:val="center"/>
+          </w:tcPr>
+          <w:p>
+            <w:pPr>
+              <w:jc w:val="center"/>
+              <w:rPr>
+                <w:rFonts w:eastAsia="Arial"/>
+                <w:sz w:val="14"/>
+                <w:szCs w:val="14"/>
+              </w:rPr>
+            </w:pPr>
+            <w:r>
+              <w:rPr>
+                <w:sz w:val="14"/>
+                <w:szCs w:val="14"/>
+              </w:rPr>
+              <w:t>2.79 ± 0.28</w:t>
             </w:r>
           </w:p>
         </w:tc>
         <w:tc>
           <w:tcPr>
             <w:tcW w:w="190" w:type="pct"/>
-            <w:shd w:val="clear" w:color="auto" w:fill="FFFFFF" w:themeFill="background1"/>
-            <w:vAlign w:val="center"/>
-          </w:tcPr>
-          <w:p>
-            <w:pPr>
-              <w:jc w:val="center"/>
-              <w:rPr>
-                <w:rFonts w:eastAsia="Arial"/>
-                <w:sz w:val="14"/>
-                <w:szCs w:val="14"/>
-              </w:rPr>
-            </w:pPr>
-            <w:r>
-              <w:rPr>
-                <w:rFonts w:eastAsia="Arial"/>
-                <w:sz w:val="14"/>
-                <w:szCs w:val="14"/>
-              </w:rPr>
-              <w:t>N/A</w:t>
+            <w:shd w:val="clear" w:color="auto" w:fill="auto"/>
+            <w:vAlign w:val="center"/>
+          </w:tcPr>
+          <w:p>
+            <w:pPr>
+              <w:jc w:val="center"/>
+              <w:rPr>
+                <w:rFonts w:eastAsia="Arial"/>
+                <w:sz w:val="14"/>
+                <w:szCs w:val="14"/>
+              </w:rPr>
+            </w:pPr>
+            <w:r>
+              <w:rPr>
+                <w:sz w:val="14"/>
+                <w:szCs w:val="14"/>
+              </w:rPr>
+              <w:t>2.79 ± 0.28</w:t>
             </w:r>
           </w:p>
         </w:tc>
         <w:tc>
           <w:tcPr>
             <w:tcW w:w="191" w:type="pct"/>
-            <w:shd w:val="clear" w:color="auto" w:fill="FFFFFF" w:themeFill="background1"/>
-            <w:vAlign w:val="center"/>
-          </w:tcPr>
-          <w:p>
-            <w:pPr>
-              <w:jc w:val="center"/>
-              <w:rPr>
-                <w:rFonts w:eastAsia="Arial"/>
-                <w:sz w:val="14"/>
-                <w:szCs w:val="14"/>
-              </w:rPr>
-            </w:pPr>
-            <w:r>
-              <w:rPr>
-                <w:rFonts w:eastAsia="Arial"/>
-                <w:sz w:val="14"/>
-                <w:szCs w:val="14"/>
-              </w:rPr>
-              <w:t>N/A</w:t>
+            <w:shd w:val="clear" w:color="auto" w:fill="auto"/>
+            <w:vAlign w:val="center"/>
+          </w:tcPr>
+          <w:p>
+            <w:pPr>
+              <w:jc w:val="center"/>
+              <w:rPr>
+                <w:rFonts w:eastAsia="Arial"/>
+                <w:sz w:val="14"/>
+                <w:szCs w:val="14"/>
+              </w:rPr>
+            </w:pPr>
+            <w:r>
+              <w:rPr>
+                <w:sz w:val="14"/>
+                <w:szCs w:val="14"/>
+              </w:rPr>
+              <w:t>54.26 ± 4.40</w:t>
             </w:r>
           </w:p>
         </w:tc>
@@ -5482,125 +5474,120 @@
         <w:tc>
           <w:tcPr>
             <w:tcW w:w="190" w:type="pct"/>
-            <w:shd w:val="clear" w:color="auto" w:fill="FFFFFF" w:themeFill="background1"/>
-            <w:vAlign w:val="center"/>
-          </w:tcPr>
-          <w:p>
-            <w:pPr>
-              <w:jc w:val="center"/>
-              <w:rPr>
-                <w:rFonts w:eastAsia="Arial"/>
-                <w:sz w:val="14"/>
-                <w:szCs w:val="14"/>
-              </w:rPr>
-            </w:pPr>
-            <w:r>
-              <w:rPr>
-                <w:rFonts w:eastAsia="Arial"/>
-                <w:sz w:val="14"/>
-                <w:szCs w:val="14"/>
-              </w:rPr>
-              <w:t>N/A</w:t>
+            <w:shd w:val="clear" w:color="auto" w:fill="auto"/>
+            <w:vAlign w:val="center"/>
+          </w:tcPr>
+          <w:p>
+            <w:pPr>
+              <w:jc w:val="center"/>
+              <w:rPr>
+                <w:rFonts w:eastAsia="Arial"/>
+                <w:sz w:val="14"/>
+                <w:szCs w:val="14"/>
+              </w:rPr>
+            </w:pPr>
+            <w:r>
+              <w:rPr>
+                <w:sz w:val="14"/>
+                <w:szCs w:val="14"/>
+              </w:rPr>
+              <w:t>0.03 ± 0.00</w:t>
             </w:r>
           </w:p>
         </w:tc>
         <w:tc>
           <w:tcPr>
             <w:tcW w:w="190" w:type="pct"/>
-            <w:shd w:val="clear" w:color="auto" w:fill="FFFFFF" w:themeFill="background1"/>
-            <w:vAlign w:val="center"/>
-          </w:tcPr>
-          <w:p>
-            <w:pPr>
-              <w:jc w:val="center"/>
-              <w:rPr>
-                <w:rFonts w:eastAsia="Arial"/>
-                <w:sz w:val="14"/>
-                <w:szCs w:val="14"/>
-              </w:rPr>
-            </w:pPr>
-            <w:r>
-              <w:rPr>
-                <w:rFonts w:eastAsia="Arial"/>
-                <w:sz w:val="14"/>
-                <w:szCs w:val="14"/>
-              </w:rPr>
-              <w:t>N/A</w:t>
+            <w:shd w:val="clear" w:color="auto" w:fill="auto"/>
+            <w:vAlign w:val="center"/>
+          </w:tcPr>
+          <w:p>
+            <w:pPr>
+              <w:jc w:val="center"/>
+              <w:rPr>
+                <w:rFonts w:eastAsia="Arial"/>
+                <w:sz w:val="14"/>
+                <w:szCs w:val="14"/>
+              </w:rPr>
+            </w:pPr>
+            <w:r>
+              <w:rPr>
+                <w:sz w:val="14"/>
+                <w:szCs w:val="14"/>
+              </w:rPr>
+              <w:t>56.17 ± 1.72</w:t>
             </w:r>
           </w:p>
         </w:tc>
         <w:tc>
           <w:tcPr>
             <w:tcW w:w="190" w:type="pct"/>
-            <w:shd w:val="clear" w:color="auto" w:fill="FFFFFF" w:themeFill="background1"/>
-            <w:vAlign w:val="center"/>
-          </w:tcPr>
-          <w:p>
-            <w:pPr>
-              <w:jc w:val="center"/>
-              <w:rPr>
-                <w:rFonts w:eastAsia="Arial"/>
-                <w:sz w:val="14"/>
-                <w:szCs w:val="14"/>
-              </w:rPr>
-            </w:pPr>
-            <w:r>
-              <w:rPr>
-                <w:rFonts w:eastAsia="Arial"/>
-                <w:sz w:val="14"/>
-                <w:szCs w:val="14"/>
-              </w:rPr>
-              <w:t>N/A</w:t>
+            <w:shd w:val="clear" w:color="auto" w:fill="auto"/>
+            <w:vAlign w:val="center"/>
+          </w:tcPr>
+          <w:p>
+            <w:pPr>
+              <w:jc w:val="center"/>
+              <w:rPr>
+                <w:rFonts w:eastAsia="Arial"/>
+                <w:sz w:val="14"/>
+                <w:szCs w:val="14"/>
+              </w:rPr>
+            </w:pPr>
+            <w:r>
+              <w:rPr>
+                <w:sz w:val="14"/>
+                <w:szCs w:val="14"/>
+              </w:rPr>
+              <w:t>2.68 ± 0.09</w:t>
             </w:r>
           </w:p>
         </w:tc>
         <w:tc>
           <w:tcPr>
             <w:tcW w:w="190" w:type="pct"/>
-            <w:shd w:val="clear" w:color="auto" w:fill="FFFFFF" w:themeFill="background1"/>
-            <w:vAlign w:val="center"/>
-          </w:tcPr>
-          <w:p>
-            <w:pPr>
-              <w:jc w:val="center"/>
-              <w:rPr>
-                <w:rFonts w:eastAsia="Arial"/>
-                <w:sz w:val="14"/>
-                <w:szCs w:val="14"/>
-              </w:rPr>
-            </w:pPr>
-            <w:r>
-              <w:rPr>
-                <w:rFonts w:eastAsia="Arial"/>
-                <w:sz w:val="14"/>
-                <w:szCs w:val="14"/>
-              </w:rPr>
-              <w:t>N/A</w:t>
+            <w:shd w:val="clear" w:color="auto" w:fill="auto"/>
+            <w:vAlign w:val="center"/>
+          </w:tcPr>
+          <w:p>
+            <w:pPr>
+              <w:jc w:val="center"/>
+              <w:rPr>
+                <w:rFonts w:eastAsia="Arial"/>
+                <w:sz w:val="14"/>
+                <w:szCs w:val="14"/>
+              </w:rPr>
+            </w:pPr>
+            <w:r>
+              <w:rPr>
+                <w:sz w:val="14"/>
+                <w:szCs w:val="14"/>
+              </w:rPr>
+              <w:t>2.68 ± 0.09</w:t>
             </w:r>
           </w:p>
         </w:tc>
         <w:tc>
           <w:tcPr>
             <w:tcW w:w="191" w:type="pct"/>
-            <w:shd w:val="clear" w:color="auto" w:fill="FFFFFF" w:themeFill="background1"/>
-            <w:vAlign w:val="center"/>
-          </w:tcPr>
-          <w:p>
-            <w:pPr>
-              <w:jc w:val="center"/>
-              <w:rPr>
-                <w:rFonts w:eastAsia="Arial"/>
-                <w:sz w:val="14"/>
-                <w:szCs w:val="14"/>
-              </w:rPr>
-            </w:pPr>
-            <w:r>
-              <w:rPr>
-                <w:rFonts w:eastAsia="Arial"/>
-                <w:sz w:val="14"/>
-                <w:szCs w:val="14"/>
-              </w:rPr>
-              <w:t>N/A</w:t>
+            <w:shd w:val="clear" w:color="auto" w:fill="auto"/>
+            <w:vAlign w:val="center"/>
+          </w:tcPr>
+          <w:p>
+            <w:pPr>
+              <w:jc w:val="center"/>
+              <w:rPr>
+                <w:rFonts w:eastAsia="Arial"/>
+                <w:sz w:val="14"/>
+                <w:szCs w:val="14"/>
+              </w:rPr>
+            </w:pPr>
+            <w:r>
+              <w:rPr>
+                <w:sz w:val="14"/>
+                <w:szCs w:val="14"/>
+              </w:rPr>
+              <w:t>55.93 ± 1.70</w:t>
             </w:r>
           </w:p>
         </w:tc>
@@ -6303,125 +6290,120 @@
         <w:tc>
           <w:tcPr>
             <w:tcW w:w="190" w:type="pct"/>
-            <w:shd w:val="clear" w:color="auto" w:fill="FFFFFF" w:themeFill="background1"/>
-            <w:vAlign w:val="center"/>
-          </w:tcPr>
-          <w:p>
-            <w:pPr>
-              <w:jc w:val="center"/>
-              <w:rPr>
-                <w:rFonts w:eastAsia="Arial"/>
-                <w:sz w:val="14"/>
-                <w:szCs w:val="14"/>
-              </w:rPr>
-            </w:pPr>
-            <w:r>
-              <w:rPr>
-                <w:rFonts w:eastAsia="Arial"/>
-                <w:sz w:val="14"/>
-                <w:szCs w:val="14"/>
-              </w:rPr>
-              <w:t>N/A</w:t>
+            <w:shd w:val="clear" w:color="auto" w:fill="auto"/>
+            <w:vAlign w:val="center"/>
+          </w:tcPr>
+          <w:p>
+            <w:pPr>
+              <w:jc w:val="center"/>
+              <w:rPr>
+                <w:rFonts w:eastAsia="Arial"/>
+                <w:sz w:val="14"/>
+                <w:szCs w:val="14"/>
+              </w:rPr>
+            </w:pPr>
+            <w:r>
+              <w:rPr>
+                <w:sz w:val="14"/>
+                <w:szCs w:val="14"/>
+              </w:rPr>
+              <w:t>0.03 ± 0.00</w:t>
             </w:r>
           </w:p>
         </w:tc>
         <w:tc>
           <w:tcPr>
             <w:tcW w:w="190" w:type="pct"/>
-            <w:shd w:val="clear" w:color="auto" w:fill="FFFFFF" w:themeFill="background1"/>
-            <w:vAlign w:val="center"/>
-          </w:tcPr>
-          <w:p>
-            <w:pPr>
-              <w:jc w:val="center"/>
-              <w:rPr>
-                <w:rFonts w:eastAsia="Arial"/>
-                <w:sz w:val="14"/>
-                <w:szCs w:val="14"/>
-              </w:rPr>
-            </w:pPr>
-            <w:r>
-              <w:rPr>
-                <w:rFonts w:eastAsia="Arial"/>
-                <w:sz w:val="14"/>
-                <w:szCs w:val="14"/>
-              </w:rPr>
-              <w:t>N/A</w:t>
+            <w:shd w:val="clear" w:color="auto" w:fill="auto"/>
+            <w:vAlign w:val="center"/>
+          </w:tcPr>
+          <w:p>
+            <w:pPr>
+              <w:jc w:val="center"/>
+              <w:rPr>
+                <w:rFonts w:eastAsia="Arial"/>
+                <w:sz w:val="14"/>
+                <w:szCs w:val="14"/>
+              </w:rPr>
+            </w:pPr>
+            <w:r>
+              <w:rPr>
+                <w:sz w:val="14"/>
+                <w:szCs w:val="14"/>
+              </w:rPr>
+              <w:t>116.52 ± 1.01</w:t>
             </w:r>
           </w:p>
         </w:tc>
         <w:tc>
           <w:tcPr>
             <w:tcW w:w="190" w:type="pct"/>
-            <w:shd w:val="clear" w:color="auto" w:fill="FFFFFF" w:themeFill="background1"/>
-            <w:vAlign w:val="center"/>
-          </w:tcPr>
-          <w:p>
-            <w:pPr>
-              <w:jc w:val="center"/>
-              <w:rPr>
-                <w:rFonts w:eastAsia="Arial"/>
-                <w:sz w:val="14"/>
-                <w:szCs w:val="14"/>
-              </w:rPr>
-            </w:pPr>
-            <w:r>
-              <w:rPr>
-                <w:rFonts w:eastAsia="Arial"/>
-                <w:sz w:val="14"/>
-                <w:szCs w:val="14"/>
-              </w:rPr>
-              <w:t>N/A</w:t>
+            <w:shd w:val="clear" w:color="auto" w:fill="auto"/>
+            <w:vAlign w:val="center"/>
+          </w:tcPr>
+          <w:p>
+            <w:pPr>
+              <w:jc w:val="center"/>
+              <w:rPr>
+                <w:rFonts w:eastAsia="Arial"/>
+                <w:sz w:val="14"/>
+                <w:szCs w:val="14"/>
+              </w:rPr>
+            </w:pPr>
+            <w:r>
+              <w:rPr>
+                <w:sz w:val="14"/>
+                <w:szCs w:val="14"/>
+              </w:rPr>
+              <w:t>1.31 ± 0.01</w:t>
             </w:r>
           </w:p>
         </w:tc>
         <w:tc>
           <w:tcPr>
             <w:tcW w:w="190" w:type="pct"/>
-            <w:shd w:val="clear" w:color="auto" w:fill="FFFFFF" w:themeFill="background1"/>
-            <w:vAlign w:val="center"/>
-          </w:tcPr>
-          <w:p>
-            <w:pPr>
-              <w:jc w:val="center"/>
-              <w:rPr>
-                <w:rFonts w:eastAsia="Arial"/>
-                <w:sz w:val="14"/>
-                <w:szCs w:val="14"/>
-              </w:rPr>
-            </w:pPr>
-            <w:r>
-              <w:rPr>
-                <w:rFonts w:eastAsia="Arial"/>
-                <w:sz w:val="14"/>
-                <w:szCs w:val="14"/>
-              </w:rPr>
-              <w:t>N/A</w:t>
+            <w:shd w:val="clear" w:color="auto" w:fill="auto"/>
+            <w:vAlign w:val="center"/>
+          </w:tcPr>
+          <w:p>
+            <w:pPr>
+              <w:jc w:val="center"/>
+              <w:rPr>
+                <w:rFonts w:eastAsia="Arial"/>
+                <w:sz w:val="14"/>
+                <w:szCs w:val="14"/>
+              </w:rPr>
+            </w:pPr>
+            <w:r>
+              <w:rPr>
+                <w:sz w:val="14"/>
+                <w:szCs w:val="14"/>
+              </w:rPr>
+              <w:t>1.31 ± 0.01</w:t>
             </w:r>
           </w:p>
         </w:tc>
         <w:tc>
           <w:tcPr>
             <w:tcW w:w="191" w:type="pct"/>
-            <w:shd w:val="clear" w:color="auto" w:fill="FFFFFF" w:themeFill="background1"/>
-            <w:vAlign w:val="center"/>
-          </w:tcPr>
-          <w:p>
-            <w:pPr>
-              <w:jc w:val="center"/>
-              <w:rPr>
-                <w:rFonts w:eastAsia="Arial"/>
-                <w:sz w:val="14"/>
-                <w:szCs w:val="14"/>
-              </w:rPr>
-            </w:pPr>
-            <w:r>
-              <w:rPr>
-                <w:rFonts w:eastAsia="Arial"/>
-                <w:sz w:val="14"/>
-                <w:szCs w:val="14"/>
-              </w:rPr>
-              <w:t>N/A</w:t>
+            <w:shd w:val="clear" w:color="auto" w:fill="auto"/>
+            <w:vAlign w:val="center"/>
+          </w:tcPr>
+          <w:p>
+            <w:pPr>
+              <w:jc w:val="center"/>
+              <w:rPr>
+                <w:rFonts w:eastAsia="Arial"/>
+                <w:sz w:val="14"/>
+                <w:szCs w:val="14"/>
+              </w:rPr>
+            </w:pPr>
+            <w:r>
+              <w:rPr>
+                <w:sz w:val="14"/>
+                <w:szCs w:val="14"/>
+              </w:rPr>
+              <w:t>114.68 ± 0.94</w:t>
             </w:r>
           </w:p>
         </w:tc>
@@ -6910,125 +6892,120 @@
         <w:tc>
           <w:tcPr>
             <w:tcW w:w="190" w:type="pct"/>
-            <w:shd w:val="clear" w:color="auto" w:fill="FFFFFF" w:themeFill="background1"/>
-            <w:vAlign w:val="center"/>
-          </w:tcPr>
-          <w:p>
-            <w:pPr>
-              <w:jc w:val="center"/>
-              <w:rPr>
-                <w:rFonts w:eastAsia="Arial"/>
-                <w:sz w:val="14"/>
-                <w:szCs w:val="14"/>
-              </w:rPr>
-            </w:pPr>
-            <w:r>
-              <w:rPr>
-                <w:rFonts w:eastAsia="Arial"/>
-                <w:sz w:val="14"/>
-                <w:szCs w:val="14"/>
-              </w:rPr>
-              <w:t>N/A</w:t>
+            <w:shd w:val="clear" w:color="auto" w:fill="auto"/>
+            <w:vAlign w:val="center"/>
+          </w:tcPr>
+          <w:p>
+            <w:pPr>
+              <w:jc w:val="center"/>
+              <w:rPr>
+                <w:rFonts w:eastAsia="Arial"/>
+                <w:sz w:val="14"/>
+                <w:szCs w:val="14"/>
+              </w:rPr>
+            </w:pPr>
+            <w:r>
+              <w:rPr>
+                <w:sz w:val="14"/>
+                <w:szCs w:val="14"/>
+              </w:rPr>
+              <w:t>0.03 ± 0.00</w:t>
             </w:r>
           </w:p>
         </w:tc>
         <w:tc>
           <w:tcPr>
             <w:tcW w:w="190" w:type="pct"/>
-            <w:shd w:val="clear" w:color="auto" w:fill="FFFFFF" w:themeFill="background1"/>
-            <w:vAlign w:val="center"/>
-          </w:tcPr>
-          <w:p>
-            <w:pPr>
-              <w:jc w:val="center"/>
-              <w:rPr>
-                <w:rFonts w:eastAsia="Arial"/>
-                <w:sz w:val="14"/>
-                <w:szCs w:val="14"/>
-              </w:rPr>
-            </w:pPr>
-            <w:r>
-              <w:rPr>
-                <w:rFonts w:eastAsia="Arial"/>
-                <w:sz w:val="14"/>
-                <w:szCs w:val="14"/>
-              </w:rPr>
-              <w:t>N/A</w:t>
+            <w:shd w:val="clear" w:color="auto" w:fill="auto"/>
+            <w:vAlign w:val="center"/>
+          </w:tcPr>
+          <w:p>
+            <w:pPr>
+              <w:jc w:val="center"/>
+              <w:rPr>
+                <w:rFonts w:eastAsia="Arial"/>
+                <w:sz w:val="14"/>
+                <w:szCs w:val="14"/>
+              </w:rPr>
+            </w:pPr>
+            <w:r>
+              <w:rPr>
+                <w:sz w:val="14"/>
+                <w:szCs w:val="14"/>
+              </w:rPr>
+              <w:t>114.08 ± 1.76</w:t>
             </w:r>
           </w:p>
         </w:tc>
         <w:tc>
           <w:tcPr>
             <w:tcW w:w="190" w:type="pct"/>
-            <w:shd w:val="clear" w:color="auto" w:fill="FFFFFF" w:themeFill="background1"/>
-            <w:vAlign w:val="center"/>
-          </w:tcPr>
-          <w:p>
-            <w:pPr>
-              <w:jc w:val="center"/>
-              <w:rPr>
-                <w:rFonts w:eastAsia="Arial"/>
-                <w:sz w:val="14"/>
-                <w:szCs w:val="14"/>
-              </w:rPr>
-            </w:pPr>
-            <w:r>
-              <w:rPr>
-                <w:rFonts w:eastAsia="Arial"/>
-                <w:sz w:val="14"/>
-                <w:szCs w:val="14"/>
-              </w:rPr>
-              <w:t>N/A</w:t>
+            <w:shd w:val="clear" w:color="auto" w:fill="auto"/>
+            <w:vAlign w:val="center"/>
+          </w:tcPr>
+          <w:p>
+            <w:pPr>
+              <w:jc w:val="center"/>
+              <w:rPr>
+                <w:rFonts w:eastAsia="Arial"/>
+                <w:sz w:val="14"/>
+                <w:szCs w:val="14"/>
+              </w:rPr>
+            </w:pPr>
+            <w:r>
+              <w:rPr>
+                <w:sz w:val="14"/>
+                <w:szCs w:val="14"/>
+              </w:rPr>
+              <w:t>1.34 ± 0.02</w:t>
             </w:r>
           </w:p>
         </w:tc>
         <w:tc>
           <w:tcPr>
             <w:tcW w:w="190" w:type="pct"/>
-            <w:shd w:val="clear" w:color="auto" w:fill="FFFFFF" w:themeFill="background1"/>
-            <w:vAlign w:val="center"/>
-          </w:tcPr>
-          <w:p>
-            <w:pPr>
-              <w:jc w:val="center"/>
-              <w:rPr>
-                <w:rFonts w:eastAsia="Arial"/>
-                <w:sz w:val="14"/>
-                <w:szCs w:val="14"/>
-              </w:rPr>
-            </w:pPr>
-            <w:r>
-              <w:rPr>
-                <w:rFonts w:eastAsia="Arial"/>
-                <w:sz w:val="14"/>
-                <w:szCs w:val="14"/>
-              </w:rPr>
-              <w:t>N/A</w:t>
+            <w:shd w:val="clear" w:color="auto" w:fill="auto"/>
+            <w:vAlign w:val="center"/>
+          </w:tcPr>
+          <w:p>
+            <w:pPr>
+              <w:jc w:val="center"/>
+              <w:rPr>
+                <w:rFonts w:eastAsia="Arial"/>
+                <w:sz w:val="14"/>
+                <w:szCs w:val="14"/>
+              </w:rPr>
+            </w:pPr>
+            <w:r>
+              <w:rPr>
+                <w:sz w:val="14"/>
+                <w:szCs w:val="14"/>
+              </w:rPr>
+              <w:t>1.34 ± 0.02</w:t>
             </w:r>
           </w:p>
         </w:tc>
         <w:tc>
           <w:tcPr>
             <w:tcW w:w="191" w:type="pct"/>
-            <w:shd w:val="clear" w:color="auto" w:fill="FFFFFF" w:themeFill="background1"/>
-            <w:vAlign w:val="center"/>
-          </w:tcPr>
-          <w:p>
-            <w:pPr>
-              <w:jc w:val="center"/>
-              <w:rPr>
-                <w:rFonts w:eastAsia="Arial"/>
-                <w:sz w:val="14"/>
-                <w:szCs w:val="14"/>
-              </w:rPr>
-            </w:pPr>
-            <w:r>
-              <w:rPr>
-                <w:rFonts w:eastAsia="Arial"/>
-                <w:sz w:val="14"/>
-                <w:szCs w:val="14"/>
-              </w:rPr>
-              <w:t>N/A</w:t>
+            <w:shd w:val="clear" w:color="auto" w:fill="auto"/>
+            <w:vAlign w:val="center"/>
+          </w:tcPr>
+          <w:p>
+            <w:pPr>
+              <w:jc w:val="center"/>
+              <w:rPr>
+                <w:rFonts w:eastAsia="Arial"/>
+                <w:sz w:val="14"/>
+                <w:szCs w:val="14"/>
+              </w:rPr>
+            </w:pPr>
+            <w:r>
+              <w:rPr>
+                <w:sz w:val="14"/>
+                <w:szCs w:val="14"/>
+              </w:rPr>
+              <w:t>112.31 ± 1.69</w:t>
             </w:r>
           </w:p>
         </w:tc>
@@ -7739,125 +7716,120 @@
         <w:tc>
           <w:tcPr>
             <w:tcW w:w="190" w:type="pct"/>
-            <w:shd w:val="clear" w:color="auto" w:fill="FFFFFF" w:themeFill="background1"/>
-            <w:vAlign w:val="center"/>
-          </w:tcPr>
-          <w:p>
-            <w:pPr>
-              <w:jc w:val="center"/>
-              <w:rPr>
-                <w:rFonts w:eastAsia="Arial"/>
-                <w:sz w:val="14"/>
-                <w:szCs w:val="14"/>
-              </w:rPr>
-            </w:pPr>
-            <w:r>
-              <w:rPr>
-                <w:rFonts w:eastAsia="Arial"/>
-                <w:sz w:val="14"/>
-                <w:szCs w:val="14"/>
-              </w:rPr>
-              <w:t>N/A</w:t>
+            <w:shd w:val="clear" w:color="auto" w:fill="auto"/>
+            <w:vAlign w:val="center"/>
+          </w:tcPr>
+          <w:p>
+            <w:pPr>
+              <w:jc w:val="center"/>
+              <w:rPr>
+                <w:rFonts w:eastAsia="Arial"/>
+                <w:sz w:val="14"/>
+                <w:szCs w:val="14"/>
+              </w:rPr>
+            </w:pPr>
+            <w:r>
+              <w:rPr>
+                <w:sz w:val="14"/>
+                <w:szCs w:val="14"/>
+              </w:rPr>
+              <w:t>0.03 ± 0.00</w:t>
             </w:r>
           </w:p>
         </w:tc>
         <w:tc>
           <w:tcPr>
             <w:tcW w:w="190" w:type="pct"/>
-            <w:shd w:val="clear" w:color="auto" w:fill="FFFFFF" w:themeFill="background1"/>
-            <w:vAlign w:val="center"/>
-          </w:tcPr>
-          <w:p>
-            <w:pPr>
-              <w:jc w:val="center"/>
-              <w:rPr>
-                <w:rFonts w:eastAsia="Arial"/>
-                <w:sz w:val="14"/>
-                <w:szCs w:val="14"/>
-              </w:rPr>
-            </w:pPr>
-            <w:r>
-              <w:rPr>
-                <w:rFonts w:eastAsia="Arial"/>
-                <w:sz w:val="14"/>
-                <w:szCs w:val="14"/>
-              </w:rPr>
-              <w:t>N/A</w:t>
+            <w:shd w:val="clear" w:color="auto" w:fill="auto"/>
+            <w:vAlign w:val="center"/>
+          </w:tcPr>
+          <w:p>
+            <w:pPr>
+              <w:jc w:val="center"/>
+              <w:rPr>
+                <w:rFonts w:eastAsia="Arial"/>
+                <w:sz w:val="14"/>
+                <w:szCs w:val="14"/>
+              </w:rPr>
+            </w:pPr>
+            <w:r>
+              <w:rPr>
+                <w:sz w:val="14"/>
+                <w:szCs w:val="14"/>
+              </w:rPr>
+              <w:t>112.53 ± 2.16</w:t>
             </w:r>
           </w:p>
         </w:tc>
         <w:tc>
           <w:tcPr>
             <w:tcW w:w="190" w:type="pct"/>
-            <w:shd w:val="clear" w:color="auto" w:fill="FFFFFF" w:themeFill="background1"/>
-            <w:vAlign w:val="center"/>
-          </w:tcPr>
-          <w:p>
-            <w:pPr>
-              <w:jc w:val="center"/>
-              <w:rPr>
-                <w:rFonts w:eastAsia="Arial"/>
-                <w:sz w:val="14"/>
-                <w:szCs w:val="14"/>
-              </w:rPr>
-            </w:pPr>
-            <w:r>
-              <w:rPr>
-                <w:rFonts w:eastAsia="Arial"/>
-                <w:sz w:val="14"/>
-                <w:szCs w:val="14"/>
-              </w:rPr>
-              <w:t>N/A</w:t>
+            <w:shd w:val="clear" w:color="auto" w:fill="auto"/>
+            <w:vAlign w:val="center"/>
+          </w:tcPr>
+          <w:p>
+            <w:pPr>
+              <w:jc w:val="center"/>
+              <w:rPr>
+                <w:rFonts w:eastAsia="Arial"/>
+                <w:sz w:val="14"/>
+                <w:szCs w:val="14"/>
+              </w:rPr>
+            </w:pPr>
+            <w:r>
+              <w:rPr>
+                <w:sz w:val="14"/>
+                <w:szCs w:val="14"/>
+              </w:rPr>
+              <w:t>1.35 ± 0.03</w:t>
             </w:r>
           </w:p>
         </w:tc>
         <w:tc>
           <w:tcPr>
             <w:tcW w:w="190" w:type="pct"/>
-            <w:shd w:val="clear" w:color="auto" w:fill="FFFFFF" w:themeFill="background1"/>
-            <w:vAlign w:val="center"/>
-          </w:tcPr>
-          <w:p>
-            <w:pPr>
-              <w:jc w:val="center"/>
-              <w:rPr>
-                <w:rFonts w:eastAsia="Arial"/>
-                <w:sz w:val="14"/>
-                <w:szCs w:val="14"/>
-              </w:rPr>
-            </w:pPr>
-            <w:r>
-              <w:rPr>
-                <w:rFonts w:eastAsia="Arial"/>
-                <w:sz w:val="14"/>
-                <w:szCs w:val="14"/>
-              </w:rPr>
-              <w:t>N/A</w:t>
+            <w:shd w:val="clear" w:color="auto" w:fill="auto"/>
+            <w:vAlign w:val="center"/>
+          </w:tcPr>
+          <w:p>
+            <w:pPr>
+              <w:jc w:val="center"/>
+              <w:rPr>
+                <w:rFonts w:eastAsia="Arial"/>
+                <w:sz w:val="14"/>
+                <w:szCs w:val="14"/>
+              </w:rPr>
+            </w:pPr>
+            <w:r>
+              <w:rPr>
+                <w:sz w:val="14"/>
+                <w:szCs w:val="14"/>
+              </w:rPr>
+              <w:t>1.35 ± 0.03</w:t>
             </w:r>
           </w:p>
         </w:tc>
         <w:tc>
           <w:tcPr>
             <w:tcW w:w="191" w:type="pct"/>
-            <w:shd w:val="clear" w:color="auto" w:fill="FFFFFF" w:themeFill="background1"/>
-            <w:vAlign w:val="center"/>
-          </w:tcPr>
-          <w:p>
-            <w:pPr>
-              <w:jc w:val="center"/>
-              <w:rPr>
-                <w:rFonts w:eastAsia="Arial"/>
-                <w:sz w:val="14"/>
-                <w:szCs w:val="14"/>
-              </w:rPr>
-            </w:pPr>
-            <w:r>
-              <w:rPr>
-                <w:rFonts w:eastAsia="Arial"/>
-                <w:sz w:val="14"/>
-                <w:szCs w:val="14"/>
-              </w:rPr>
-              <w:t>N/A</w:t>
+            <w:shd w:val="clear" w:color="auto" w:fill="auto"/>
+            <w:vAlign w:val="center"/>
+          </w:tcPr>
+          <w:p>
+            <w:pPr>
+              <w:jc w:val="center"/>
+              <w:rPr>
+                <w:rFonts w:eastAsia="Arial"/>
+                <w:sz w:val="14"/>
+                <w:szCs w:val="14"/>
+              </w:rPr>
+            </w:pPr>
+            <w:r>
+              <w:rPr>
+                <w:sz w:val="14"/>
+                <w:szCs w:val="14"/>
+              </w:rPr>
+              <w:t>111.08 ± 2.09</w:t>
             </w:r>
           </w:p>
         </w:tc>
@@ -8347,125 +8319,120 @@
         <w:tc>
           <w:tcPr>
             <w:tcW w:w="190" w:type="pct"/>
-            <w:shd w:val="clear" w:color="auto" w:fill="FFFFFF" w:themeFill="background1"/>
-            <w:vAlign w:val="center"/>
-          </w:tcPr>
-          <w:p>
-            <w:pPr>
-              <w:jc w:val="center"/>
-              <w:rPr>
-                <w:rFonts w:eastAsia="Arial"/>
-                <w:sz w:val="14"/>
-                <w:szCs w:val="14"/>
-              </w:rPr>
-            </w:pPr>
-            <w:r>
-              <w:rPr>
-                <w:rFonts w:eastAsia="Arial"/>
-                <w:sz w:val="14"/>
-                <w:szCs w:val="14"/>
-              </w:rPr>
-              <w:t>N/A</w:t>
+            <w:shd w:val="clear" w:color="auto" w:fill="auto"/>
+            <w:vAlign w:val="center"/>
+          </w:tcPr>
+          <w:p>
+            <w:pPr>
+              <w:jc w:val="center"/>
+              <w:rPr>
+                <w:rFonts w:eastAsia="Arial"/>
+                <w:sz w:val="14"/>
+                <w:szCs w:val="14"/>
+              </w:rPr>
+            </w:pPr>
+            <w:r>
+              <w:rPr>
+                <w:sz w:val="14"/>
+                <w:szCs w:val="14"/>
+              </w:rPr>
+              <w:t>0.03 ± 0.00</w:t>
             </w:r>
           </w:p>
         </w:tc>
         <w:tc>
           <w:tcPr>
             <w:tcW w:w="190" w:type="pct"/>
-            <w:shd w:val="clear" w:color="auto" w:fill="FFFFFF" w:themeFill="background1"/>
-            <w:vAlign w:val="center"/>
-          </w:tcPr>
-          <w:p>
-            <w:pPr>
-              <w:jc w:val="center"/>
-              <w:rPr>
-                <w:rFonts w:eastAsia="Arial"/>
-                <w:sz w:val="14"/>
-                <w:szCs w:val="14"/>
-              </w:rPr>
-            </w:pPr>
-            <w:r>
-              <w:rPr>
-                <w:rFonts w:eastAsia="Arial"/>
-                <w:sz w:val="14"/>
-                <w:szCs w:val="14"/>
-              </w:rPr>
-              <w:t>N/A</w:t>
+            <w:shd w:val="clear" w:color="auto" w:fill="auto"/>
+            <w:vAlign w:val="center"/>
+          </w:tcPr>
+          <w:p>
+            <w:pPr>
+              <w:jc w:val="center"/>
+              <w:rPr>
+                <w:rFonts w:eastAsia="Arial"/>
+                <w:sz w:val="14"/>
+                <w:szCs w:val="14"/>
+              </w:rPr>
+            </w:pPr>
+            <w:r>
+              <w:rPr>
+                <w:sz w:val="14"/>
+                <w:szCs w:val="14"/>
+              </w:rPr>
+              <w:t>116.60 ± 1.39</w:t>
             </w:r>
           </w:p>
         </w:tc>
         <w:tc>
           <w:tcPr>
             <w:tcW w:w="190" w:type="pct"/>
-            <w:shd w:val="clear" w:color="auto" w:fill="FFFFFF" w:themeFill="background1"/>
-            <w:vAlign w:val="center"/>
-          </w:tcPr>
-          <w:p>
-            <w:pPr>
-              <w:jc w:val="center"/>
-              <w:rPr>
-                <w:rFonts w:eastAsia="Arial"/>
-                <w:sz w:val="14"/>
-                <w:szCs w:val="14"/>
-              </w:rPr>
-            </w:pPr>
-            <w:r>
-              <w:rPr>
-                <w:rFonts w:eastAsia="Arial"/>
-                <w:sz w:val="14"/>
-                <w:szCs w:val="14"/>
-              </w:rPr>
-              <w:t>N/A</w:t>
+            <w:shd w:val="clear" w:color="auto" w:fill="auto"/>
+            <w:vAlign w:val="center"/>
+          </w:tcPr>
+          <w:p>
+            <w:pPr>
+              <w:jc w:val="center"/>
+              <w:rPr>
+                <w:rFonts w:eastAsia="Arial"/>
+                <w:sz w:val="14"/>
+                <w:szCs w:val="14"/>
+              </w:rPr>
+            </w:pPr>
+            <w:r>
+              <w:rPr>
+                <w:sz w:val="14"/>
+                <w:szCs w:val="14"/>
+              </w:rPr>
+              <w:t>1.31 ± 0.02</w:t>
             </w:r>
           </w:p>
         </w:tc>
         <w:tc>
           <w:tcPr>
             <w:tcW w:w="190" w:type="pct"/>
-            <w:shd w:val="clear" w:color="auto" w:fill="FFFFFF" w:themeFill="background1"/>
-            <w:vAlign w:val="center"/>
-          </w:tcPr>
-          <w:p>
-            <w:pPr>
-              <w:jc w:val="center"/>
-              <w:rPr>
-                <w:rFonts w:eastAsia="Arial"/>
-                <w:sz w:val="14"/>
-                <w:szCs w:val="14"/>
-              </w:rPr>
-            </w:pPr>
-            <w:r>
-              <w:rPr>
-                <w:rFonts w:eastAsia="Arial"/>
-                <w:sz w:val="14"/>
-                <w:szCs w:val="14"/>
-              </w:rPr>
-              <w:t>N/A</w:t>
+            <w:shd w:val="clear" w:color="auto" w:fill="auto"/>
+            <w:vAlign w:val="center"/>
+          </w:tcPr>
+          <w:p>
+            <w:pPr>
+              <w:jc w:val="center"/>
+              <w:rPr>
+                <w:rFonts w:eastAsia="Arial"/>
+                <w:sz w:val="14"/>
+                <w:szCs w:val="14"/>
+              </w:rPr>
+            </w:pPr>
+            <w:r>
+              <w:rPr>
+                <w:sz w:val="14"/>
+                <w:szCs w:val="14"/>
+              </w:rPr>
+              <w:t>1.31 ± 0.02</w:t>
             </w:r>
           </w:p>
         </w:tc>
         <w:tc>
           <w:tcPr>
             <w:tcW w:w="191" w:type="pct"/>
-            <w:shd w:val="clear" w:color="auto" w:fill="FFFFFF" w:themeFill="background1"/>
-            <w:vAlign w:val="center"/>
-          </w:tcPr>
-          <w:p>
-            <w:pPr>
-              <w:jc w:val="center"/>
-              <w:rPr>
-                <w:rFonts w:eastAsia="Arial"/>
-                <w:sz w:val="14"/>
-                <w:szCs w:val="14"/>
-              </w:rPr>
-            </w:pPr>
-            <w:r>
-              <w:rPr>
-                <w:rFonts w:eastAsia="Arial"/>
-                <w:sz w:val="14"/>
-                <w:szCs w:val="14"/>
-              </w:rPr>
-              <w:t>N/A</w:t>
+            <w:shd w:val="clear" w:color="auto" w:fill="auto"/>
+            <w:vAlign w:val="center"/>
+          </w:tcPr>
+          <w:p>
+            <w:pPr>
+              <w:jc w:val="center"/>
+              <w:rPr>
+                <w:rFonts w:eastAsia="Arial"/>
+                <w:sz w:val="14"/>
+                <w:szCs w:val="14"/>
+              </w:rPr>
+            </w:pPr>
+            <w:r>
+              <w:rPr>
+                <w:sz w:val="14"/>
+                <w:szCs w:val="14"/>
+              </w:rPr>
+              <w:t>114.92 ± 1.33</w:t>
             </w:r>
           </w:p>
         </w:tc>
@@ -8955,125 +8922,120 @@
         <w:tc>
           <w:tcPr>
             <w:tcW w:w="190" w:type="pct"/>
-            <w:shd w:val="clear" w:color="auto" w:fill="FFFFFF" w:themeFill="background1"/>
-            <w:vAlign w:val="center"/>
-          </w:tcPr>
-          <w:p>
-            <w:pPr>
-              <w:jc w:val="center"/>
-              <w:rPr>
-                <w:rFonts w:eastAsia="Arial"/>
-                <w:sz w:val="14"/>
-                <w:szCs w:val="14"/>
-              </w:rPr>
-            </w:pPr>
-            <w:r>
-              <w:rPr>
-                <w:rFonts w:eastAsia="Arial"/>
-                <w:sz w:val="14"/>
-                <w:szCs w:val="14"/>
-              </w:rPr>
-              <w:t>N/A</w:t>
+            <w:shd w:val="clear" w:color="auto" w:fill="auto"/>
+            <w:vAlign w:val="center"/>
+          </w:tcPr>
+          <w:p>
+            <w:pPr>
+              <w:jc w:val="center"/>
+              <w:rPr>
+                <w:rFonts w:eastAsia="Arial"/>
+                <w:sz w:val="14"/>
+                <w:szCs w:val="14"/>
+              </w:rPr>
+            </w:pPr>
+            <w:r>
+              <w:rPr>
+                <w:sz w:val="14"/>
+                <w:szCs w:val="14"/>
+              </w:rPr>
+              <w:t>0.03 ± 0.00</w:t>
             </w:r>
           </w:p>
         </w:tc>
         <w:tc>
           <w:tcPr>
             <w:tcW w:w="190" w:type="pct"/>
-            <w:shd w:val="clear" w:color="auto" w:fill="FFFFFF" w:themeFill="background1"/>
-            <w:vAlign w:val="center"/>
-          </w:tcPr>
-          <w:p>
-            <w:pPr>
-              <w:jc w:val="center"/>
-              <w:rPr>
-                <w:rFonts w:eastAsia="Arial"/>
-                <w:sz w:val="14"/>
-                <w:szCs w:val="14"/>
-              </w:rPr>
-            </w:pPr>
-            <w:r>
-              <w:rPr>
-                <w:rFonts w:eastAsia="Arial"/>
-                <w:sz w:val="14"/>
-                <w:szCs w:val="14"/>
-              </w:rPr>
-              <w:t>N/A</w:t>
+            <w:shd w:val="clear" w:color="auto" w:fill="auto"/>
+            <w:vAlign w:val="center"/>
+          </w:tcPr>
+          <w:p>
+            <w:pPr>
+              <w:jc w:val="center"/>
+              <w:rPr>
+                <w:rFonts w:eastAsia="Arial"/>
+                <w:sz w:val="14"/>
+                <w:szCs w:val="14"/>
+              </w:rPr>
+            </w:pPr>
+            <w:r>
+              <w:rPr>
+                <w:sz w:val="14"/>
+                <w:szCs w:val="14"/>
+              </w:rPr>
+              <w:t>116.05 ± 1.78</w:t>
             </w:r>
           </w:p>
         </w:tc>
         <w:tc>
           <w:tcPr>
             <w:tcW w:w="190" w:type="pct"/>
-            <w:shd w:val="clear" w:color="auto" w:fill="FFFFFF" w:themeFill="background1"/>
-            <w:vAlign w:val="center"/>
-          </w:tcPr>
-          <w:p>
-            <w:pPr>
-              <w:jc w:val="center"/>
-              <w:rPr>
-                <w:rFonts w:eastAsia="Arial"/>
-                <w:sz w:val="14"/>
-                <w:szCs w:val="14"/>
-              </w:rPr>
-            </w:pPr>
-            <w:r>
-              <w:rPr>
-                <w:rFonts w:eastAsia="Arial"/>
-                <w:sz w:val="14"/>
-                <w:szCs w:val="14"/>
-              </w:rPr>
-              <w:t>N/A</w:t>
+            <w:shd w:val="clear" w:color="auto" w:fill="auto"/>
+            <w:vAlign w:val="center"/>
+          </w:tcPr>
+          <w:p>
+            <w:pPr>
+              <w:jc w:val="center"/>
+              <w:rPr>
+                <w:rFonts w:eastAsia="Arial"/>
+                <w:sz w:val="14"/>
+                <w:szCs w:val="14"/>
+              </w:rPr>
+            </w:pPr>
+            <w:r>
+              <w:rPr>
+                <w:sz w:val="14"/>
+                <w:szCs w:val="14"/>
+              </w:rPr>
+              <w:t>1.31 ± 0.02</w:t>
             </w:r>
           </w:p>
         </w:tc>
         <w:tc>
           <w:tcPr>
             <w:tcW w:w="190" w:type="pct"/>
-            <w:shd w:val="clear" w:color="auto" w:fill="FFFFFF" w:themeFill="background1"/>
-            <w:vAlign w:val="center"/>
-          </w:tcPr>
-          <w:p>
-            <w:pPr>
-              <w:jc w:val="center"/>
-              <w:rPr>
-                <w:rFonts w:eastAsia="Arial"/>
-                <w:sz w:val="14"/>
-                <w:szCs w:val="14"/>
-              </w:rPr>
-            </w:pPr>
-            <w:r>
-              <w:rPr>
-                <w:rFonts w:eastAsia="Arial"/>
-                <w:sz w:val="14"/>
-                <w:szCs w:val="14"/>
-              </w:rPr>
-              <w:t>N/A</w:t>
+            <w:shd w:val="clear" w:color="auto" w:fill="auto"/>
+            <w:vAlign w:val="center"/>
+          </w:tcPr>
+          <w:p>
+            <w:pPr>
+              <w:jc w:val="center"/>
+              <w:rPr>
+                <w:rFonts w:eastAsia="Arial"/>
+                <w:sz w:val="14"/>
+                <w:szCs w:val="14"/>
+              </w:rPr>
+            </w:pPr>
+            <w:r>
+              <w:rPr>
+                <w:sz w:val="14"/>
+                <w:szCs w:val="14"/>
+              </w:rPr>
+              <w:t>1.31 ± 0.02</w:t>
             </w:r>
           </w:p>
         </w:tc>
         <w:tc>
           <w:tcPr>
             <w:tcW w:w="191" w:type="pct"/>
-            <w:shd w:val="clear" w:color="auto" w:fill="FFFFFF" w:themeFill="background1"/>
-            <w:vAlign w:val="center"/>
-          </w:tcPr>
-          <w:p>
-            <w:pPr>
-              <w:jc w:val="center"/>
-              <w:rPr>
-                <w:rFonts w:eastAsia="Arial"/>
-                <w:sz w:val="14"/>
-                <w:szCs w:val="14"/>
-              </w:rPr>
-            </w:pPr>
-            <w:r>
-              <w:rPr>
-                <w:rFonts w:eastAsia="Arial"/>
-                <w:sz w:val="14"/>
-                <w:szCs w:val="14"/>
-              </w:rPr>
-              <w:t>N/A</w:t>
+            <w:shd w:val="clear" w:color="auto" w:fill="auto"/>
+            <w:vAlign w:val="center"/>
+          </w:tcPr>
+          <w:p>
+            <w:pPr>
+              <w:jc w:val="center"/>
+              <w:rPr>
+                <w:rFonts w:eastAsia="Arial"/>
+                <w:sz w:val="14"/>
+                <w:szCs w:val="14"/>
+              </w:rPr>
+            </w:pPr>
+            <w:r>
+              <w:rPr>
+                <w:sz w:val="14"/>
+                <w:szCs w:val="14"/>
+              </w:rPr>
+              <w:t>114.50 ± 1.75</w:t>
             </w:r>
           </w:p>
         </w:tc>
@@ -9571,125 +9533,120 @@
         <w:tc>
           <w:tcPr>
             <w:tcW w:w="190" w:type="pct"/>
-            <w:shd w:val="clear" w:color="auto" w:fill="FFFFFF" w:themeFill="background1"/>
-            <w:vAlign w:val="center"/>
-          </w:tcPr>
-          <w:p>
-            <w:pPr>
-              <w:jc w:val="center"/>
-              <w:rPr>
-                <w:rFonts w:eastAsia="Arial"/>
-                <w:sz w:val="14"/>
-                <w:szCs w:val="14"/>
-              </w:rPr>
-            </w:pPr>
-            <w:r>
-              <w:rPr>
-                <w:rFonts w:eastAsia="Arial"/>
-                <w:sz w:val="14"/>
-                <w:szCs w:val="14"/>
-              </w:rPr>
-              <w:t>N/A</w:t>
+            <w:shd w:val="clear" w:color="auto" w:fill="auto"/>
+            <w:vAlign w:val="center"/>
+          </w:tcPr>
+          <w:p>
+            <w:pPr>
+              <w:jc w:val="center"/>
+              <w:rPr>
+                <w:rFonts w:eastAsia="Arial"/>
+                <w:sz w:val="14"/>
+                <w:szCs w:val="14"/>
+              </w:rPr>
+            </w:pPr>
+            <w:r>
+              <w:rPr>
+                <w:sz w:val="14"/>
+                <w:szCs w:val="14"/>
+              </w:rPr>
+              <w:t>0.03 ± 0.00</w:t>
             </w:r>
           </w:p>
         </w:tc>
         <w:tc>
           <w:tcPr>
             <w:tcW w:w="190" w:type="pct"/>
-            <w:shd w:val="clear" w:color="auto" w:fill="FFFFFF" w:themeFill="background1"/>
-            <w:vAlign w:val="center"/>
-          </w:tcPr>
-          <w:p>
-            <w:pPr>
-              <w:jc w:val="center"/>
-              <w:rPr>
-                <w:rFonts w:eastAsia="Arial"/>
-                <w:sz w:val="14"/>
-                <w:szCs w:val="14"/>
-              </w:rPr>
-            </w:pPr>
-            <w:r>
-              <w:rPr>
-                <w:rFonts w:eastAsia="Arial"/>
-                <w:sz w:val="14"/>
-                <w:szCs w:val="14"/>
-              </w:rPr>
-              <w:t>N/A</w:t>
+            <w:shd w:val="clear" w:color="auto" w:fill="auto"/>
+            <w:vAlign w:val="center"/>
+          </w:tcPr>
+          <w:p>
+            <w:pPr>
+              <w:jc w:val="center"/>
+              <w:rPr>
+                <w:rFonts w:eastAsia="Arial"/>
+                <w:sz w:val="14"/>
+                <w:szCs w:val="14"/>
+              </w:rPr>
+            </w:pPr>
+            <w:r>
+              <w:rPr>
+                <w:sz w:val="14"/>
+                <w:szCs w:val="14"/>
+              </w:rPr>
+              <w:t>115.21 ± 1.77</w:t>
             </w:r>
           </w:p>
         </w:tc>
         <w:tc>
           <w:tcPr>
             <w:tcW w:w="190" w:type="pct"/>
-            <w:shd w:val="clear" w:color="auto" w:fill="FFFFFF" w:themeFill="background1"/>
-            <w:vAlign w:val="center"/>
-          </w:tcPr>
-          <w:p>
-            <w:pPr>
-              <w:jc w:val="center"/>
-              <w:rPr>
-                <w:rFonts w:eastAsia="Arial"/>
-                <w:sz w:val="14"/>
-                <w:szCs w:val="14"/>
-              </w:rPr>
-            </w:pPr>
-            <w:r>
-              <w:rPr>
-                <w:rFonts w:eastAsia="Arial"/>
-                <w:sz w:val="14"/>
-                <w:szCs w:val="14"/>
-              </w:rPr>
-              <w:t>N/A</w:t>
+            <w:shd w:val="clear" w:color="auto" w:fill="auto"/>
+            <w:vAlign w:val="center"/>
+          </w:tcPr>
+          <w:p>
+            <w:pPr>
+              <w:jc w:val="center"/>
+              <w:rPr>
+                <w:rFonts w:eastAsia="Arial"/>
+                <w:sz w:val="14"/>
+                <w:szCs w:val="14"/>
+              </w:rPr>
+            </w:pPr>
+            <w:r>
+              <w:rPr>
+                <w:sz w:val="14"/>
+                <w:szCs w:val="14"/>
+              </w:rPr>
+              <w:t>1.32 ± 0.02</w:t>
             </w:r>
           </w:p>
         </w:tc>
         <w:tc>
           <w:tcPr>
             <w:tcW w:w="190" w:type="pct"/>
-            <w:shd w:val="clear" w:color="auto" w:fill="FFFFFF" w:themeFill="background1"/>
-            <w:vAlign w:val="center"/>
-          </w:tcPr>
-          <w:p>
-            <w:pPr>
-              <w:jc w:val="center"/>
-              <w:rPr>
-                <w:rFonts w:eastAsia="Arial"/>
-                <w:sz w:val="14"/>
-                <w:szCs w:val="14"/>
-              </w:rPr>
-            </w:pPr>
-            <w:r>
-              <w:rPr>
-                <w:rFonts w:eastAsia="Arial"/>
-                <w:sz w:val="14"/>
-                <w:szCs w:val="14"/>
-              </w:rPr>
-              <w:t>N/A</w:t>
+            <w:shd w:val="clear" w:color="auto" w:fill="auto"/>
+            <w:vAlign w:val="center"/>
+          </w:tcPr>
+          <w:p>
+            <w:pPr>
+              <w:jc w:val="center"/>
+              <w:rPr>
+                <w:rFonts w:eastAsia="Arial"/>
+                <w:sz w:val="14"/>
+                <w:szCs w:val="14"/>
+              </w:rPr>
+            </w:pPr>
+            <w:r>
+              <w:rPr>
+                <w:sz w:val="14"/>
+                <w:szCs w:val="14"/>
+              </w:rPr>
+              <w:t>1.32 ± 0.02</w:t>
             </w:r>
           </w:p>
         </w:tc>
         <w:tc>
           <w:tcPr>
             <w:tcW w:w="191" w:type="pct"/>
-            <w:shd w:val="clear" w:color="auto" w:fill="FFFFFF" w:themeFill="background1"/>
-            <w:vAlign w:val="center"/>
-          </w:tcPr>
-          <w:p>
-            <w:pPr>
-              <w:jc w:val="center"/>
-              <w:rPr>
-                <w:rFonts w:eastAsia="Arial"/>
-                <w:sz w:val="14"/>
-                <w:szCs w:val="14"/>
-              </w:rPr>
-            </w:pPr>
-            <w:r>
-              <w:rPr>
-                <w:rFonts w:eastAsia="Arial"/>
-                <w:sz w:val="14"/>
-                <w:szCs w:val="14"/>
-              </w:rPr>
-              <w:t>N/A</w:t>
+            <w:shd w:val="clear" w:color="auto" w:fill="auto"/>
+            <w:vAlign w:val="center"/>
+          </w:tcPr>
+          <w:p>
+            <w:pPr>
+              <w:jc w:val="center"/>
+              <w:rPr>
+                <w:rFonts w:eastAsia="Arial"/>
+                <w:sz w:val="14"/>
+                <w:szCs w:val="14"/>
+              </w:rPr>
+            </w:pPr>
+            <w:r>
+              <w:rPr>
+                <w:sz w:val="14"/>
+                <w:szCs w:val="14"/>
+              </w:rPr>
+              <w:t>113.66 ± 1.71</w:t>
             </w:r>
           </w:p>
         </w:tc>
@@ -10179,125 +10136,120 @@
         <w:tc>
           <w:tcPr>
             <w:tcW w:w="190" w:type="pct"/>
-            <w:shd w:val="clear" w:color="auto" w:fill="FFFFFF" w:themeFill="background1"/>
-            <w:vAlign w:val="center"/>
-          </w:tcPr>
-          <w:p>
-            <w:pPr>
-              <w:jc w:val="center"/>
-              <w:rPr>
-                <w:rFonts w:eastAsia="Arial"/>
-                <w:sz w:val="14"/>
-                <w:szCs w:val="14"/>
-              </w:rPr>
-            </w:pPr>
-            <w:r>
-              <w:rPr>
-                <w:rFonts w:eastAsia="Arial"/>
-                <w:sz w:val="14"/>
-                <w:szCs w:val="14"/>
-              </w:rPr>
-              <w:t>N/A</w:t>
+            <w:shd w:val="clear" w:color="auto" w:fill="auto"/>
+            <w:vAlign w:val="center"/>
+          </w:tcPr>
+          <w:p>
+            <w:pPr>
+              <w:jc w:val="center"/>
+              <w:rPr>
+                <w:rFonts w:eastAsia="Arial"/>
+                <w:sz w:val="14"/>
+                <w:szCs w:val="14"/>
+              </w:rPr>
+            </w:pPr>
+            <w:r>
+              <w:rPr>
+                <w:sz w:val="14"/>
+                <w:szCs w:val="14"/>
+              </w:rPr>
+              <w:t>0.03 ± 0.00</w:t>
             </w:r>
           </w:p>
         </w:tc>
         <w:tc>
           <w:tcPr>
             <w:tcW w:w="190" w:type="pct"/>
-            <w:shd w:val="clear" w:color="auto" w:fill="FFFFFF" w:themeFill="background1"/>
-            <w:vAlign w:val="center"/>
-          </w:tcPr>
-          <w:p>
-            <w:pPr>
-              <w:jc w:val="center"/>
-              <w:rPr>
-                <w:rFonts w:eastAsia="Arial"/>
-                <w:sz w:val="14"/>
-                <w:szCs w:val="14"/>
-              </w:rPr>
-            </w:pPr>
-            <w:r>
-              <w:rPr>
-                <w:rFonts w:eastAsia="Arial"/>
-                <w:sz w:val="14"/>
-                <w:szCs w:val="14"/>
-              </w:rPr>
-              <w:t>N/A</w:t>
+            <w:shd w:val="clear" w:color="auto" w:fill="auto"/>
+            <w:vAlign w:val="center"/>
+          </w:tcPr>
+          <w:p>
+            <w:pPr>
+              <w:jc w:val="center"/>
+              <w:rPr>
+                <w:rFonts w:eastAsia="Arial"/>
+                <w:sz w:val="14"/>
+                <w:szCs w:val="14"/>
+              </w:rPr>
+            </w:pPr>
+            <w:r>
+              <w:rPr>
+                <w:sz w:val="14"/>
+                <w:szCs w:val="14"/>
+              </w:rPr>
+              <w:t>117.12 ± 1.14</w:t>
             </w:r>
           </w:p>
         </w:tc>
         <w:tc>
           <w:tcPr>
             <w:tcW w:w="190" w:type="pct"/>
-            <w:shd w:val="clear" w:color="auto" w:fill="FFFFFF" w:themeFill="background1"/>
-            <w:vAlign w:val="center"/>
-          </w:tcPr>
-          <w:p>
-            <w:pPr>
-              <w:jc w:val="center"/>
-              <w:rPr>
-                <w:rFonts w:eastAsia="Arial"/>
-                <w:sz w:val="14"/>
-                <w:szCs w:val="14"/>
-              </w:rPr>
-            </w:pPr>
-            <w:r>
-              <w:rPr>
-                <w:rFonts w:eastAsia="Arial"/>
-                <w:sz w:val="14"/>
-                <w:szCs w:val="14"/>
-              </w:rPr>
-              <w:t>N/A</w:t>
+            <w:shd w:val="clear" w:color="auto" w:fill="auto"/>
+            <w:vAlign w:val="center"/>
+          </w:tcPr>
+          <w:p>
+            <w:pPr>
+              <w:jc w:val="center"/>
+              <w:rPr>
+                <w:rFonts w:eastAsia="Arial"/>
+                <w:sz w:val="14"/>
+                <w:szCs w:val="14"/>
+              </w:rPr>
+            </w:pPr>
+            <w:r>
+              <w:rPr>
+                <w:sz w:val="14"/>
+                <w:szCs w:val="14"/>
+              </w:rPr>
+              <w:t>1.30 ± 0.01</w:t>
             </w:r>
           </w:p>
         </w:tc>
         <w:tc>
           <w:tcPr>
             <w:tcW w:w="190" w:type="pct"/>
-            <w:shd w:val="clear" w:color="auto" w:fill="FFFFFF" w:themeFill="background1"/>
-            <w:vAlign w:val="center"/>
-          </w:tcPr>
-          <w:p>
-            <w:pPr>
-              <w:jc w:val="center"/>
-              <w:rPr>
-                <w:rFonts w:eastAsia="Arial"/>
-                <w:sz w:val="14"/>
-                <w:szCs w:val="14"/>
-              </w:rPr>
-            </w:pPr>
-            <w:r>
-              <w:rPr>
-                <w:rFonts w:eastAsia="Arial"/>
-                <w:sz w:val="14"/>
-                <w:szCs w:val="14"/>
-              </w:rPr>
-              <w:t>N/A</w:t>
+            <w:shd w:val="clear" w:color="auto" w:fill="auto"/>
+            <w:vAlign w:val="center"/>
+          </w:tcPr>
+          <w:p>
+            <w:pPr>
+              <w:jc w:val="center"/>
+              <w:rPr>
+                <w:rFonts w:eastAsia="Arial"/>
+                <w:sz w:val="14"/>
+                <w:szCs w:val="14"/>
+              </w:rPr>
+            </w:pPr>
+            <w:r>
+              <w:rPr>
+                <w:sz w:val="14"/>
+                <w:szCs w:val="14"/>
+              </w:rPr>
+              <w:t>1.30 ± 0.01</w:t>
             </w:r>
           </w:p>
         </w:tc>
         <w:tc>
           <w:tcPr>
             <w:tcW w:w="191" w:type="pct"/>
-            <w:shd w:val="clear" w:color="auto" w:fill="FFFFFF" w:themeFill="background1"/>
-            <w:vAlign w:val="center"/>
-          </w:tcPr>
-          <w:p>
-            <w:pPr>
-              <w:jc w:val="center"/>
-              <w:rPr>
-                <w:rFonts w:eastAsia="Arial"/>
-                <w:sz w:val="14"/>
-                <w:szCs w:val="14"/>
-              </w:rPr>
-            </w:pPr>
-            <w:r>
-              <w:rPr>
-                <w:rFonts w:eastAsia="Arial"/>
-                <w:sz w:val="14"/>
-                <w:szCs w:val="14"/>
-              </w:rPr>
-              <w:t>N/A</w:t>
+            <w:shd w:val="clear" w:color="auto" w:fill="auto"/>
+            <w:vAlign w:val="center"/>
+          </w:tcPr>
+          <w:p>
+            <w:pPr>
+              <w:jc w:val="center"/>
+              <w:rPr>
+                <w:rFonts w:eastAsia="Arial"/>
+                <w:sz w:val="14"/>
+                <w:szCs w:val="14"/>
+              </w:rPr>
+            </w:pPr>
+            <w:r>
+              <w:rPr>
+                <w:sz w:val="14"/>
+                <w:szCs w:val="14"/>
+              </w:rPr>
+              <w:t>115.27 ± 1.10</w:t>
             </w:r>
           </w:p>
         </w:tc>
@@ -10787,125 +10739,120 @@
         <w:tc>
           <w:tcPr>
             <w:tcW w:w="190" w:type="pct"/>
-            <w:shd w:val="clear" w:color="auto" w:fill="FFFFFF" w:themeFill="background1"/>
-            <w:vAlign w:val="center"/>
-          </w:tcPr>
-          <w:p>
-            <w:pPr>
-              <w:jc w:val="center"/>
-              <w:rPr>
-                <w:rFonts w:eastAsia="Arial"/>
-                <w:sz w:val="14"/>
-                <w:szCs w:val="14"/>
-              </w:rPr>
-            </w:pPr>
-            <w:r>
-              <w:rPr>
-                <w:rFonts w:eastAsia="Arial"/>
-                <w:sz w:val="14"/>
-                <w:szCs w:val="14"/>
-              </w:rPr>
-              <w:t>N/A</w:t>
+            <w:shd w:val="clear" w:color="auto" w:fill="auto"/>
+            <w:vAlign w:val="center"/>
+          </w:tcPr>
+          <w:p>
+            <w:pPr>
+              <w:jc w:val="center"/>
+              <w:rPr>
+                <w:rFonts w:eastAsia="Arial"/>
+                <w:sz w:val="14"/>
+                <w:szCs w:val="14"/>
+              </w:rPr>
+            </w:pPr>
+            <w:r>
+              <w:rPr>
+                <w:sz w:val="14"/>
+                <w:szCs w:val="14"/>
+              </w:rPr>
+              <w:t>0.03 ± 0.00</w:t>
             </w:r>
           </w:p>
         </w:tc>
         <w:tc>
           <w:tcPr>
             <w:tcW w:w="190" w:type="pct"/>
-            <w:shd w:val="clear" w:color="auto" w:fill="FFFFFF" w:themeFill="background1"/>
-            <w:vAlign w:val="center"/>
-          </w:tcPr>
-          <w:p>
-            <w:pPr>
-              <w:jc w:val="center"/>
-              <w:rPr>
-                <w:rFonts w:eastAsia="Arial"/>
-                <w:sz w:val="14"/>
-                <w:szCs w:val="14"/>
-              </w:rPr>
-            </w:pPr>
-            <w:r>
-              <w:rPr>
-                <w:rFonts w:eastAsia="Arial"/>
-                <w:sz w:val="14"/>
-                <w:szCs w:val="14"/>
-              </w:rPr>
-              <w:t>N/A</w:t>
+            <w:shd w:val="clear" w:color="auto" w:fill="auto"/>
+            <w:vAlign w:val="center"/>
+          </w:tcPr>
+          <w:p>
+            <w:pPr>
+              <w:jc w:val="center"/>
+              <w:rPr>
+                <w:rFonts w:eastAsia="Arial"/>
+                <w:sz w:val="14"/>
+                <w:szCs w:val="14"/>
+              </w:rPr>
+            </w:pPr>
+            <w:r>
+              <w:rPr>
+                <w:sz w:val="14"/>
+                <w:szCs w:val="14"/>
+              </w:rPr>
+              <w:t>114.55 ± 1.84</w:t>
             </w:r>
           </w:p>
         </w:tc>
         <w:tc>
           <w:tcPr>
             <w:tcW w:w="190" w:type="pct"/>
-            <w:shd w:val="clear" w:color="auto" w:fill="FFFFFF" w:themeFill="background1"/>
-            <w:vAlign w:val="center"/>
-          </w:tcPr>
-          <w:p>
-            <w:pPr>
-              <w:jc w:val="center"/>
-              <w:rPr>
-                <w:rFonts w:eastAsia="Arial"/>
-                <w:sz w:val="14"/>
-                <w:szCs w:val="14"/>
-              </w:rPr>
-            </w:pPr>
-            <w:r>
-              <w:rPr>
-                <w:rFonts w:eastAsia="Arial"/>
-                <w:sz w:val="14"/>
-                <w:szCs w:val="14"/>
-              </w:rPr>
-              <w:t>N/A</w:t>
+            <w:shd w:val="clear" w:color="auto" w:fill="auto"/>
+            <w:vAlign w:val="center"/>
+          </w:tcPr>
+          <w:p>
+            <w:pPr>
+              <w:jc w:val="center"/>
+              <w:rPr>
+                <w:rFonts w:eastAsia="Arial"/>
+                <w:sz w:val="14"/>
+                <w:szCs w:val="14"/>
+              </w:rPr>
+            </w:pPr>
+            <w:r>
+              <w:rPr>
+                <w:sz w:val="14"/>
+                <w:szCs w:val="14"/>
+              </w:rPr>
+              <w:t>1.33 ± 0.02</w:t>
             </w:r>
           </w:p>
         </w:tc>
         <w:tc>
           <w:tcPr>
             <w:tcW w:w="190" w:type="pct"/>
-            <w:shd w:val="clear" w:color="auto" w:fill="FFFFFF" w:themeFill="background1"/>
-            <w:vAlign w:val="center"/>
-          </w:tcPr>
-          <w:p>
-            <w:pPr>
-              <w:jc w:val="center"/>
-              <w:rPr>
-                <w:rFonts w:eastAsia="Arial"/>
-                <w:sz w:val="14"/>
-                <w:szCs w:val="14"/>
-              </w:rPr>
-            </w:pPr>
-            <w:r>
-              <w:rPr>
-                <w:rFonts w:eastAsia="Arial"/>
-                <w:sz w:val="14"/>
-                <w:szCs w:val="14"/>
-              </w:rPr>
-              <w:t>N/A</w:t>
+            <w:shd w:val="clear" w:color="auto" w:fill="auto"/>
+            <w:vAlign w:val="center"/>
+          </w:tcPr>
+          <w:p>
+            <w:pPr>
+              <w:jc w:val="center"/>
+              <w:rPr>
+                <w:rFonts w:eastAsia="Arial"/>
+                <w:sz w:val="14"/>
+                <w:szCs w:val="14"/>
+              </w:rPr>
+            </w:pPr>
+            <w:r>
+              <w:rPr>
+                <w:sz w:val="14"/>
+                <w:szCs w:val="14"/>
+              </w:rPr>
+              <w:t>1.33 ± 0.02</w:t>
             </w:r>
           </w:p>
         </w:tc>
         <w:tc>
           <w:tcPr>
             <w:tcW w:w="191" w:type="pct"/>
-            <w:shd w:val="clear" w:color="auto" w:fill="FFFFFF" w:themeFill="background1"/>
-            <w:vAlign w:val="center"/>
-          </w:tcPr>
-          <w:p>
-            <w:pPr>
-              <w:jc w:val="center"/>
-              <w:rPr>
-                <w:rFonts w:eastAsia="Arial"/>
-                <w:sz w:val="14"/>
-                <w:szCs w:val="14"/>
-              </w:rPr>
-            </w:pPr>
-            <w:r>
-              <w:rPr>
-                <w:rFonts w:eastAsia="Arial"/>
-                <w:sz w:val="14"/>
-                <w:szCs w:val="14"/>
-              </w:rPr>
-              <w:t>N/A</w:t>
+            <w:shd w:val="clear" w:color="auto" w:fill="auto"/>
+            <w:vAlign w:val="center"/>
+          </w:tcPr>
+          <w:p>
+            <w:pPr>
+              <w:jc w:val="center"/>
+              <w:rPr>
+                <w:rFonts w:eastAsia="Arial"/>
+                <w:sz w:val="14"/>
+                <w:szCs w:val="14"/>
+              </w:rPr>
+            </w:pPr>
+            <w:r>
+              <w:rPr>
+                <w:sz w:val="14"/>
+                <w:szCs w:val="14"/>
+              </w:rPr>
+              <w:t>112.91 ± 1.79</w:t>
             </w:r>
           </w:p>
         </w:tc>
@@ -10935,13 +10882,23 @@
                 <w:szCs w:val="16"/>
               </w:rPr>
             </w:pPr>
+            <w:proofErr w:type="spellStart"/>
             <w:r>
               <w:rPr>
                 <w:rFonts w:eastAsia="Arial"/>
                 <w:sz w:val="16"/>
                 <w:szCs w:val="16"/>
               </w:rPr>
-              <w:t>SparseGPT &amp; AWQ</w:t>
+              <w:t>SparseGPT</w:t>
+            </w:r>
+            <w:proofErr w:type="spellEnd"/>
+            <w:r>
+              <w:rPr>
+                <w:rFonts w:eastAsia="Arial"/>
+                <w:sz w:val="16"/>
+                <w:szCs w:val="16"/>
+              </w:rPr>
+              <w:t xml:space="preserve"> &amp; AWQ</w:t>
             </w:r>
           </w:p>
         </w:tc>
@@ -11403,125 +11360,120 @@
         <w:tc>
           <w:tcPr>
             <w:tcW w:w="190" w:type="pct"/>
-            <w:shd w:val="clear" w:color="auto" w:fill="FFFFFF" w:themeFill="background1"/>
-            <w:vAlign w:val="center"/>
-          </w:tcPr>
-          <w:p>
-            <w:pPr>
-              <w:jc w:val="center"/>
-              <w:rPr>
-                <w:rFonts w:eastAsia="Arial"/>
-                <w:sz w:val="14"/>
-                <w:szCs w:val="14"/>
-              </w:rPr>
-            </w:pPr>
-            <w:r>
-              <w:rPr>
-                <w:rFonts w:eastAsia="Arial"/>
-                <w:sz w:val="14"/>
-                <w:szCs w:val="14"/>
-              </w:rPr>
-              <w:t>N/A</w:t>
+            <w:shd w:val="clear" w:color="auto" w:fill="auto"/>
+            <w:vAlign w:val="center"/>
+          </w:tcPr>
+          <w:p>
+            <w:pPr>
+              <w:jc w:val="center"/>
+              <w:rPr>
+                <w:rFonts w:eastAsia="Arial"/>
+                <w:sz w:val="14"/>
+                <w:szCs w:val="14"/>
+              </w:rPr>
+            </w:pPr>
+            <w:r>
+              <w:rPr>
+                <w:sz w:val="14"/>
+                <w:szCs w:val="14"/>
+              </w:rPr>
+              <w:t>0.03 ± 0.00</w:t>
             </w:r>
           </w:p>
         </w:tc>
         <w:tc>
           <w:tcPr>
             <w:tcW w:w="190" w:type="pct"/>
-            <w:shd w:val="clear" w:color="auto" w:fill="FFFFFF" w:themeFill="background1"/>
-            <w:vAlign w:val="center"/>
-          </w:tcPr>
-          <w:p>
-            <w:pPr>
-              <w:jc w:val="center"/>
-              <w:rPr>
-                <w:rFonts w:eastAsia="Arial"/>
-                <w:sz w:val="14"/>
-                <w:szCs w:val="14"/>
-              </w:rPr>
-            </w:pPr>
-            <w:r>
-              <w:rPr>
-                <w:rFonts w:eastAsia="Arial"/>
-                <w:sz w:val="14"/>
-                <w:szCs w:val="14"/>
-              </w:rPr>
-              <w:t>N/A</w:t>
+            <w:shd w:val="clear" w:color="auto" w:fill="auto"/>
+            <w:vAlign w:val="center"/>
+          </w:tcPr>
+          <w:p>
+            <w:pPr>
+              <w:jc w:val="center"/>
+              <w:rPr>
+                <w:rFonts w:eastAsia="Arial"/>
+                <w:sz w:val="14"/>
+                <w:szCs w:val="14"/>
+              </w:rPr>
+            </w:pPr>
+            <w:r>
+              <w:rPr>
+                <w:sz w:val="14"/>
+                <w:szCs w:val="14"/>
+              </w:rPr>
+              <w:t>108.34 ± 1.07</w:t>
             </w:r>
           </w:p>
         </w:tc>
         <w:tc>
           <w:tcPr>
             <w:tcW w:w="190" w:type="pct"/>
-            <w:shd w:val="clear" w:color="auto" w:fill="FFFFFF" w:themeFill="background1"/>
-            <w:vAlign w:val="center"/>
-          </w:tcPr>
-          <w:p>
-            <w:pPr>
-              <w:jc w:val="center"/>
-              <w:rPr>
-                <w:rFonts w:eastAsia="Arial"/>
-                <w:sz w:val="14"/>
-                <w:szCs w:val="14"/>
-              </w:rPr>
-            </w:pPr>
-            <w:r>
-              <w:rPr>
-                <w:rFonts w:eastAsia="Arial"/>
-                <w:sz w:val="14"/>
-                <w:szCs w:val="14"/>
-              </w:rPr>
-              <w:t>N/A</w:t>
+            <w:shd w:val="clear" w:color="auto" w:fill="auto"/>
+            <w:vAlign w:val="center"/>
+          </w:tcPr>
+          <w:p>
+            <w:pPr>
+              <w:jc w:val="center"/>
+              <w:rPr>
+                <w:rFonts w:eastAsia="Arial"/>
+                <w:sz w:val="14"/>
+                <w:szCs w:val="14"/>
+              </w:rPr>
+            </w:pPr>
+            <w:r>
+              <w:rPr>
+                <w:sz w:val="14"/>
+                <w:szCs w:val="14"/>
+              </w:rPr>
+              <w:t>1.40 ± 0.01</w:t>
             </w:r>
           </w:p>
         </w:tc>
         <w:tc>
           <w:tcPr>
             <w:tcW w:w="190" w:type="pct"/>
-            <w:shd w:val="clear" w:color="auto" w:fill="FFFFFF" w:themeFill="background1"/>
-            <w:vAlign w:val="center"/>
-          </w:tcPr>
-          <w:p>
-            <w:pPr>
-              <w:jc w:val="center"/>
-              <w:rPr>
-                <w:rFonts w:eastAsia="Arial"/>
-                <w:sz w:val="14"/>
-                <w:szCs w:val="14"/>
-              </w:rPr>
-            </w:pPr>
-            <w:r>
-              <w:rPr>
-                <w:rFonts w:eastAsia="Arial"/>
-                <w:sz w:val="14"/>
-                <w:szCs w:val="14"/>
-              </w:rPr>
-              <w:t>N/A</w:t>
+            <w:shd w:val="clear" w:color="auto" w:fill="auto"/>
+            <w:vAlign w:val="center"/>
+          </w:tcPr>
+          <w:p>
+            <w:pPr>
+              <w:jc w:val="center"/>
+              <w:rPr>
+                <w:rFonts w:eastAsia="Arial"/>
+                <w:sz w:val="14"/>
+                <w:szCs w:val="14"/>
+              </w:rPr>
+            </w:pPr>
+            <w:r>
+              <w:rPr>
+                <w:sz w:val="14"/>
+                <w:szCs w:val="14"/>
+              </w:rPr>
+              <w:t>1.40 ± 0.01</w:t>
             </w:r>
           </w:p>
         </w:tc>
         <w:tc>
           <w:tcPr>
             <w:tcW w:w="191" w:type="pct"/>
-            <w:shd w:val="clear" w:color="auto" w:fill="FFFFFF" w:themeFill="background1"/>
-            <w:vAlign w:val="center"/>
-          </w:tcPr>
-          <w:p>
-            <w:pPr>
-              <w:jc w:val="center"/>
-              <w:rPr>
-                <w:rFonts w:eastAsia="Arial"/>
-                <w:sz w:val="14"/>
-                <w:szCs w:val="14"/>
-              </w:rPr>
-            </w:pPr>
-            <w:r>
-              <w:rPr>
-                <w:rFonts w:eastAsia="Arial"/>
-                <w:sz w:val="14"/>
-                <w:szCs w:val="14"/>
-              </w:rPr>
-              <w:t>N/A</w:t>
+            <w:shd w:val="clear" w:color="auto" w:fill="auto"/>
+            <w:vAlign w:val="center"/>
+          </w:tcPr>
+          <w:p>
+            <w:pPr>
+              <w:jc w:val="center"/>
+              <w:rPr>
+                <w:rFonts w:eastAsia="Arial"/>
+                <w:sz w:val="14"/>
+                <w:szCs w:val="14"/>
+              </w:rPr>
+            </w:pPr>
+            <w:r>
+              <w:rPr>
+                <w:sz w:val="14"/>
+                <w:szCs w:val="14"/>
+              </w:rPr>
+              <w:t>106.78 ± 0.99</w:t>
             </w:r>
           </w:p>
         </w:tc>
@@ -12014,125 +11966,120 @@
         <w:tc>
           <w:tcPr>
             <w:tcW w:w="190" w:type="pct"/>
-            <w:shd w:val="clear" w:color="auto" w:fill="FFFFFF" w:themeFill="background1"/>
-            <w:vAlign w:val="center"/>
-          </w:tcPr>
-          <w:p>
-            <w:pPr>
-              <w:jc w:val="center"/>
-              <w:rPr>
-                <w:rFonts w:eastAsia="Arial"/>
-                <w:sz w:val="14"/>
-                <w:szCs w:val="14"/>
-              </w:rPr>
-            </w:pPr>
-            <w:r>
-              <w:rPr>
-                <w:rFonts w:eastAsia="Arial"/>
-                <w:sz w:val="14"/>
-                <w:szCs w:val="14"/>
-              </w:rPr>
-              <w:t>N/A</w:t>
+            <w:shd w:val="clear" w:color="auto" w:fill="auto"/>
+            <w:vAlign w:val="center"/>
+          </w:tcPr>
+          <w:p>
+            <w:pPr>
+              <w:jc w:val="center"/>
+              <w:rPr>
+                <w:rFonts w:eastAsia="Arial"/>
+                <w:sz w:val="14"/>
+                <w:szCs w:val="14"/>
+              </w:rPr>
+            </w:pPr>
+            <w:r>
+              <w:rPr>
+                <w:sz w:val="14"/>
+                <w:szCs w:val="14"/>
+              </w:rPr>
+              <w:t>0.03 ± 0.00</w:t>
             </w:r>
           </w:p>
         </w:tc>
         <w:tc>
           <w:tcPr>
             <w:tcW w:w="190" w:type="pct"/>
-            <w:shd w:val="clear" w:color="auto" w:fill="FFFFFF" w:themeFill="background1"/>
-            <w:vAlign w:val="center"/>
-          </w:tcPr>
-          <w:p>
-            <w:pPr>
-              <w:jc w:val="center"/>
-              <w:rPr>
-                <w:rFonts w:eastAsia="Arial"/>
-                <w:sz w:val="14"/>
-                <w:szCs w:val="14"/>
-              </w:rPr>
-            </w:pPr>
-            <w:r>
-              <w:rPr>
-                <w:rFonts w:eastAsia="Arial"/>
-                <w:sz w:val="14"/>
-                <w:szCs w:val="14"/>
-              </w:rPr>
-              <w:t>N/A</w:t>
+            <w:shd w:val="clear" w:color="auto" w:fill="auto"/>
+            <w:vAlign w:val="center"/>
+          </w:tcPr>
+          <w:p>
+            <w:pPr>
+              <w:jc w:val="center"/>
+              <w:rPr>
+                <w:rFonts w:eastAsia="Arial"/>
+                <w:sz w:val="14"/>
+                <w:szCs w:val="14"/>
+              </w:rPr>
+            </w:pPr>
+            <w:r>
+              <w:rPr>
+                <w:sz w:val="14"/>
+                <w:szCs w:val="14"/>
+              </w:rPr>
+              <w:t>116.20 ± 1.40</w:t>
             </w:r>
           </w:p>
         </w:tc>
         <w:tc>
           <w:tcPr>
             <w:tcW w:w="190" w:type="pct"/>
-            <w:shd w:val="clear" w:color="auto" w:fill="FFFFFF" w:themeFill="background1"/>
-            <w:vAlign w:val="center"/>
-          </w:tcPr>
-          <w:p>
-            <w:pPr>
-              <w:jc w:val="center"/>
-              <w:rPr>
-                <w:rFonts w:eastAsia="Arial"/>
-                <w:sz w:val="14"/>
-                <w:szCs w:val="14"/>
-              </w:rPr>
-            </w:pPr>
-            <w:r>
-              <w:rPr>
-                <w:rFonts w:eastAsia="Arial"/>
-                <w:sz w:val="14"/>
-                <w:szCs w:val="14"/>
-              </w:rPr>
-              <w:t>N/A</w:t>
+            <w:shd w:val="clear" w:color="auto" w:fill="auto"/>
+            <w:vAlign w:val="center"/>
+          </w:tcPr>
+          <w:p>
+            <w:pPr>
+              <w:jc w:val="center"/>
+              <w:rPr>
+                <w:rFonts w:eastAsia="Arial"/>
+                <w:sz w:val="14"/>
+                <w:szCs w:val="14"/>
+              </w:rPr>
+            </w:pPr>
+            <w:r>
+              <w:rPr>
+                <w:sz w:val="14"/>
+                <w:szCs w:val="14"/>
+              </w:rPr>
+              <w:t>1.31 ± 0.02</w:t>
             </w:r>
           </w:p>
         </w:tc>
         <w:tc>
           <w:tcPr>
             <w:tcW w:w="190" w:type="pct"/>
-            <w:shd w:val="clear" w:color="auto" w:fill="FFFFFF" w:themeFill="background1"/>
-            <w:vAlign w:val="center"/>
-          </w:tcPr>
-          <w:p>
-            <w:pPr>
-              <w:jc w:val="center"/>
-              <w:rPr>
-                <w:rFonts w:eastAsia="Arial"/>
-                <w:sz w:val="14"/>
-                <w:szCs w:val="14"/>
-              </w:rPr>
-            </w:pPr>
-            <w:r>
-              <w:rPr>
-                <w:rFonts w:eastAsia="Arial"/>
-                <w:sz w:val="14"/>
-                <w:szCs w:val="14"/>
-              </w:rPr>
-              <w:t>N/A</w:t>
+            <w:shd w:val="clear" w:color="auto" w:fill="auto"/>
+            <w:vAlign w:val="center"/>
+          </w:tcPr>
+          <w:p>
+            <w:pPr>
+              <w:jc w:val="center"/>
+              <w:rPr>
+                <w:rFonts w:eastAsia="Arial"/>
+                <w:sz w:val="14"/>
+                <w:szCs w:val="14"/>
+              </w:rPr>
+            </w:pPr>
+            <w:r>
+              <w:rPr>
+                <w:sz w:val="14"/>
+                <w:szCs w:val="14"/>
+              </w:rPr>
+              <w:t>1.31 ± 0.02</w:t>
             </w:r>
           </w:p>
         </w:tc>
         <w:tc>
           <w:tcPr>
             <w:tcW w:w="191" w:type="pct"/>
-            <w:shd w:val="clear" w:color="auto" w:fill="FFFFFF" w:themeFill="background1"/>
-            <w:vAlign w:val="center"/>
-          </w:tcPr>
-          <w:p>
-            <w:pPr>
-              <w:jc w:val="center"/>
-              <w:rPr>
-                <w:rFonts w:eastAsia="Arial"/>
-                <w:sz w:val="14"/>
-                <w:szCs w:val="14"/>
-              </w:rPr>
-            </w:pPr>
-            <w:r>
-              <w:rPr>
-                <w:rFonts w:eastAsia="Arial"/>
-                <w:sz w:val="14"/>
-                <w:szCs w:val="14"/>
-              </w:rPr>
-              <w:t>N/A</w:t>
+            <w:shd w:val="clear" w:color="auto" w:fill="auto"/>
+            <w:vAlign w:val="center"/>
+          </w:tcPr>
+          <w:p>
+            <w:pPr>
+              <w:jc w:val="center"/>
+              <w:rPr>
+                <w:rFonts w:eastAsia="Arial"/>
+                <w:sz w:val="14"/>
+                <w:szCs w:val="14"/>
+              </w:rPr>
+            </w:pPr>
+            <w:r>
+              <w:rPr>
+                <w:sz w:val="14"/>
+                <w:szCs w:val="14"/>
+              </w:rPr>
+              <w:t>114.61 ± 1.35</w:t>
             </w:r>
           </w:p>
         </w:tc>
@@ -12622,125 +12569,120 @@
         <w:tc>
           <w:tcPr>
             <w:tcW w:w="190" w:type="pct"/>
-            <w:shd w:val="clear" w:color="auto" w:fill="FFFFFF" w:themeFill="background1"/>
-            <w:vAlign w:val="center"/>
-          </w:tcPr>
-          <w:p>
-            <w:pPr>
-              <w:jc w:val="center"/>
-              <w:rPr>
-                <w:rFonts w:eastAsia="Arial"/>
-                <w:sz w:val="14"/>
-                <w:szCs w:val="14"/>
-              </w:rPr>
-            </w:pPr>
-            <w:r>
-              <w:rPr>
-                <w:rFonts w:eastAsia="Arial"/>
-                <w:sz w:val="14"/>
-                <w:szCs w:val="14"/>
-              </w:rPr>
-              <w:t>N/A</w:t>
+            <w:shd w:val="clear" w:color="auto" w:fill="auto"/>
+            <w:vAlign w:val="center"/>
+          </w:tcPr>
+          <w:p>
+            <w:pPr>
+              <w:jc w:val="center"/>
+              <w:rPr>
+                <w:rFonts w:eastAsia="Arial"/>
+                <w:sz w:val="14"/>
+                <w:szCs w:val="14"/>
+              </w:rPr>
+            </w:pPr>
+            <w:r>
+              <w:rPr>
+                <w:sz w:val="14"/>
+                <w:szCs w:val="14"/>
+              </w:rPr>
+              <w:t>0.03 ± 0.00</w:t>
             </w:r>
           </w:p>
         </w:tc>
         <w:tc>
           <w:tcPr>
             <w:tcW w:w="190" w:type="pct"/>
-            <w:shd w:val="clear" w:color="auto" w:fill="FFFFFF" w:themeFill="background1"/>
-            <w:vAlign w:val="center"/>
-          </w:tcPr>
-          <w:p>
-            <w:pPr>
-              <w:jc w:val="center"/>
-              <w:rPr>
-                <w:rFonts w:eastAsia="Arial"/>
-                <w:sz w:val="14"/>
-                <w:szCs w:val="14"/>
-              </w:rPr>
-            </w:pPr>
-            <w:r>
-              <w:rPr>
-                <w:rFonts w:eastAsia="Arial"/>
-                <w:sz w:val="14"/>
-                <w:szCs w:val="14"/>
-              </w:rPr>
-              <w:t>N/A</w:t>
+            <w:shd w:val="clear" w:color="auto" w:fill="auto"/>
+            <w:vAlign w:val="center"/>
+          </w:tcPr>
+          <w:p>
+            <w:pPr>
+              <w:jc w:val="center"/>
+              <w:rPr>
+                <w:rFonts w:eastAsia="Arial"/>
+                <w:sz w:val="14"/>
+                <w:szCs w:val="14"/>
+              </w:rPr>
+            </w:pPr>
+            <w:r>
+              <w:rPr>
+                <w:sz w:val="14"/>
+                <w:szCs w:val="14"/>
+              </w:rPr>
+              <w:t>109.61 ± 0.86</w:t>
             </w:r>
           </w:p>
         </w:tc>
         <w:tc>
           <w:tcPr>
             <w:tcW w:w="190" w:type="pct"/>
-            <w:shd w:val="clear" w:color="auto" w:fill="FFFFFF" w:themeFill="background1"/>
-            <w:vAlign w:val="center"/>
-          </w:tcPr>
-          <w:p>
-            <w:pPr>
-              <w:jc w:val="center"/>
-              <w:rPr>
-                <w:rFonts w:eastAsia="Arial"/>
-                <w:sz w:val="14"/>
-                <w:szCs w:val="14"/>
-              </w:rPr>
-            </w:pPr>
-            <w:r>
-              <w:rPr>
-                <w:rFonts w:eastAsia="Arial"/>
-                <w:sz w:val="14"/>
-                <w:szCs w:val="14"/>
-              </w:rPr>
-              <w:t>N/A</w:t>
+            <w:shd w:val="clear" w:color="auto" w:fill="auto"/>
+            <w:vAlign w:val="center"/>
+          </w:tcPr>
+          <w:p>
+            <w:pPr>
+              <w:jc w:val="center"/>
+              <w:rPr>
+                <w:rFonts w:eastAsia="Arial"/>
+                <w:sz w:val="14"/>
+                <w:szCs w:val="14"/>
+              </w:rPr>
+            </w:pPr>
+            <w:r>
+              <w:rPr>
+                <w:sz w:val="14"/>
+                <w:szCs w:val="14"/>
+              </w:rPr>
+              <w:t>1.39 ± 0.01</w:t>
             </w:r>
           </w:p>
         </w:tc>
         <w:tc>
           <w:tcPr>
             <w:tcW w:w="190" w:type="pct"/>
-            <w:shd w:val="clear" w:color="auto" w:fill="FFFFFF" w:themeFill="background1"/>
-            <w:vAlign w:val="center"/>
-          </w:tcPr>
-          <w:p>
-            <w:pPr>
-              <w:jc w:val="center"/>
-              <w:rPr>
-                <w:rFonts w:eastAsia="Arial"/>
-                <w:sz w:val="14"/>
-                <w:szCs w:val="14"/>
-              </w:rPr>
-            </w:pPr>
-            <w:r>
-              <w:rPr>
-                <w:rFonts w:eastAsia="Arial"/>
-                <w:sz w:val="14"/>
-                <w:szCs w:val="14"/>
-              </w:rPr>
-              <w:t>N/A</w:t>
+            <w:shd w:val="clear" w:color="auto" w:fill="auto"/>
+            <w:vAlign w:val="center"/>
+          </w:tcPr>
+          <w:p>
+            <w:pPr>
+              <w:jc w:val="center"/>
+              <w:rPr>
+                <w:rFonts w:eastAsia="Arial"/>
+                <w:sz w:val="14"/>
+                <w:szCs w:val="14"/>
+              </w:rPr>
+            </w:pPr>
+            <w:r>
+              <w:rPr>
+                <w:sz w:val="14"/>
+                <w:szCs w:val="14"/>
+              </w:rPr>
+              <w:t>1.39 ± 0.01</w:t>
             </w:r>
           </w:p>
         </w:tc>
         <w:tc>
           <w:tcPr>
             <w:tcW w:w="191" w:type="pct"/>
-            <w:shd w:val="clear" w:color="auto" w:fill="FFFFFF" w:themeFill="background1"/>
-            <w:vAlign w:val="center"/>
-          </w:tcPr>
-          <w:p>
-            <w:pPr>
-              <w:jc w:val="center"/>
-              <w:rPr>
-                <w:rFonts w:eastAsia="Arial"/>
-                <w:sz w:val="14"/>
-                <w:szCs w:val="14"/>
-              </w:rPr>
-            </w:pPr>
-            <w:r>
-              <w:rPr>
-                <w:rFonts w:eastAsia="Arial"/>
-                <w:sz w:val="14"/>
-                <w:szCs w:val="14"/>
-              </w:rPr>
-              <w:t>N/A</w:t>
+            <w:shd w:val="clear" w:color="auto" w:fill="auto"/>
+            <w:vAlign w:val="center"/>
+          </w:tcPr>
+          <w:p>
+            <w:pPr>
+              <w:jc w:val="center"/>
+              <w:rPr>
+                <w:rFonts w:eastAsia="Arial"/>
+                <w:sz w:val="14"/>
+                <w:szCs w:val="14"/>
+              </w:rPr>
+            </w:pPr>
+            <w:r>
+              <w:rPr>
+                <w:sz w:val="14"/>
+                <w:szCs w:val="14"/>
+              </w:rPr>
+              <w:t>107.91 ± 0.80</w:t>
             </w:r>
           </w:p>
         </w:tc>
@@ -12770,13 +12712,23 @@
                 <w:szCs w:val="16"/>
               </w:rPr>
             </w:pPr>
+            <w:proofErr w:type="spellStart"/>
             <w:r>
               <w:rPr>
                 <w:rFonts w:eastAsia="Arial"/>
                 <w:sz w:val="16"/>
                 <w:szCs w:val="16"/>
               </w:rPr>
-              <w:t>SparseGPT &amp; GPTQ</w:t>
+              <w:t>SparseGPT</w:t>
+            </w:r>
+            <w:proofErr w:type="spellEnd"/>
+            <w:r>
+              <w:rPr>
+                <w:rFonts w:eastAsia="Arial"/>
+                <w:sz w:val="16"/>
+                <w:szCs w:val="16"/>
+              </w:rPr>
+              <w:t xml:space="preserve"> &amp; GPTQ</w:t>
             </w:r>
           </w:p>
         </w:tc>
@@ -13238,125 +13190,120 @@
         <w:tc>
           <w:tcPr>
             <w:tcW w:w="190" w:type="pct"/>
-            <w:shd w:val="clear" w:color="auto" w:fill="FFFFFF" w:themeFill="background1"/>
-            <w:vAlign w:val="center"/>
-          </w:tcPr>
-          <w:p>
-            <w:pPr>
-              <w:jc w:val="center"/>
-              <w:rPr>
-                <w:rFonts w:eastAsia="Arial"/>
-                <w:sz w:val="14"/>
-                <w:szCs w:val="14"/>
-              </w:rPr>
-            </w:pPr>
-            <w:r>
-              <w:rPr>
-                <w:rFonts w:eastAsia="Arial"/>
-                <w:sz w:val="14"/>
-                <w:szCs w:val="14"/>
-              </w:rPr>
-              <w:t>N/A</w:t>
+            <w:shd w:val="clear" w:color="auto" w:fill="auto"/>
+            <w:vAlign w:val="center"/>
+          </w:tcPr>
+          <w:p>
+            <w:pPr>
+              <w:jc w:val="center"/>
+              <w:rPr>
+                <w:rFonts w:eastAsia="Arial"/>
+                <w:sz w:val="14"/>
+                <w:szCs w:val="14"/>
+              </w:rPr>
+            </w:pPr>
+            <w:r>
+              <w:rPr>
+                <w:sz w:val="14"/>
+                <w:szCs w:val="14"/>
+              </w:rPr>
+              <w:t>0.03 ± 0.00</w:t>
             </w:r>
           </w:p>
         </w:tc>
         <w:tc>
           <w:tcPr>
             <w:tcW w:w="190" w:type="pct"/>
-            <w:shd w:val="clear" w:color="auto" w:fill="FFFFFF" w:themeFill="background1"/>
-            <w:vAlign w:val="center"/>
-          </w:tcPr>
-          <w:p>
-            <w:pPr>
-              <w:jc w:val="center"/>
-              <w:rPr>
-                <w:rFonts w:eastAsia="Arial"/>
-                <w:sz w:val="14"/>
-                <w:szCs w:val="14"/>
-              </w:rPr>
-            </w:pPr>
-            <w:r>
-              <w:rPr>
-                <w:rFonts w:eastAsia="Arial"/>
-                <w:sz w:val="14"/>
-                <w:szCs w:val="14"/>
-              </w:rPr>
-              <w:t>N/A</w:t>
+            <w:shd w:val="clear" w:color="auto" w:fill="auto"/>
+            <w:vAlign w:val="center"/>
+          </w:tcPr>
+          <w:p>
+            <w:pPr>
+              <w:jc w:val="center"/>
+              <w:rPr>
+                <w:rFonts w:eastAsia="Arial"/>
+                <w:sz w:val="14"/>
+                <w:szCs w:val="14"/>
+              </w:rPr>
+            </w:pPr>
+            <w:r>
+              <w:rPr>
+                <w:sz w:val="14"/>
+                <w:szCs w:val="14"/>
+              </w:rPr>
+              <w:t>104.58 ± 1.72</w:t>
             </w:r>
           </w:p>
         </w:tc>
         <w:tc>
           <w:tcPr>
             <w:tcW w:w="190" w:type="pct"/>
-            <w:shd w:val="clear" w:color="auto" w:fill="FFFFFF" w:themeFill="background1"/>
-            <w:vAlign w:val="center"/>
-          </w:tcPr>
-          <w:p>
-            <w:pPr>
-              <w:jc w:val="center"/>
-              <w:rPr>
-                <w:rFonts w:eastAsia="Arial"/>
-                <w:sz w:val="14"/>
-                <w:szCs w:val="14"/>
-              </w:rPr>
-            </w:pPr>
-            <w:r>
-              <w:rPr>
-                <w:rFonts w:eastAsia="Arial"/>
-                <w:sz w:val="14"/>
-                <w:szCs w:val="14"/>
-              </w:rPr>
-              <w:t>N/A</w:t>
+            <w:shd w:val="clear" w:color="auto" w:fill="auto"/>
+            <w:vAlign w:val="center"/>
+          </w:tcPr>
+          <w:p>
+            <w:pPr>
+              <w:jc w:val="center"/>
+              <w:rPr>
+                <w:rFonts w:eastAsia="Arial"/>
+                <w:sz w:val="14"/>
+                <w:szCs w:val="14"/>
+              </w:rPr>
+            </w:pPr>
+            <w:r>
+              <w:rPr>
+                <w:sz w:val="14"/>
+                <w:szCs w:val="14"/>
+              </w:rPr>
+              <w:t>1.46 ± 0.02</w:t>
             </w:r>
           </w:p>
         </w:tc>
         <w:tc>
           <w:tcPr>
             <w:tcW w:w="190" w:type="pct"/>
-            <w:shd w:val="clear" w:color="auto" w:fill="FFFFFF" w:themeFill="background1"/>
-            <w:vAlign w:val="center"/>
-          </w:tcPr>
-          <w:p>
-            <w:pPr>
-              <w:jc w:val="center"/>
-              <w:rPr>
-                <w:rFonts w:eastAsia="Arial"/>
-                <w:sz w:val="14"/>
-                <w:szCs w:val="14"/>
-              </w:rPr>
-            </w:pPr>
-            <w:r>
-              <w:rPr>
-                <w:rFonts w:eastAsia="Arial"/>
-                <w:sz w:val="14"/>
-                <w:szCs w:val="14"/>
-              </w:rPr>
-              <w:t>N/A</w:t>
+            <w:shd w:val="clear" w:color="auto" w:fill="auto"/>
+            <w:vAlign w:val="center"/>
+          </w:tcPr>
+          <w:p>
+            <w:pPr>
+              <w:jc w:val="center"/>
+              <w:rPr>
+                <w:rFonts w:eastAsia="Arial"/>
+                <w:sz w:val="14"/>
+                <w:szCs w:val="14"/>
+              </w:rPr>
+            </w:pPr>
+            <w:r>
+              <w:rPr>
+                <w:sz w:val="14"/>
+                <w:szCs w:val="14"/>
+              </w:rPr>
+              <w:t>1.46 ± 0.02</w:t>
             </w:r>
           </w:p>
         </w:tc>
         <w:tc>
           <w:tcPr>
             <w:tcW w:w="191" w:type="pct"/>
-            <w:shd w:val="clear" w:color="auto" w:fill="FFFFFF" w:themeFill="background1"/>
-            <w:vAlign w:val="center"/>
-          </w:tcPr>
-          <w:p>
-            <w:pPr>
-              <w:jc w:val="center"/>
-              <w:rPr>
-                <w:rFonts w:eastAsia="Arial"/>
-                <w:sz w:val="14"/>
-                <w:szCs w:val="14"/>
-              </w:rPr>
-            </w:pPr>
-            <w:r>
-              <w:rPr>
-                <w:rFonts w:eastAsia="Arial"/>
-                <w:sz w:val="14"/>
-                <w:szCs w:val="14"/>
-              </w:rPr>
-              <w:t>N/A</w:t>
+            <w:shd w:val="clear" w:color="auto" w:fill="auto"/>
+            <w:vAlign w:val="center"/>
+          </w:tcPr>
+          <w:p>
+            <w:pPr>
+              <w:jc w:val="center"/>
+              <w:rPr>
+                <w:rFonts w:eastAsia="Arial"/>
+                <w:sz w:val="14"/>
+                <w:szCs w:val="14"/>
+              </w:rPr>
+            </w:pPr>
+            <w:r>
+              <w:rPr>
+                <w:sz w:val="14"/>
+                <w:szCs w:val="14"/>
+              </w:rPr>
+              <w:t>103.11 ± 1.69</w:t>
             </w:r>
           </w:p>
         </w:tc>
@@ -13846,125 +13793,120 @@
         <w:tc>
           <w:tcPr>
             <w:tcW w:w="190" w:type="pct"/>
-            <w:shd w:val="clear" w:color="auto" w:fill="FFFFFF" w:themeFill="background1"/>
-            <w:vAlign w:val="center"/>
-          </w:tcPr>
-          <w:p>
-            <w:pPr>
-              <w:jc w:val="center"/>
-              <w:rPr>
-                <w:rFonts w:eastAsia="Arial"/>
-                <w:sz w:val="14"/>
-                <w:szCs w:val="14"/>
-              </w:rPr>
-            </w:pPr>
-            <w:r>
-              <w:rPr>
-                <w:rFonts w:eastAsia="Arial"/>
-                <w:sz w:val="14"/>
-                <w:szCs w:val="14"/>
-              </w:rPr>
-              <w:t>N/A</w:t>
+            <w:shd w:val="clear" w:color="auto" w:fill="auto"/>
+            <w:vAlign w:val="center"/>
+          </w:tcPr>
+          <w:p>
+            <w:pPr>
+              <w:jc w:val="center"/>
+              <w:rPr>
+                <w:rFonts w:eastAsia="Arial"/>
+                <w:sz w:val="14"/>
+                <w:szCs w:val="14"/>
+              </w:rPr>
+            </w:pPr>
+            <w:r>
+              <w:rPr>
+                <w:sz w:val="14"/>
+                <w:szCs w:val="14"/>
+              </w:rPr>
+              <w:t>0.03 ± 0.00</w:t>
             </w:r>
           </w:p>
         </w:tc>
         <w:tc>
           <w:tcPr>
             <w:tcW w:w="190" w:type="pct"/>
-            <w:shd w:val="clear" w:color="auto" w:fill="FFFFFF" w:themeFill="background1"/>
-            <w:vAlign w:val="center"/>
-          </w:tcPr>
-          <w:p>
-            <w:pPr>
-              <w:jc w:val="center"/>
-              <w:rPr>
-                <w:rFonts w:eastAsia="Arial"/>
-                <w:sz w:val="14"/>
-                <w:szCs w:val="14"/>
-              </w:rPr>
-            </w:pPr>
-            <w:r>
-              <w:rPr>
-                <w:rFonts w:eastAsia="Arial"/>
-                <w:sz w:val="14"/>
-                <w:szCs w:val="14"/>
-              </w:rPr>
-              <w:t>N/A</w:t>
+            <w:shd w:val="clear" w:color="auto" w:fill="auto"/>
+            <w:vAlign w:val="center"/>
+          </w:tcPr>
+          <w:p>
+            <w:pPr>
+              <w:jc w:val="center"/>
+              <w:rPr>
+                <w:rFonts w:eastAsia="Arial"/>
+                <w:sz w:val="14"/>
+                <w:szCs w:val="14"/>
+              </w:rPr>
+            </w:pPr>
+            <w:r>
+              <w:rPr>
+                <w:sz w:val="14"/>
+                <w:szCs w:val="14"/>
+              </w:rPr>
+              <w:t>116.27 ± 1.05</w:t>
             </w:r>
           </w:p>
         </w:tc>
         <w:tc>
           <w:tcPr>
             <w:tcW w:w="190" w:type="pct"/>
-            <w:shd w:val="clear" w:color="auto" w:fill="FFFFFF" w:themeFill="background1"/>
-            <w:vAlign w:val="center"/>
-          </w:tcPr>
-          <w:p>
-            <w:pPr>
-              <w:jc w:val="center"/>
-              <w:rPr>
-                <w:rFonts w:eastAsia="Arial"/>
-                <w:sz w:val="14"/>
-                <w:szCs w:val="14"/>
-              </w:rPr>
-            </w:pPr>
-            <w:r>
-              <w:rPr>
-                <w:rFonts w:eastAsia="Arial"/>
-                <w:sz w:val="14"/>
-                <w:szCs w:val="14"/>
-              </w:rPr>
-              <w:t>N/A</w:t>
+            <w:shd w:val="clear" w:color="auto" w:fill="auto"/>
+            <w:vAlign w:val="center"/>
+          </w:tcPr>
+          <w:p>
+            <w:pPr>
+              <w:jc w:val="center"/>
+              <w:rPr>
+                <w:rFonts w:eastAsia="Arial"/>
+                <w:sz w:val="14"/>
+                <w:szCs w:val="14"/>
+              </w:rPr>
+            </w:pPr>
+            <w:r>
+              <w:rPr>
+                <w:sz w:val="14"/>
+                <w:szCs w:val="14"/>
+              </w:rPr>
+              <w:t>1.31 ± 0.01</w:t>
             </w:r>
           </w:p>
         </w:tc>
         <w:tc>
           <w:tcPr>
             <w:tcW w:w="190" w:type="pct"/>
-            <w:shd w:val="clear" w:color="auto" w:fill="FFFFFF" w:themeFill="background1"/>
-            <w:vAlign w:val="center"/>
-          </w:tcPr>
-          <w:p>
-            <w:pPr>
-              <w:jc w:val="center"/>
-              <w:rPr>
-                <w:rFonts w:eastAsia="Arial"/>
-                <w:sz w:val="14"/>
-                <w:szCs w:val="14"/>
-              </w:rPr>
-            </w:pPr>
-            <w:r>
-              <w:rPr>
-                <w:rFonts w:eastAsia="Arial"/>
-                <w:sz w:val="14"/>
-                <w:szCs w:val="14"/>
-              </w:rPr>
-              <w:t>N/A</w:t>
+            <w:shd w:val="clear" w:color="auto" w:fill="auto"/>
+            <w:vAlign w:val="center"/>
+          </w:tcPr>
+          <w:p>
+            <w:pPr>
+              <w:jc w:val="center"/>
+              <w:rPr>
+                <w:rFonts w:eastAsia="Arial"/>
+                <w:sz w:val="14"/>
+                <w:szCs w:val="14"/>
+              </w:rPr>
+            </w:pPr>
+            <w:r>
+              <w:rPr>
+                <w:sz w:val="14"/>
+                <w:szCs w:val="14"/>
+              </w:rPr>
+              <w:t>1.31 ± 0.01</w:t>
             </w:r>
           </w:p>
         </w:tc>
         <w:tc>
           <w:tcPr>
             <w:tcW w:w="191" w:type="pct"/>
-            <w:shd w:val="clear" w:color="auto" w:fill="FFFFFF" w:themeFill="background1"/>
-            <w:vAlign w:val="center"/>
-          </w:tcPr>
-          <w:p>
-            <w:pPr>
-              <w:jc w:val="center"/>
-              <w:rPr>
-                <w:rFonts w:eastAsia="Arial"/>
-                <w:sz w:val="14"/>
-                <w:szCs w:val="14"/>
-              </w:rPr>
-            </w:pPr>
-            <w:r>
-              <w:rPr>
-                <w:rFonts w:eastAsia="Arial"/>
-                <w:sz w:val="14"/>
-                <w:szCs w:val="14"/>
-              </w:rPr>
-              <w:t>N/A</w:t>
+            <w:shd w:val="clear" w:color="auto" w:fill="auto"/>
+            <w:vAlign w:val="center"/>
+          </w:tcPr>
+          <w:p>
+            <w:pPr>
+              <w:jc w:val="center"/>
+              <w:rPr>
+                <w:rFonts w:eastAsia="Arial"/>
+                <w:sz w:val="14"/>
+                <w:szCs w:val="14"/>
+              </w:rPr>
+            </w:pPr>
+            <w:r>
+              <w:rPr>
+                <w:sz w:val="14"/>
+                <w:szCs w:val="14"/>
+              </w:rPr>
+              <w:t>114.58 ± 0.99</w:t>
             </w:r>
           </w:p>
         </w:tc>
@@ -14454,125 +14396,120 @@
         <w:tc>
           <w:tcPr>
             <w:tcW w:w="190" w:type="pct"/>
-            <w:shd w:val="clear" w:color="auto" w:fill="FFFFFF" w:themeFill="background1"/>
-            <w:vAlign w:val="center"/>
-          </w:tcPr>
-          <w:p>
-            <w:pPr>
-              <w:jc w:val="center"/>
-              <w:rPr>
-                <w:rFonts w:eastAsia="Arial"/>
-                <w:sz w:val="14"/>
-                <w:szCs w:val="14"/>
-              </w:rPr>
-            </w:pPr>
-            <w:r>
-              <w:rPr>
-                <w:rFonts w:eastAsia="Arial"/>
-                <w:sz w:val="14"/>
-                <w:szCs w:val="14"/>
-              </w:rPr>
-              <w:t>N/A</w:t>
+            <w:shd w:val="clear" w:color="auto" w:fill="auto"/>
+            <w:vAlign w:val="center"/>
+          </w:tcPr>
+          <w:p>
+            <w:pPr>
+              <w:jc w:val="center"/>
+              <w:rPr>
+                <w:rFonts w:eastAsia="Arial"/>
+                <w:sz w:val="14"/>
+                <w:szCs w:val="14"/>
+              </w:rPr>
+            </w:pPr>
+            <w:r>
+              <w:rPr>
+                <w:sz w:val="14"/>
+                <w:szCs w:val="14"/>
+              </w:rPr>
+              <w:t>0.03 ± 0.00</w:t>
             </w:r>
           </w:p>
         </w:tc>
         <w:tc>
           <w:tcPr>
             <w:tcW w:w="190" w:type="pct"/>
-            <w:shd w:val="clear" w:color="auto" w:fill="FFFFFF" w:themeFill="background1"/>
-            <w:vAlign w:val="center"/>
-          </w:tcPr>
-          <w:p>
-            <w:pPr>
-              <w:jc w:val="center"/>
-              <w:rPr>
-                <w:rFonts w:eastAsia="Arial"/>
-                <w:sz w:val="14"/>
-                <w:szCs w:val="14"/>
-              </w:rPr>
-            </w:pPr>
-            <w:r>
-              <w:rPr>
-                <w:rFonts w:eastAsia="Arial"/>
-                <w:sz w:val="14"/>
-                <w:szCs w:val="14"/>
-              </w:rPr>
-              <w:t>N/A</w:t>
+            <w:shd w:val="clear" w:color="auto" w:fill="auto"/>
+            <w:vAlign w:val="center"/>
+          </w:tcPr>
+          <w:p>
+            <w:pPr>
+              <w:jc w:val="center"/>
+              <w:rPr>
+                <w:rFonts w:eastAsia="Arial"/>
+                <w:sz w:val="14"/>
+                <w:szCs w:val="14"/>
+              </w:rPr>
+            </w:pPr>
+            <w:r>
+              <w:rPr>
+                <w:sz w:val="14"/>
+                <w:szCs w:val="14"/>
+              </w:rPr>
+              <w:t>117.12 ± 1.52</w:t>
             </w:r>
           </w:p>
         </w:tc>
         <w:tc>
           <w:tcPr>
             <w:tcW w:w="190" w:type="pct"/>
-            <w:shd w:val="clear" w:color="auto" w:fill="FFFFFF" w:themeFill="background1"/>
-            <w:vAlign w:val="center"/>
-          </w:tcPr>
-          <w:p>
-            <w:pPr>
-              <w:jc w:val="center"/>
-              <w:rPr>
-                <w:rFonts w:eastAsia="Arial"/>
-                <w:sz w:val="14"/>
-                <w:szCs w:val="14"/>
-              </w:rPr>
-            </w:pPr>
-            <w:r>
-              <w:rPr>
-                <w:rFonts w:eastAsia="Arial"/>
-                <w:sz w:val="14"/>
-                <w:szCs w:val="14"/>
-              </w:rPr>
-              <w:t>N/A</w:t>
+            <w:shd w:val="clear" w:color="auto" w:fill="auto"/>
+            <w:vAlign w:val="center"/>
+          </w:tcPr>
+          <w:p>
+            <w:pPr>
+              <w:jc w:val="center"/>
+              <w:rPr>
+                <w:rFonts w:eastAsia="Arial"/>
+                <w:sz w:val="14"/>
+                <w:szCs w:val="14"/>
+              </w:rPr>
+            </w:pPr>
+            <w:r>
+              <w:rPr>
+                <w:sz w:val="14"/>
+                <w:szCs w:val="14"/>
+              </w:rPr>
+              <w:t>1.30 ± 0.02</w:t>
             </w:r>
           </w:p>
         </w:tc>
         <w:tc>
           <w:tcPr>
             <w:tcW w:w="190" w:type="pct"/>
-            <w:shd w:val="clear" w:color="auto" w:fill="FFFFFF" w:themeFill="background1"/>
-            <w:vAlign w:val="center"/>
-          </w:tcPr>
-          <w:p>
-            <w:pPr>
-              <w:jc w:val="center"/>
-              <w:rPr>
-                <w:rFonts w:eastAsia="Arial"/>
-                <w:sz w:val="14"/>
-                <w:szCs w:val="14"/>
-              </w:rPr>
-            </w:pPr>
-            <w:r>
-              <w:rPr>
-                <w:rFonts w:eastAsia="Arial"/>
-                <w:sz w:val="14"/>
-                <w:szCs w:val="14"/>
-              </w:rPr>
-              <w:t>N/A</w:t>
+            <w:shd w:val="clear" w:color="auto" w:fill="auto"/>
+            <w:vAlign w:val="center"/>
+          </w:tcPr>
+          <w:p>
+            <w:pPr>
+              <w:jc w:val="center"/>
+              <w:rPr>
+                <w:rFonts w:eastAsia="Arial"/>
+                <w:sz w:val="14"/>
+                <w:szCs w:val="14"/>
+              </w:rPr>
+            </w:pPr>
+            <w:r>
+              <w:rPr>
+                <w:sz w:val="14"/>
+                <w:szCs w:val="14"/>
+              </w:rPr>
+              <w:t>1.30 ± 0.02</w:t>
             </w:r>
           </w:p>
         </w:tc>
         <w:tc>
           <w:tcPr>
             <w:tcW w:w="191" w:type="pct"/>
-            <w:shd w:val="clear" w:color="auto" w:fill="FFFFFF" w:themeFill="background1"/>
-            <w:vAlign w:val="center"/>
-          </w:tcPr>
-          <w:p>
-            <w:pPr>
-              <w:jc w:val="center"/>
-              <w:rPr>
-                <w:rFonts w:eastAsia="Arial"/>
-                <w:sz w:val="14"/>
-                <w:szCs w:val="14"/>
-              </w:rPr>
-            </w:pPr>
-            <w:r>
-              <w:rPr>
-                <w:rFonts w:eastAsia="Arial"/>
-                <w:sz w:val="14"/>
-                <w:szCs w:val="14"/>
-              </w:rPr>
-              <w:t>N/A</w:t>
+            <w:shd w:val="clear" w:color="auto" w:fill="auto"/>
+            <w:vAlign w:val="center"/>
+          </w:tcPr>
+          <w:p>
+            <w:pPr>
+              <w:jc w:val="center"/>
+              <w:rPr>
+                <w:rFonts w:eastAsia="Arial"/>
+                <w:sz w:val="14"/>
+                <w:szCs w:val="14"/>
+              </w:rPr>
+            </w:pPr>
+            <w:r>
+              <w:rPr>
+                <w:sz w:val="14"/>
+                <w:szCs w:val="14"/>
+              </w:rPr>
+              <w:t>115.51 ± 1.48</w:t>
             </w:r>
           </w:p>
         </w:tc>

</xml_diff>